<commit_message>
Start Writing The Related Word
Add initial draft of Related Work section
</commit_message>
<xml_diff>
--- a/GeoBikeLLM Paper.docx
+++ b/GeoBikeLLM Paper.docx
@@ -428,8 +428,140 @@
         <w:pStyle w:val="Heading2"/>
       </w:pPr>
       <w:r>
-        <w:t>Section 1</w:t>
-      </w:r>
+        <w:t>LLM-Augmented Geospatial Understanding and Querying</w:t>
+      </w:r>
+    </w:p>
+    <w:p>
+      <w:pPr>
+        <w:pStyle w:val="BodyText"/>
+        <w:rPr>
+          <w:lang w:val="en-AE"/>
+        </w:rPr>
+      </w:pPr>
+      <w:r>
+        <w:rPr>
+          <w:lang w:val="en-AE"/>
+        </w:rPr>
+        <w:t xml:space="preserve">Recent research has focused on enhancing geospatial data accessibility through natural language interfaces powered by large language models (LLMs). Systems like </w:t>
+      </w:r>
+      <w:proofErr w:type="spellStart"/>
+      <w:r>
+        <w:rPr>
+          <w:lang w:val="en-AE"/>
+        </w:rPr>
+        <w:t>ChatGeoAI</w:t>
+      </w:r>
+      <w:proofErr w:type="spellEnd"/>
+      <w:r>
+        <w:rPr>
+          <w:lang w:val="en-AE"/>
+        </w:rPr>
+        <w:t xml:space="preserve"> by Mansourian and </w:t>
+      </w:r>
+      <w:proofErr w:type="spellStart"/>
+      <w:r>
+        <w:rPr>
+          <w:lang w:val="en-AE"/>
+        </w:rPr>
+        <w:t>Oucheikh</w:t>
+      </w:r>
+      <w:proofErr w:type="spellEnd"/>
+      <w:r>
+        <w:rPr>
+          <w:lang w:val="en-AE"/>
+        </w:rPr>
+        <w:t xml:space="preserve"> [1] and the SQL-generation framework by Jiang and Yang [2] enable users to perform GIS tasks or query spatial databases using natural language. </w:t>
+      </w:r>
+      <w:proofErr w:type="spellStart"/>
+      <w:r>
+        <w:rPr>
+          <w:lang w:val="en-AE"/>
+        </w:rPr>
+        <w:t>ChatGeoAI</w:t>
+      </w:r>
+      <w:proofErr w:type="spellEnd"/>
+      <w:r>
+        <w:rPr>
+          <w:lang w:val="en-AE"/>
+        </w:rPr>
+        <w:t xml:space="preserve"> employs LLaMA-2 to convert queries into executable </w:t>
+      </w:r>
+      <w:proofErr w:type="spellStart"/>
+      <w:r>
+        <w:rPr>
+          <w:lang w:val="en-AE"/>
+        </w:rPr>
+        <w:t>PyQGIS</w:t>
+      </w:r>
+      <w:proofErr w:type="spellEnd"/>
+      <w:r>
+        <w:rPr>
+          <w:lang w:val="en-AE"/>
+        </w:rPr>
+        <w:t xml:space="preserve"> scripts, while Jiang and Yang use ChatGPT to generate </w:t>
+      </w:r>
+      <w:proofErr w:type="spellStart"/>
+      <w:r>
+        <w:rPr>
+          <w:lang w:val="en-AE"/>
+        </w:rPr>
+        <w:t>PostGIS</w:t>
+      </w:r>
+      <w:proofErr w:type="spellEnd"/>
+      <w:r>
+        <w:rPr>
+          <w:lang w:val="en-AE"/>
+        </w:rPr>
+        <w:t>-compatible SQL. Text-to-</w:t>
+      </w:r>
+      <w:proofErr w:type="spellStart"/>
+      <w:r>
+        <w:rPr>
+          <w:lang w:val="en-AE"/>
+        </w:rPr>
+        <w:t>OverpassQL</w:t>
+      </w:r>
+      <w:proofErr w:type="spellEnd"/>
+      <w:r>
+        <w:rPr>
+          <w:lang w:val="en-AE"/>
+        </w:rPr>
+        <w:t xml:space="preserve"> by </w:t>
+      </w:r>
+      <w:proofErr w:type="spellStart"/>
+      <w:r>
+        <w:rPr>
+          <w:lang w:val="en-AE"/>
+        </w:rPr>
+        <w:t>Staniek</w:t>
+      </w:r>
+      <w:proofErr w:type="spellEnd"/>
+      <w:r>
+        <w:rPr>
+          <w:lang w:val="en-AE"/>
+        </w:rPr>
+        <w:t xml:space="preserve"> et al. [3] further advances this by translating natural language into </w:t>
+      </w:r>
+      <w:proofErr w:type="spellStart"/>
+      <w:r>
+        <w:rPr>
+          <w:lang w:val="en-AE"/>
+        </w:rPr>
+        <w:t>OverpassQL</w:t>
+      </w:r>
+      <w:proofErr w:type="spellEnd"/>
+      <w:r>
+        <w:rPr>
+          <w:lang w:val="en-AE"/>
+        </w:rPr>
+        <w:t xml:space="preserve"> queries for OpenStreetMap, democratizing access to structured geodata.</w:t>
+      </w:r>
+    </w:p>
+    <w:p/>
+    <w:p>
+      <w:pPr>
+        <w:pStyle w:val="Heading2"/>
+      </w:pPr>
     </w:p>
     <w:p>
       <w:pPr>
@@ -611,20 +743,87 @@
           <w:lang w:val="en-AE"/>
         </w:rPr>
       </w:pPr>
+      <w:r>
+        <w:rPr>
+          <w:lang w:val="en-AE"/>
+        </w:rPr>
+        <w:t xml:space="preserve">Mansourian, A. &amp; Oucheikh, A. (2024). </w:t>
+      </w:r>
+      <w:r>
+        <w:rPr>
+          <w:i/>
+          <w:iCs/>
+          <w:lang w:val="en-AE"/>
+        </w:rPr>
+        <w:t>ChatGeoAI: Enabling Geospatial Analysis for Public through Natural Language, with Large Language Models</w:t>
+      </w:r>
+      <w:r>
+        <w:rPr>
+          <w:lang w:val="en-AE"/>
+        </w:rPr>
+        <w:t>. ISPRS International Journal of Geo-Information.</w:t>
+      </w:r>
     </w:p>
     <w:p>
       <w:pPr>
         <w:pStyle w:val="references"/>
         <w:ind w:start="17.70pt" w:hanging="17.70pt"/>
-        <w:rPr>
-          <w:lang w:val="en-AE"/>
-        </w:rPr>
-      </w:pPr>
+      </w:pPr>
+      <w:r>
+        <w:rPr>
+          <w:lang w:val="en-AE"/>
+        </w:rPr>
+        <w:t xml:space="preserve">Jiang, Y. &amp; Yang, C. (2024). </w:t>
+      </w:r>
+      <w:r>
+        <w:rPr>
+          <w:i/>
+          <w:iCs/>
+          <w:lang w:val="en-AE"/>
+        </w:rPr>
+        <w:t>Is ChatGPT a Good Geospatial Data Analyst? Exploring the Integration of Natural Language into Structured Query Language within a Spatial Database</w:t>
+      </w:r>
+      <w:r>
+        <w:rPr>
+          <w:lang w:val="en-AE"/>
+        </w:rPr>
+        <w:t>. ISPRS International Journal of Geo-Information.</w:t>
+      </w:r>
     </w:p>
     <w:p>
       <w:pPr>
         <w:pStyle w:val="references"/>
         <w:ind w:start="17.70pt" w:hanging="17.70pt"/>
+      </w:pPr>
+      <w:r>
+        <w:rPr>
+          <w:lang w:val="en-AE"/>
+        </w:rPr>
+        <w:t xml:space="preserve">Staniek, M., et al. (2024). </w:t>
+      </w:r>
+      <w:r>
+        <w:rPr>
+          <w:i/>
+          <w:iCs/>
+          <w:lang w:val="en-AE"/>
+        </w:rPr>
+        <w:t>Text-to-OverpassQL: A Natural Language Interface for Complex Geodata Querying of OpenStreetMap</w:t>
+      </w:r>
+      <w:r>
+        <w:rPr>
+          <w:lang w:val="en-AE"/>
+        </w:rPr>
+        <w:t>. Transactions of the Association for Computational Linguistics.</w:t>
+      </w:r>
+    </w:p>
+    <w:p>
+      <w:pPr>
+        <w:pStyle w:val="references"/>
+        <w:numPr>
+          <w:ilvl w:val="0"/>
+          <w:numId w:val="0"/>
+        </w:numPr>
+        <w:ind w:start="17.70pt"/>
         <w:rPr>
           <w:lang w:val="en-AE"/>
         </w:rPr>
@@ -2547,6 +2746,7 @@
     <w:name w:val="heading 2"/>
     <w:basedOn w:val="Normal"/>
     <w:next w:val="Normal"/>
+    <w:link w:val="Heading2Char"/>
     <w:qFormat/>
     <w:rsid w:val="00ED0149"/>
     <w:pPr>
@@ -2638,6 +2838,7 @@
   <w:style w:type="character" w:default="1" w:styleId="DefaultParagraphFont">
     <w:name w:val="Default Paragraph Font"/>
     <w:uiPriority w:val="1"/>
+    <w:semiHidden/>
     <w:unhideWhenUsed/>
   </w:style>
   <w:style w:type="table" w:default="1" w:styleId="TableNormal">
@@ -2976,6 +3177,17 @@
       <w:szCs w:val="18"/>
     </w:rPr>
   </w:style>
+  <w:style w:type="character" w:customStyle="1" w:styleId="Heading2Char">
+    <w:name w:val="Heading 2 Char"/>
+    <w:basedOn w:val="DefaultParagraphFont"/>
+    <w:link w:val="Heading2"/>
+    <w:rsid w:val="00B71838"/>
+    <w:rPr>
+      <w:i/>
+      <w:iCs/>
+      <w:noProof/>
+    </w:rPr>
+  </w:style>
 </w:styles>
 </file>
 

</xml_diff>

<commit_message>
Add and expand the Related Work section draft
</commit_message>
<xml_diff>
--- a/GeoBikeLLM Paper.docx
+++ b/GeoBikeLLM Paper.docx
@@ -442,126 +442,62 @@
         <w:rPr>
           <w:lang w:val="en-AE"/>
         </w:rPr>
-        <w:t xml:space="preserve">Recent research has focused on enhancing geospatial data accessibility through natural language interfaces powered by large language models (LLMs). Systems like </w:t>
-      </w:r>
-      <w:proofErr w:type="spellStart"/>
-      <w:r>
-        <w:rPr>
-          <w:lang w:val="en-AE"/>
-        </w:rPr>
-        <w:t>ChatGeoAI</w:t>
-      </w:r>
-      <w:proofErr w:type="spellEnd"/>
-      <w:r>
-        <w:rPr>
-          <w:lang w:val="en-AE"/>
-        </w:rPr>
-        <w:t xml:space="preserve"> by Mansourian and </w:t>
-      </w:r>
-      <w:proofErr w:type="spellStart"/>
-      <w:r>
-        <w:rPr>
-          <w:lang w:val="en-AE"/>
-        </w:rPr>
-        <w:t>Oucheikh</w:t>
-      </w:r>
-      <w:proofErr w:type="spellEnd"/>
-      <w:r>
-        <w:rPr>
-          <w:lang w:val="en-AE"/>
-        </w:rPr>
-        <w:t xml:space="preserve"> [1] and the SQL-generation framework by Jiang and Yang [2] enable users to perform GIS tasks or query spatial databases using natural language. </w:t>
-      </w:r>
-      <w:proofErr w:type="spellStart"/>
-      <w:r>
-        <w:rPr>
-          <w:lang w:val="en-AE"/>
-        </w:rPr>
-        <w:t>ChatGeoAI</w:t>
-      </w:r>
-      <w:proofErr w:type="spellEnd"/>
-      <w:r>
-        <w:rPr>
-          <w:lang w:val="en-AE"/>
-        </w:rPr>
-        <w:t xml:space="preserve"> employs LLaMA-2 to convert queries into executable </w:t>
-      </w:r>
-      <w:proofErr w:type="spellStart"/>
-      <w:r>
-        <w:rPr>
-          <w:lang w:val="en-AE"/>
-        </w:rPr>
-        <w:t>PyQGIS</w:t>
-      </w:r>
-      <w:proofErr w:type="spellEnd"/>
-      <w:r>
-        <w:rPr>
-          <w:lang w:val="en-AE"/>
-        </w:rPr>
-        <w:t xml:space="preserve"> scripts, while Jiang and Yang use ChatGPT to generate </w:t>
-      </w:r>
-      <w:proofErr w:type="spellStart"/>
-      <w:r>
-        <w:rPr>
-          <w:lang w:val="en-AE"/>
-        </w:rPr>
-        <w:t>PostGIS</w:t>
-      </w:r>
-      <w:proofErr w:type="spellEnd"/>
-      <w:r>
-        <w:rPr>
-          <w:lang w:val="en-AE"/>
-        </w:rPr>
-        <w:t>-compatible SQL. Text-to-</w:t>
-      </w:r>
-      <w:proofErr w:type="spellStart"/>
-      <w:r>
-        <w:rPr>
-          <w:lang w:val="en-AE"/>
-        </w:rPr>
-        <w:t>OverpassQL</w:t>
-      </w:r>
-      <w:proofErr w:type="spellEnd"/>
-      <w:r>
-        <w:rPr>
-          <w:lang w:val="en-AE"/>
-        </w:rPr>
-        <w:t xml:space="preserve"> by </w:t>
-      </w:r>
-      <w:proofErr w:type="spellStart"/>
-      <w:r>
-        <w:rPr>
-          <w:lang w:val="en-AE"/>
-        </w:rPr>
-        <w:t>Staniek</w:t>
-      </w:r>
-      <w:proofErr w:type="spellEnd"/>
-      <w:r>
-        <w:rPr>
-          <w:lang w:val="en-AE"/>
-        </w:rPr>
-        <w:t xml:space="preserve"> et al. [3] further advances this by translating natural language into </w:t>
-      </w:r>
-      <w:proofErr w:type="spellStart"/>
-      <w:r>
-        <w:rPr>
-          <w:lang w:val="en-AE"/>
-        </w:rPr>
-        <w:t>OverpassQL</w:t>
-      </w:r>
-      <w:proofErr w:type="spellEnd"/>
-      <w:r>
-        <w:rPr>
-          <w:lang w:val="en-AE"/>
-        </w:rPr>
-        <w:t xml:space="preserve"> queries for OpenStreetMap, democratizing access to structured geodata.</w:t>
-      </w:r>
-    </w:p>
-    <w:p/>
+        <w:t>Recent research has focused on enhancing geospatial data accessibility through natural language interfaces powered by large language models (LLMs). Systems like ChatGeoAI by Mansourian and Oucheikh [1] and the SQL-generation framework by Jiang and Yang [2] enable users to perform GIS tasks or query spatial databases using natural language. ChatGeoAI employs LLaMA-2 to convert queries into executable PyQGIS scripts, while Jiang and Yang use ChatGPT to generate PostGIS-compatible SQL. Text-to-OverpassQL by Staniek et al. [3] further advances this by translating natural language into OverpassQL queries for OpenStreetMap, democratizing access to structured geodata.</w:t>
+      </w:r>
+    </w:p>
+    <w:p>
+      <w:pPr>
+        <w:pStyle w:val="BodyText"/>
+        <w:ind w:firstLine="0pt"/>
+        <w:rPr>
+          <w:lang w:val="en-AE"/>
+        </w:rPr>
+      </w:pPr>
+      <w:r>
+        <w:rPr>
+          <w:lang w:val="en-AE"/>
+        </w:rPr>
+        <w:tab/>
+      </w:r>
+      <w:r>
+        <w:rPr>
+          <w:lang w:val="en-AE"/>
+        </w:rPr>
+        <w:t>Other studies investigate how LLMs can interpret or extract geographic knowledge. GeoQAMap by Feng et al. [4] utilizes GPT-3.5 and Wikidata to answer geographic questions and visualize answers on maps. GeoAgent by Huang et al. [5] focuses on address standardization using ChatGLM-6B, showing how LLMs can resolve ambiguous and incomplete geospatial texts. Meanwhile, Bhandari et al. [6] evaluate whether large language models are geospatially knowledgeable, revealing that while some geospatial knowledge exists in pretrained models, it is often imprecise.</w:t>
+      </w:r>
+    </w:p>
+    <w:p>
+      <w:pPr>
+        <w:pStyle w:val="BodyText"/>
+        <w:rPr>
+          <w:lang w:val="en-AE"/>
+        </w:rPr>
+      </w:pPr>
+      <w:r>
+        <w:rPr>
+          <w:lang w:val="en-AE"/>
+        </w:rPr>
+        <w:t>To overcome these limitations, domain-adapted models have emerged. BB-GeoGPT by Zhang et al. [7] is a fine-tuned LLaMA-2 model trained on GIS texts and Q&amp;A pairs, outperforming general LLMs in spatial queries. Similarly, GeoLLM by Shah et al. [8] boosts geospatial prediction accuracy by embedding map-based contextual data into prompts. These efforts establish the foundation for natural language interaction with spatial systems but stop short of performing complex geospatial planning or optimization.</w:t>
+      </w:r>
+    </w:p>
+    <w:p>
+      <w:pPr>
+        <w:jc w:val="both"/>
+      </w:pPr>
+    </w:p>
     <w:p>
       <w:pPr>
         <w:pStyle w:val="Heading2"/>
-      </w:pPr>
+        <w:rPr>
+          <w:lang w:val="en-AE"/>
+        </w:rPr>
+      </w:pPr>
+      <w:r>
+        <w:rPr>
+          <w:lang w:val="en-AE"/>
+        </w:rPr>
+        <w:t>Multimodal Geospatial Intelligence for Environmental and Spatial Planning</w:t>
+      </w:r>
     </w:p>
     <w:p>
       <w:pPr>
@@ -814,6 +750,136 @@
           <w:lang w:val="en-AE"/>
         </w:rPr>
         <w:t>. Transactions of the Association for Computational Linguistics.</w:t>
+      </w:r>
+    </w:p>
+    <w:p>
+      <w:pPr>
+        <w:pStyle w:val="references"/>
+        <w:ind w:start="17.70pt" w:hanging="17.70pt"/>
+      </w:pPr>
+      <w:r>
+        <w:rPr>
+          <w:lang w:val="en-AE"/>
+        </w:rPr>
+        <w:t xml:space="preserve">Feng, Z., et al. (2023). </w:t>
+      </w:r>
+      <w:r>
+        <w:rPr>
+          <w:i/>
+          <w:iCs/>
+          <w:lang w:val="en-AE"/>
+        </w:rPr>
+        <w:t>GeoQAMap: Geographic Question Answering with Maps Leveraging LLM and Open Knowledge Base</w:t>
+      </w:r>
+      <w:r>
+        <w:rPr>
+          <w:lang w:val="en-AE"/>
+        </w:rPr>
+        <w:t>. GIScience 2023, Leibniz International Proceedings in Informatics.</w:t>
+      </w:r>
+    </w:p>
+    <w:p>
+      <w:pPr>
+        <w:pStyle w:val="references"/>
+        <w:ind w:start="17.70pt" w:hanging="17.70pt"/>
+      </w:pPr>
+      <w:r>
+        <w:rPr>
+          <w:lang w:val="en-AE"/>
+        </w:rPr>
+        <w:t xml:space="preserve">Huang, W., et al. (2024). </w:t>
+      </w:r>
+      <w:r>
+        <w:rPr>
+          <w:i/>
+          <w:iCs/>
+          <w:lang w:val="en-AE"/>
+        </w:rPr>
+        <w:t>GeoAgent: To Empower LLMs using Geospatial Tools for Address Standardization</w:t>
+      </w:r>
+      <w:r>
+        <w:rPr>
+          <w:lang w:val="en-AE"/>
+        </w:rPr>
+        <w:t>. Findings of ACL 2024.</w:t>
+      </w:r>
+    </w:p>
+    <w:p>
+      <w:pPr>
+        <w:pStyle w:val="references"/>
+        <w:ind w:start="17.70pt" w:hanging="17.70pt"/>
+      </w:pPr>
+      <w:r>
+        <w:rPr>
+          <w:lang w:val="en-AE"/>
+        </w:rPr>
+        <w:t xml:space="preserve">Bhandari, S., et al. (2023). </w:t>
+      </w:r>
+      <w:r>
+        <w:rPr>
+          <w:i/>
+          <w:iCs/>
+          <w:lang w:val="en-AE"/>
+        </w:rPr>
+        <w:t>Are Large Language Models Geospatially Knowledgeable?</w:t>
+      </w:r>
+      <w:r>
+        <w:rPr>
+          <w:lang w:val="en-AE"/>
+        </w:rPr>
+        <w:t>. ACM SIGSPATIAL 2023.</w:t>
+      </w:r>
+    </w:p>
+    <w:p>
+      <w:pPr>
+        <w:pStyle w:val="references"/>
+        <w:ind w:start="17.70pt" w:hanging="17.70pt"/>
+      </w:pPr>
+      <w:r>
+        <w:rPr>
+          <w:lang w:val="fr-FR"/>
+        </w:rPr>
+        <w:t xml:space="preserve">Zhang, Z., et al. (2024a). </w:t>
+      </w:r>
+      <w:r>
+        <w:rPr>
+          <w:i/>
+          <w:iCs/>
+          <w:lang w:val="en-AE"/>
+        </w:rPr>
+        <w:t>BB-GeoGPT: A Framework for Learning a Large Language Model for Geographic Information Science</w:t>
+      </w:r>
+      <w:r>
+        <w:rPr>
+          <w:lang w:val="en-AE"/>
+        </w:rPr>
+        <w:t>. Information Processing &amp; Management.</w:t>
+      </w:r>
+    </w:p>
+    <w:p>
+      <w:pPr>
+        <w:pStyle w:val="references"/>
+        <w:ind w:start="17.70pt" w:hanging="17.70pt"/>
+      </w:pPr>
+      <w:r>
+        <w:rPr>
+          <w:lang w:val="en-AE"/>
+        </w:rPr>
+        <w:t xml:space="preserve">Shah, R., et al. (2024). </w:t>
+      </w:r>
+      <w:r>
+        <w:rPr>
+          <w:i/>
+          <w:iCs/>
+          <w:lang w:val="en-AE"/>
+        </w:rPr>
+        <w:t>GeoLLM: Extracting Geospatial Knowledge from Large Language Models</w:t>
+      </w:r>
+      <w:r>
+        <w:rPr>
+          <w:lang w:val="en-AE"/>
+        </w:rPr>
+        <w:t>. ICLR 2024 Conference Track.</w:t>
       </w:r>
     </w:p>
     <w:p>
@@ -826,58 +892,6 @@
         <w:ind w:start="17.70pt"/>
         <w:rPr>
           <w:lang w:val="en-AE"/>
-        </w:rPr>
-      </w:pPr>
-      <w:r>
-        <w:rPr>
-          <w:lang w:val="en-AE"/>
-        </w:rPr>
-        <w:br/>
-      </w:r>
-      <w:r>
-        <w:rPr>
-          <w:lang w:val="en-AE"/>
-        </w:rPr>
-        <w:br/>
-      </w:r>
-      <w:r>
-        <w:rPr>
-          <w:lang w:val="en-AE"/>
-        </w:rPr>
-        <w:br/>
-      </w:r>
-      <w:r>
-        <w:rPr>
-          <w:lang w:val="en-AE"/>
-        </w:rPr>
-        <w:br/>
-      </w:r>
-      <w:r>
-        <w:rPr>
-          <w:lang w:val="en-AE"/>
-        </w:rPr>
-        <w:br/>
-      </w:r>
-    </w:p>
-    <w:p>
-      <w:pPr>
-        <w:pStyle w:val="references"/>
-        <w:numPr>
-          <w:ilvl w:val="0"/>
-          <w:numId w:val="0"/>
-        </w:numPr>
-        <w:spacing w:line="12pt" w:lineRule="auto"/>
-        <w:ind w:start="18pt" w:hanging="18pt"/>
-        <w:jc w:val="center"/>
-        <w:rPr>
-          <w:rFonts w:eastAsia="SimSun"/>
-          <w:b/>
-          <w:noProof w:val="0"/>
-          <w:color w:val="FF0000"/>
-          <w:spacing w:val="-1"/>
-          <w:sz w:val="20"/>
-          <w:szCs w:val="20"/>
-          <w:lang w:val="x-none" w:eastAsia="x-none"/>
         </w:rPr>
         <w:sectPr>
           <w:type w:val="continuous"/>
@@ -887,8 +901,36 @@
           <w:docGrid w:linePitch="360"/>
         </w:sectPr>
       </w:pPr>
-    </w:p>
-    <w:p/>
+      <w:r>
+        <w:rPr>
+          <w:lang w:val="en-AE"/>
+        </w:rPr>
+        <w:br/>
+      </w:r>
+      <w:r>
+        <w:rPr>
+          <w:lang w:val="en-AE"/>
+        </w:rPr>
+        <w:br/>
+      </w:r>
+      <w:r>
+        <w:rPr>
+          <w:lang w:val="en-AE"/>
+        </w:rPr>
+        <w:br/>
+      </w:r>
+      <w:r>
+        <w:rPr>
+          <w:lang w:val="en-AE"/>
+        </w:rPr>
+        <w:br/>
+      </w:r>
+    </w:p>
+    <w:p>
+      <w:pPr>
+        <w:jc w:val="both"/>
+      </w:pPr>
+    </w:p>
     <w:sectPr>
       <w:type w:val="continuous"/>
       <w:pgSz w:w="595.30pt" w:h="841.90pt" w:code="9"/>

</xml_diff>

<commit_message>
Update "Related Work" Section
</commit_message>
<xml_diff>
--- a/GeoBikeLLM Paper.docx
+++ b/GeoBikeLLM Paper.docx
@@ -350,30 +350,39 @@
       <w:r>
         <w:t>Keywords—</w:t>
       </w:r>
+      <w:proofErr w:type="gramStart"/>
       <w:r>
         <w:t xml:space="preserve">Geospatial </w:t>
       </w:r>
       <w:r>
         <w:t>,</w:t>
       </w:r>
+      <w:proofErr w:type="gramEnd"/>
       <w:r>
         <w:t xml:space="preserve"> </w:t>
       </w:r>
+      <w:proofErr w:type="gramStart"/>
       <w:r>
         <w:t xml:space="preserve">LLM </w:t>
       </w:r>
       <w:r>
         <w:t>,</w:t>
       </w:r>
+      <w:proofErr w:type="gramEnd"/>
       <w:r>
         <w:t xml:space="preserve"> </w:t>
       </w:r>
       <w:r>
-        <w:t xml:space="preserve">Air Quality </w:t>
+        <w:t xml:space="preserve">Air </w:t>
+      </w:r>
+      <w:proofErr w:type="gramStart"/>
+      <w:r>
+        <w:t xml:space="preserve">Quality </w:t>
       </w:r>
       <w:r>
         <w:t>,</w:t>
       </w:r>
+      <w:proofErr w:type="gramEnd"/>
       <w:r>
         <w:t xml:space="preserve"> </w:t>
       </w:r>
@@ -771,6 +780,40 @@
     </w:p>
     <w:p>
       <w:pPr>
+        <w:pStyle w:val="BodyText"/>
+        <w:rPr>
+          <w:lang w:val="en-US"/>
+        </w:rPr>
+      </w:pPr>
+      <w:r>
+        <w:rPr>
+          <w:lang w:val="en-AE"/>
+        </w:rPr>
+        <w:t xml:space="preserve">Despite these advancements, existing solutions lack targeted support for personalized route planning or environmental criteria integration. None of the reviewed systems directly tackle bicycle routing that adapts to vegetation or pollution levels. Our proposed </w:t>
+      </w:r>
+      <w:proofErr w:type="spellStart"/>
+      <w:r>
+        <w:rPr>
+          <w:lang w:val="en-AE"/>
+        </w:rPr>
+        <w:t>GeoBikeLLM</w:t>
+      </w:r>
+      <w:proofErr w:type="spellEnd"/>
+      <w:r>
+        <w:rPr>
+          <w:lang w:val="en-AE"/>
+        </w:rPr>
+        <w:t xml:space="preserve"> addresses this gap by combining LLMs with geospatial intelligence to deliver environment-aware, health-optimized bike route planning</w:t>
+      </w:r>
+      <w:r>
+        <w:rPr>
+          <w:lang w:val="en-US"/>
+        </w:rPr>
+        <w:t>.</w:t>
+      </w:r>
+    </w:p>
+    <w:p>
+      <w:pPr>
         <w:rPr>
           <w:lang w:val="en-AE"/>
         </w:rPr>
@@ -960,6 +1003,7 @@
         <w:rPr>
           <w:lang w:val="en-AE"/>
         </w:rPr>
+        <w:lastRenderedPageBreak/>
         <w:t xml:space="preserve">Mansourian, A. &amp; Oucheikh, A. (2024). </w:t>
       </w:r>
       <w:r>
@@ -1012,7 +1056,6 @@
         <w:rPr>
           <w:lang w:val="en-AE"/>
         </w:rPr>
-        <w:lastRenderedPageBreak/>
         <w:t xml:space="preserve">Staniek, M., et al. (2024). </w:t>
       </w:r>
       <w:r>

</xml_diff>

<commit_message>
Finalizing Related Work Section
</commit_message>
<xml_diff>
--- a/GeoBikeLLM Paper.docx
+++ b/GeoBikeLLM Paper.docx
@@ -350,39 +350,30 @@
       <w:r>
         <w:t>Keywords—</w:t>
       </w:r>
-      <w:proofErr w:type="gramStart"/>
       <w:r>
         <w:t xml:space="preserve">Geospatial </w:t>
       </w:r>
       <w:r>
         <w:t>,</w:t>
       </w:r>
-      <w:proofErr w:type="gramEnd"/>
       <w:r>
         <w:t xml:space="preserve"> </w:t>
       </w:r>
-      <w:proofErr w:type="gramStart"/>
       <w:r>
         <w:t xml:space="preserve">LLM </w:t>
       </w:r>
       <w:r>
         <w:t>,</w:t>
       </w:r>
-      <w:proofErr w:type="gramEnd"/>
       <w:r>
         <w:t xml:space="preserve"> </w:t>
       </w:r>
       <w:r>
-        <w:t xml:space="preserve">Air </w:t>
-      </w:r>
-      <w:proofErr w:type="gramStart"/>
-      <w:r>
-        <w:t xml:space="preserve">Quality </w:t>
+        <w:t xml:space="preserve">Air Quality </w:t>
       </w:r>
       <w:r>
         <w:t>,</w:t>
       </w:r>
-      <w:proofErr w:type="gramEnd"/>
       <w:r>
         <w:t xml:space="preserve"> </w:t>
       </w:r>
@@ -425,6 +416,35 @@
     </w:p>
     <w:p>
       <w:pPr>
+        <w:pStyle w:val="BodyText"/>
+      </w:pPr>
+      <w:r>
+        <w:rPr>
+          <w:lang w:val="en-US"/>
+        </w:rPr>
+        <w:t xml:space="preserve">Recent advancements in GeoAI and LLM research have enabled natural language interfaces for querying and interpreting geospatial data. Studies have explored both LLM-augmented spatial querying and multimodal systems integrating maps, satellite imagery, and text for environmental reasoning. This section reviews existing approaches and highlights the gap </w:t>
+      </w:r>
+      <w:r>
+        <w:rPr>
+          <w:lang w:val="en-US"/>
+        </w:rPr>
+        <w:t xml:space="preserve">that </w:t>
+      </w:r>
+      <w:r>
+        <w:rPr>
+          <w:lang w:val="en-US"/>
+        </w:rPr>
+        <w:t>our proposed GeoBikeLLM system aims to fill.</w:t>
+      </w:r>
+      <w:r>
+        <w:rPr>
+          <w:lang w:val="en-US"/>
+        </w:rPr>
+        <w:t xml:space="preserve"> </w:t>
+      </w:r>
+    </w:p>
+    <w:p>
+      <w:pPr>
         <w:pStyle w:val="Heading2"/>
       </w:pPr>
       <w:r>
@@ -442,119 +462,7 @@
         <w:rPr>
           <w:lang w:val="en-AE"/>
         </w:rPr>
-        <w:t xml:space="preserve">Recent research has focused on enhancing geospatial data accessibility through natural language interfaces powered by large language models (LLMs). Systems like </w:t>
-      </w:r>
-      <w:proofErr w:type="spellStart"/>
-      <w:r>
-        <w:rPr>
-          <w:lang w:val="en-AE"/>
-        </w:rPr>
-        <w:t>ChatGeoAI</w:t>
-      </w:r>
-      <w:proofErr w:type="spellEnd"/>
-      <w:r>
-        <w:rPr>
-          <w:lang w:val="en-AE"/>
-        </w:rPr>
-        <w:t xml:space="preserve"> by Mansourian and </w:t>
-      </w:r>
-      <w:proofErr w:type="spellStart"/>
-      <w:r>
-        <w:rPr>
-          <w:lang w:val="en-AE"/>
-        </w:rPr>
-        <w:t>Oucheikh</w:t>
-      </w:r>
-      <w:proofErr w:type="spellEnd"/>
-      <w:r>
-        <w:rPr>
-          <w:lang w:val="en-AE"/>
-        </w:rPr>
-        <w:t xml:space="preserve"> [1] and the SQL-generation framework by Jiang and Yang [2] enable users to perform GIS tasks or query spatial databases using natural language. </w:t>
-      </w:r>
-      <w:proofErr w:type="spellStart"/>
-      <w:r>
-        <w:rPr>
-          <w:lang w:val="en-AE"/>
-        </w:rPr>
-        <w:t>ChatGeoAI</w:t>
-      </w:r>
-      <w:proofErr w:type="spellEnd"/>
-      <w:r>
-        <w:rPr>
-          <w:lang w:val="en-AE"/>
-        </w:rPr>
-        <w:t xml:space="preserve"> employs LLaMA-2 to convert queries into executable </w:t>
-      </w:r>
-      <w:proofErr w:type="spellStart"/>
-      <w:r>
-        <w:rPr>
-          <w:lang w:val="en-AE"/>
-        </w:rPr>
-        <w:t>PyQGIS</w:t>
-      </w:r>
-      <w:proofErr w:type="spellEnd"/>
-      <w:r>
-        <w:rPr>
-          <w:lang w:val="en-AE"/>
-        </w:rPr>
-        <w:t xml:space="preserve"> scripts, while Jiang and Yang use ChatGPT to generate </w:t>
-      </w:r>
-      <w:proofErr w:type="spellStart"/>
-      <w:r>
-        <w:rPr>
-          <w:lang w:val="en-AE"/>
-        </w:rPr>
-        <w:t>PostGIS</w:t>
-      </w:r>
-      <w:proofErr w:type="spellEnd"/>
-      <w:r>
-        <w:rPr>
-          <w:lang w:val="en-AE"/>
-        </w:rPr>
-        <w:t>-compatible SQL. Text-to-</w:t>
-      </w:r>
-      <w:proofErr w:type="spellStart"/>
-      <w:r>
-        <w:rPr>
-          <w:lang w:val="en-AE"/>
-        </w:rPr>
-        <w:t>OverpassQL</w:t>
-      </w:r>
-      <w:proofErr w:type="spellEnd"/>
-      <w:r>
-        <w:rPr>
-          <w:lang w:val="en-AE"/>
-        </w:rPr>
-        <w:t xml:space="preserve"> by </w:t>
-      </w:r>
-      <w:proofErr w:type="spellStart"/>
-      <w:r>
-        <w:rPr>
-          <w:lang w:val="en-AE"/>
-        </w:rPr>
-        <w:t>Staniek</w:t>
-      </w:r>
-      <w:proofErr w:type="spellEnd"/>
-      <w:r>
-        <w:rPr>
-          <w:lang w:val="en-AE"/>
-        </w:rPr>
-        <w:t xml:space="preserve"> et al. [3] further advances this by translating natural language into </w:t>
-      </w:r>
-      <w:proofErr w:type="spellStart"/>
-      <w:r>
-        <w:rPr>
-          <w:lang w:val="en-AE"/>
-        </w:rPr>
-        <w:t>OverpassQL</w:t>
-      </w:r>
-      <w:proofErr w:type="spellEnd"/>
-      <w:r>
-        <w:rPr>
-          <w:lang w:val="en-AE"/>
-        </w:rPr>
-        <w:t xml:space="preserve"> queries for OpenStreetMap, democratizing access to structured geodata.</w:t>
+        <w:t>Recent research has focused on enhancing geospatial data accessibility through natural language interfaces powered by large language models (LLMs). Systems like ChatGeoAI by Mansourian and Oucheikh [1] and the SQL-generation framework by Jiang and Yang [2] enable users to perform GIS tasks or query spatial databases using natural language. ChatGeoAI employs LLaMA-2 to convert queries into executable PyQGIS scripts, while Jiang and Yang use ChatGPT to generate PostGIS-compatible SQL. Text-to-OverpassQL by Staniek et al. [3] further advances this by translating natural language into OverpassQL queries for OpenStreetMap, democratizing access to structured geodata.</w:t>
       </w:r>
     </w:p>
     <w:p>
@@ -575,49 +483,7 @@
         <w:rPr>
           <w:lang w:val="en-AE"/>
         </w:rPr>
-        <w:t xml:space="preserve">Other studies investigate how LLMs can interpret or extract geographic knowledge. </w:t>
-      </w:r>
-      <w:proofErr w:type="spellStart"/>
-      <w:r>
-        <w:rPr>
-          <w:lang w:val="en-AE"/>
-        </w:rPr>
-        <w:t>GeoQAMap</w:t>
-      </w:r>
-      <w:proofErr w:type="spellEnd"/>
-      <w:r>
-        <w:rPr>
-          <w:lang w:val="en-AE"/>
-        </w:rPr>
-        <w:t xml:space="preserve"> by Feng et al. [4] utilizes GPT-3.5 and </w:t>
-      </w:r>
-      <w:proofErr w:type="spellStart"/>
-      <w:r>
-        <w:rPr>
-          <w:lang w:val="en-AE"/>
-        </w:rPr>
-        <w:t>Wikidata</w:t>
-      </w:r>
-      <w:proofErr w:type="spellEnd"/>
-      <w:r>
-        <w:rPr>
-          <w:lang w:val="en-AE"/>
-        </w:rPr>
-        <w:t xml:space="preserve"> to answer geographic questions and visualize answers on maps. </w:t>
-      </w:r>
-      <w:proofErr w:type="spellStart"/>
-      <w:r>
-        <w:rPr>
-          <w:lang w:val="en-AE"/>
-        </w:rPr>
-        <w:t>GeoAgent</w:t>
-      </w:r>
-      <w:proofErr w:type="spellEnd"/>
-      <w:r>
-        <w:rPr>
-          <w:lang w:val="en-AE"/>
-        </w:rPr>
-        <w:t xml:space="preserve"> by Huang et al. [5] focuses on address standardization using ChatGLM-6B, showing how LLMs can resolve ambiguous and incomplete geospatial texts. Meanwhile, Bhandari et al. [6] evaluate whether large language models are geospatially knowledgeable, revealing that while some geospatial knowledge exists in pretrained models, it is often imprecise.</w:t>
+        <w:t>Other studies investigate how LLMs can interpret or extract geographic knowledge. GeoQAMap by Feng et al. [4] utilizes GPT-3.5 and Wikidata to answer geographic questions and visualize answers on maps. GeoAgent by Huang et al. [5] focuses on address standardization using ChatGLM-6B, showing how LLMs can resolve ambiguous and incomplete geospatial texts. Meanwhile, Bhandari et al. [6] evaluate whether large language models are geospatially knowledgeable, revealing that while some geospatial knowledge exists in pretrained models, it is often imprecise.</w:t>
       </w:r>
     </w:p>
     <w:p>
@@ -631,35 +497,7 @@
         <w:rPr>
           <w:lang w:val="en-AE"/>
         </w:rPr>
-        <w:t>To overcome these limitations, domain-adapted models have emerged. BB-</w:t>
-      </w:r>
-      <w:proofErr w:type="spellStart"/>
-      <w:r>
-        <w:rPr>
-          <w:lang w:val="en-AE"/>
-        </w:rPr>
-        <w:t>GeoGPT</w:t>
-      </w:r>
-      <w:proofErr w:type="spellEnd"/>
-      <w:r>
-        <w:rPr>
-          <w:lang w:val="en-AE"/>
-        </w:rPr>
-        <w:t xml:space="preserve"> by Zhang et al. [7] is a fine-tuned LLaMA-2 model trained on GIS texts and Q&amp;A pairs, outperforming general LLMs in spatial queries. Similarly, </w:t>
-      </w:r>
-      <w:proofErr w:type="spellStart"/>
-      <w:r>
-        <w:rPr>
-          <w:lang w:val="en-AE"/>
-        </w:rPr>
-        <w:t>GeoLLM</w:t>
-      </w:r>
-      <w:proofErr w:type="spellEnd"/>
-      <w:r>
-        <w:rPr>
-          <w:lang w:val="en-AE"/>
-        </w:rPr>
-        <w:t xml:space="preserve"> by Shah et al. [8] boosts geospatial prediction accuracy by embedding map-based contextual data into prompts. These efforts establish the foundation for natural language interaction with spatial systems but stop short of performing complex geospatial planning or optimization.</w:t>
+        <w:t>To overcome these limitations, domain-adapted models have emerged. BB-GeoGPT by Zhang et al. [7] is a fine-tuned LLaMA-2 model trained on GIS texts and Q&amp;A pairs, outperforming general LLMs in spatial queries. Similarly, GeoLLM by Shah et al. [8] boosts geospatial prediction accuracy by embedding map-based contextual data into prompts. These efforts establish the foundation for natural language interaction with spatial systems but stop short of performing complex geospatial planning or optimization.</w:t>
       </w:r>
     </w:p>
     <w:p>
@@ -692,55 +530,7 @@
         <w:rPr>
           <w:lang w:val="en-AE"/>
         </w:rPr>
-        <w:t xml:space="preserve">Advancements in </w:t>
-      </w:r>
-      <w:proofErr w:type="spellStart"/>
-      <w:r>
-        <w:rPr>
-          <w:lang w:val="en-AE"/>
-        </w:rPr>
-        <w:t>GeoAI</w:t>
-      </w:r>
-      <w:proofErr w:type="spellEnd"/>
-      <w:r>
-        <w:rPr>
-          <w:lang w:val="en-AE"/>
-        </w:rPr>
-        <w:t xml:space="preserve"> have expanded to multimodal systems integrating LLMs with visual and structured geospatial data. </w:t>
-      </w:r>
-      <w:proofErr w:type="spellStart"/>
-      <w:r>
-        <w:rPr>
-          <w:lang w:val="en-AE"/>
-        </w:rPr>
-        <w:t>OmniGeo</w:t>
-      </w:r>
-      <w:proofErr w:type="spellEnd"/>
-      <w:r>
-        <w:rPr>
-          <w:lang w:val="en-AE"/>
-        </w:rPr>
-        <w:t xml:space="preserve"> by Yuan et al. [9] exemplifies this trend by combining satellite imagery, map layers, and text </w:t>
-      </w:r>
-      <w:r>
-        <w:rPr>
-          <w:lang w:val="en-AE"/>
-        </w:rPr>
-        <w:t xml:space="preserve">data, enabling LLMs to perform diverse tasks such as land use classification and environmental forecasting. Geode by Wu et al. [10] and </w:t>
-      </w:r>
-      <w:proofErr w:type="spellStart"/>
-      <w:r>
-        <w:rPr>
-          <w:lang w:val="en-AE"/>
-        </w:rPr>
-        <w:t>GTChain</w:t>
-      </w:r>
-      <w:proofErr w:type="spellEnd"/>
-      <w:r>
-        <w:rPr>
-          <w:lang w:val="en-AE"/>
-        </w:rPr>
-        <w:t xml:space="preserve"> by Zhang et al. [11] extend LLMs into autonomous agents, coordinating APIs, GIS tools, and real-time databases to solve spatial tasks.</w:t>
+        <w:t>Advancements in GeoAI have expanded to multimodal systems integrating LLMs with visual and structured geospatial data. OmniGeo by Yuan et al. [9] exemplifies this trend by combining satellite imagery, map layers, and text data, enabling LLMs to perform diverse tasks such as land use classification and environmental forecasting. Geode by Wu et al. [10] and GTChain by Zhang et al. [11] extend LLMs into autonomous agents, coordinating APIs, GIS tools, and real-time databases to solve spatial tasks.</w:t>
       </w:r>
     </w:p>
     <w:p>
@@ -761,21 +551,7 @@
         <w:rPr>
           <w:lang w:val="en-AE"/>
         </w:rPr>
-        <w:t xml:space="preserve">These systems demonstrate the potential of LLMs in spatial reasoning, data retrieval, and geospatial tool orchestration. Geode performs zero-shot geospatial Q&amp;A with explicit reasoning and live data, while </w:t>
-      </w:r>
-      <w:proofErr w:type="spellStart"/>
-      <w:r>
-        <w:rPr>
-          <w:lang w:val="en-AE"/>
-        </w:rPr>
-        <w:t>GTChain</w:t>
-      </w:r>
-      <w:proofErr w:type="spellEnd"/>
-      <w:r>
-        <w:rPr>
-          <w:lang w:val="en-AE"/>
-        </w:rPr>
-        <w:t xml:space="preserve"> trains LLMs to generate tool-use chains for complex tasks in simulated GIS environments. The autonomous GIS agent by Ning et al. [12] also showcases how LLMs can be used to dynamically retrieve data across diverse spatial datasets, enhancing spatial decision-making workflows.</w:t>
+        <w:t>These systems demonstrate the potential of LLMs in spatial reasoning, data retrieval, and geospatial tool orchestration. Geode performs zero-shot geospatial Q&amp;A with explicit reasoning and live data, while GTChain trains LLMs to generate tool-use chains for complex tasks in simulated GIS environments. The autonomous GIS agent by Ning et al. [12] also showcases how LLMs can be used to dynamically retrieve data across diverse spatial datasets, enhancing spatial decision-making workflows.</w:t>
       </w:r>
     </w:p>
     <w:p>
@@ -789,21 +565,7 @@
         <w:rPr>
           <w:lang w:val="en-AE"/>
         </w:rPr>
-        <w:t xml:space="preserve">Despite these advancements, existing solutions lack targeted support for personalized route planning or environmental criteria integration. None of the reviewed systems directly tackle bicycle routing that adapts to vegetation or pollution levels. Our proposed </w:t>
-      </w:r>
-      <w:proofErr w:type="spellStart"/>
-      <w:r>
-        <w:rPr>
-          <w:lang w:val="en-AE"/>
-        </w:rPr>
-        <w:t>GeoBikeLLM</w:t>
-      </w:r>
-      <w:proofErr w:type="spellEnd"/>
-      <w:r>
-        <w:rPr>
-          <w:lang w:val="en-AE"/>
-        </w:rPr>
-        <w:t xml:space="preserve"> addresses this gap by combining LLMs with geospatial intelligence to deliver environment-aware, health-optimized bike route planning</w:t>
+        <w:t>Despite these advancements, existing solutions lack targeted support for personalized route planning or environmental criteria integration. None of the reviewed systems directly tackle bicycle routing that adapts to vegetation or pollution levels. Our proposed GeoBikeLLM addresses this gap by combining LLMs with geospatial intelligence to deliver environment-aware, health-optimized bike route planning</w:t>
       </w:r>
       <w:r>
         <w:rPr>
@@ -920,6 +682,7 @@
         <w:pStyle w:val="Heading2"/>
       </w:pPr>
       <w:r>
+        <w:lastRenderedPageBreak/>
         <w:t>Identify</w:t>
       </w:r>
       <w:r>
@@ -1003,7 +766,6 @@
         <w:rPr>
           <w:lang w:val="en-AE"/>
         </w:rPr>
-        <w:lastRenderedPageBreak/>
         <w:t xml:space="preserve">Mansourian, A. &amp; Oucheikh, A. (2024). </w:t>
       </w:r>
       <w:r>

</xml_diff>

<commit_message>
Add Path Selection Module to Methodology Section
Added a new subsection titled "B. Path Selection Module" to the Methodology. This section explains the construction of a weighted undirected graph using Chicago bike lane data, enhanced with environmental quality metrics (PM2.5 and NDVI). The cost function incorporating air quality and greenery using tunable weights (α and β)

The spatial matching process via KD-Trees

The application of Yen’s algorithm to extract the top-k shortest paths

The selection strategy based on minimizing pollution and maximizing greenery
</commit_message>
<xml_diff>
--- a/GeoBikeLLM Paper.docx
+++ b/GeoBikeLLM Paper.docx
@@ -350,30 +350,39 @@
       <w:r>
         <w:t>Keywords—</w:t>
       </w:r>
+      <w:proofErr w:type="gramStart"/>
       <w:r>
         <w:t xml:space="preserve">Geospatial </w:t>
       </w:r>
       <w:r>
         <w:t>,</w:t>
       </w:r>
+      <w:proofErr w:type="gramEnd"/>
       <w:r>
         <w:t xml:space="preserve"> </w:t>
       </w:r>
+      <w:proofErr w:type="gramStart"/>
       <w:r>
         <w:t xml:space="preserve">LLM </w:t>
       </w:r>
       <w:r>
         <w:t>,</w:t>
       </w:r>
+      <w:proofErr w:type="gramEnd"/>
       <w:r>
         <w:t xml:space="preserve"> </w:t>
       </w:r>
       <w:r>
-        <w:t xml:space="preserve">Air Quality </w:t>
+        <w:t xml:space="preserve">Air </w:t>
+      </w:r>
+      <w:proofErr w:type="gramStart"/>
+      <w:r>
+        <w:t xml:space="preserve">Quality </w:t>
       </w:r>
       <w:r>
         <w:t>,</w:t>
       </w:r>
+      <w:proofErr w:type="gramEnd"/>
       <w:r>
         <w:t xml:space="preserve"> </w:t>
       </w:r>
@@ -422,24 +431,52 @@
         <w:rPr>
           <w:lang w:val="en-US"/>
         </w:rPr>
-        <w:t xml:space="preserve">Recent advancements in GeoAI and LLM research have enabled natural language interfaces for querying and interpreting geospatial data. Studies have explored both LLM-augmented spatial querying and multimodal systems integrating maps, satellite imagery, and text for environmental reasoning. This section reviews existing approaches and highlights the gap </w:t>
-      </w:r>
+        <w:t xml:space="preserve">Recent advancements in </w:t>
+      </w:r>
+      <w:proofErr w:type="spellStart"/>
       <w:r>
         <w:rPr>
           <w:lang w:val="en-US"/>
         </w:rPr>
+        <w:t>GeoAI</w:t>
+      </w:r>
+      <w:proofErr w:type="spellEnd"/>
+      <w:r>
+        <w:rPr>
+          <w:lang w:val="en-US"/>
+        </w:rPr>
+        <w:t xml:space="preserve"> and LLM research have enabled natural language interfaces for querying and interpreting geospatial data. Studies have explored both LLM-augmented spatial querying and multimodal systems integrating maps, satellite imagery, and text for environmental reasoning. This section reviews existing approaches and highlights the gap </w:t>
+      </w:r>
+      <w:r>
+        <w:rPr>
+          <w:lang w:val="en-US"/>
+        </w:rPr>
         <w:t xml:space="preserve">that </w:t>
       </w:r>
       <w:r>
         <w:rPr>
           <w:lang w:val="en-US"/>
         </w:rPr>
-        <w:t>our proposed GeoBikeLLM system aims to fill.</w:t>
-      </w:r>
+        <w:t xml:space="preserve">our proposed </w:t>
+      </w:r>
+      <w:proofErr w:type="spellStart"/>
       <w:r>
         <w:rPr>
           <w:lang w:val="en-US"/>
         </w:rPr>
+        <w:t>GeoBikeLLM</w:t>
+      </w:r>
+      <w:proofErr w:type="spellEnd"/>
+      <w:r>
+        <w:rPr>
+          <w:lang w:val="en-US"/>
+        </w:rPr>
+        <w:t xml:space="preserve"> system aims to fill.</w:t>
+      </w:r>
+      <w:r>
+        <w:rPr>
+          <w:lang w:val="en-US"/>
+        </w:rPr>
         <w:t xml:space="preserve"> </w:t>
       </w:r>
     </w:p>
@@ -462,7 +499,119 @@
         <w:rPr>
           <w:lang w:val="en-AE"/>
         </w:rPr>
-        <w:t>Recent research has focused on enhancing geospatial data accessibility through natural language interfaces powered by large language models (LLMs). Systems like ChatGeoAI by Mansourian and Oucheikh [1] and the SQL-generation framework by Jiang and Yang [2] enable users to perform GIS tasks or query spatial databases using natural language. ChatGeoAI employs LLaMA-2 to convert queries into executable PyQGIS scripts, while Jiang and Yang use ChatGPT to generate PostGIS-compatible SQL. Text-to-OverpassQL by Staniek et al. [3] further advances this by translating natural language into OverpassQL queries for OpenStreetMap, democratizing access to structured geodata.</w:t>
+        <w:t xml:space="preserve">Recent research has focused on enhancing geospatial data accessibility through natural language interfaces powered by large language models (LLMs). Systems like </w:t>
+      </w:r>
+      <w:proofErr w:type="spellStart"/>
+      <w:r>
+        <w:rPr>
+          <w:lang w:val="en-AE"/>
+        </w:rPr>
+        <w:t>ChatGeoAI</w:t>
+      </w:r>
+      <w:proofErr w:type="spellEnd"/>
+      <w:r>
+        <w:rPr>
+          <w:lang w:val="en-AE"/>
+        </w:rPr>
+        <w:t xml:space="preserve"> by Mansourian and </w:t>
+      </w:r>
+      <w:proofErr w:type="spellStart"/>
+      <w:r>
+        <w:rPr>
+          <w:lang w:val="en-AE"/>
+        </w:rPr>
+        <w:t>Oucheikh</w:t>
+      </w:r>
+      <w:proofErr w:type="spellEnd"/>
+      <w:r>
+        <w:rPr>
+          <w:lang w:val="en-AE"/>
+        </w:rPr>
+        <w:t xml:space="preserve"> [1] and the SQL-generation framework by Jiang and Yang [2] enable users to perform GIS tasks or query spatial databases using natural language. </w:t>
+      </w:r>
+      <w:proofErr w:type="spellStart"/>
+      <w:r>
+        <w:rPr>
+          <w:lang w:val="en-AE"/>
+        </w:rPr>
+        <w:t>ChatGeoAI</w:t>
+      </w:r>
+      <w:proofErr w:type="spellEnd"/>
+      <w:r>
+        <w:rPr>
+          <w:lang w:val="en-AE"/>
+        </w:rPr>
+        <w:t xml:space="preserve"> employs LLaMA-2 to convert queries into executable </w:t>
+      </w:r>
+      <w:proofErr w:type="spellStart"/>
+      <w:r>
+        <w:rPr>
+          <w:lang w:val="en-AE"/>
+        </w:rPr>
+        <w:t>PyQGIS</w:t>
+      </w:r>
+      <w:proofErr w:type="spellEnd"/>
+      <w:r>
+        <w:rPr>
+          <w:lang w:val="en-AE"/>
+        </w:rPr>
+        <w:t xml:space="preserve"> scripts, while Jiang and Yang use ChatGPT to generate </w:t>
+      </w:r>
+      <w:proofErr w:type="spellStart"/>
+      <w:r>
+        <w:rPr>
+          <w:lang w:val="en-AE"/>
+        </w:rPr>
+        <w:t>PostGIS</w:t>
+      </w:r>
+      <w:proofErr w:type="spellEnd"/>
+      <w:r>
+        <w:rPr>
+          <w:lang w:val="en-AE"/>
+        </w:rPr>
+        <w:t>-compatible SQL. Text-to-</w:t>
+      </w:r>
+      <w:proofErr w:type="spellStart"/>
+      <w:r>
+        <w:rPr>
+          <w:lang w:val="en-AE"/>
+        </w:rPr>
+        <w:t>OverpassQL</w:t>
+      </w:r>
+      <w:proofErr w:type="spellEnd"/>
+      <w:r>
+        <w:rPr>
+          <w:lang w:val="en-AE"/>
+        </w:rPr>
+        <w:t xml:space="preserve"> by </w:t>
+      </w:r>
+      <w:proofErr w:type="spellStart"/>
+      <w:r>
+        <w:rPr>
+          <w:lang w:val="en-AE"/>
+        </w:rPr>
+        <w:t>Staniek</w:t>
+      </w:r>
+      <w:proofErr w:type="spellEnd"/>
+      <w:r>
+        <w:rPr>
+          <w:lang w:val="en-AE"/>
+        </w:rPr>
+        <w:t xml:space="preserve"> et al. [3] further advances this by translating natural language into </w:t>
+      </w:r>
+      <w:proofErr w:type="spellStart"/>
+      <w:r>
+        <w:rPr>
+          <w:lang w:val="en-AE"/>
+        </w:rPr>
+        <w:t>OverpassQL</w:t>
+      </w:r>
+      <w:proofErr w:type="spellEnd"/>
+      <w:r>
+        <w:rPr>
+          <w:lang w:val="en-AE"/>
+        </w:rPr>
+        <w:t xml:space="preserve"> queries for OpenStreetMap, democratizing access to structured geodata.</w:t>
       </w:r>
     </w:p>
     <w:p>
@@ -483,7 +632,49 @@
         <w:rPr>
           <w:lang w:val="en-AE"/>
         </w:rPr>
-        <w:t>Other studies investigate how LLMs can interpret or extract geographic knowledge. GeoQAMap by Feng et al. [4] utilizes GPT-3.5 and Wikidata to answer geographic questions and visualize answers on maps. GeoAgent by Huang et al. [5] focuses on address standardization using ChatGLM-6B, showing how LLMs can resolve ambiguous and incomplete geospatial texts. Meanwhile, Bhandari et al. [6] evaluate whether large language models are geospatially knowledgeable, revealing that while some geospatial knowledge exists in pretrained models, it is often imprecise.</w:t>
+        <w:t xml:space="preserve">Other studies investigate how LLMs can interpret or extract geographic knowledge. </w:t>
+      </w:r>
+      <w:proofErr w:type="spellStart"/>
+      <w:r>
+        <w:rPr>
+          <w:lang w:val="en-AE"/>
+        </w:rPr>
+        <w:t>GeoQAMap</w:t>
+      </w:r>
+      <w:proofErr w:type="spellEnd"/>
+      <w:r>
+        <w:rPr>
+          <w:lang w:val="en-AE"/>
+        </w:rPr>
+        <w:t xml:space="preserve"> by Feng et al. [4] utilizes GPT-3.5 and </w:t>
+      </w:r>
+      <w:proofErr w:type="spellStart"/>
+      <w:r>
+        <w:rPr>
+          <w:lang w:val="en-AE"/>
+        </w:rPr>
+        <w:t>Wikidata</w:t>
+      </w:r>
+      <w:proofErr w:type="spellEnd"/>
+      <w:r>
+        <w:rPr>
+          <w:lang w:val="en-AE"/>
+        </w:rPr>
+        <w:t xml:space="preserve"> to answer geographic questions and visualize answers on maps. </w:t>
+      </w:r>
+      <w:proofErr w:type="spellStart"/>
+      <w:r>
+        <w:rPr>
+          <w:lang w:val="en-AE"/>
+        </w:rPr>
+        <w:t>GeoAgent</w:t>
+      </w:r>
+      <w:proofErr w:type="spellEnd"/>
+      <w:r>
+        <w:rPr>
+          <w:lang w:val="en-AE"/>
+        </w:rPr>
+        <w:t xml:space="preserve"> by Huang et al. [5] focuses on address standardization using ChatGLM-6B, showing how LLMs can resolve ambiguous and incomplete geospatial texts. Meanwhile, Bhandari et al. [6] evaluate whether large language models are geospatially knowledgeable, revealing that while some geospatial knowledge exists in pretrained models, it is often imprecise.</w:t>
       </w:r>
     </w:p>
     <w:p>
@@ -497,7 +688,35 @@
         <w:rPr>
           <w:lang w:val="en-AE"/>
         </w:rPr>
-        <w:t>To overcome these limitations, domain-adapted models have emerged. BB-GeoGPT by Zhang et al. [7] is a fine-tuned LLaMA-2 model trained on GIS texts and Q&amp;A pairs, outperforming general LLMs in spatial queries. Similarly, GeoLLM by Shah et al. [8] boosts geospatial prediction accuracy by embedding map-based contextual data into prompts. These efforts establish the foundation for natural language interaction with spatial systems but stop short of performing complex geospatial planning or optimization.</w:t>
+        <w:t>To overcome these limitations, domain-adapted models have emerged. BB-</w:t>
+      </w:r>
+      <w:proofErr w:type="spellStart"/>
+      <w:r>
+        <w:rPr>
+          <w:lang w:val="en-AE"/>
+        </w:rPr>
+        <w:t>GeoGPT</w:t>
+      </w:r>
+      <w:proofErr w:type="spellEnd"/>
+      <w:r>
+        <w:rPr>
+          <w:lang w:val="en-AE"/>
+        </w:rPr>
+        <w:t xml:space="preserve"> by Zhang et al. [7] is a fine-tuned LLaMA-2 model trained on GIS texts and Q&amp;A pairs, outperforming general LLMs in spatial queries. Similarly, </w:t>
+      </w:r>
+      <w:proofErr w:type="spellStart"/>
+      <w:r>
+        <w:rPr>
+          <w:lang w:val="en-AE"/>
+        </w:rPr>
+        <w:t>GeoLLM</w:t>
+      </w:r>
+      <w:proofErr w:type="spellEnd"/>
+      <w:r>
+        <w:rPr>
+          <w:lang w:val="en-AE"/>
+        </w:rPr>
+        <w:t xml:space="preserve"> by Shah et al. [8] boosts geospatial prediction accuracy by embedding map-based contextual data into prompts. These efforts establish the foundation for natural language interaction with spatial systems but stop short of performing complex geospatial planning or optimization.</w:t>
       </w:r>
     </w:p>
     <w:p>
@@ -530,7 +749,49 @@
         <w:rPr>
           <w:lang w:val="en-AE"/>
         </w:rPr>
-        <w:t>Advancements in GeoAI have expanded to multimodal systems integrating LLMs with visual and structured geospatial data. OmniGeo by Yuan et al. [9] exemplifies this trend by combining satellite imagery, map layers, and text data, enabling LLMs to perform diverse tasks such as land use classification and environmental forecasting. Geode by Wu et al. [10] and GTChain by Zhang et al. [11] extend LLMs into autonomous agents, coordinating APIs, GIS tools, and real-time databases to solve spatial tasks.</w:t>
+        <w:t xml:space="preserve">Advancements in </w:t>
+      </w:r>
+      <w:proofErr w:type="spellStart"/>
+      <w:r>
+        <w:rPr>
+          <w:lang w:val="en-AE"/>
+        </w:rPr>
+        <w:t>GeoAI</w:t>
+      </w:r>
+      <w:proofErr w:type="spellEnd"/>
+      <w:r>
+        <w:rPr>
+          <w:lang w:val="en-AE"/>
+        </w:rPr>
+        <w:t xml:space="preserve"> have expanded to multimodal systems integrating LLMs with visual and structured geospatial data. </w:t>
+      </w:r>
+      <w:proofErr w:type="spellStart"/>
+      <w:r>
+        <w:rPr>
+          <w:lang w:val="en-AE"/>
+        </w:rPr>
+        <w:t>OmniGeo</w:t>
+      </w:r>
+      <w:proofErr w:type="spellEnd"/>
+      <w:r>
+        <w:rPr>
+          <w:lang w:val="en-AE"/>
+        </w:rPr>
+        <w:t xml:space="preserve"> by Yuan et al. [9] exemplifies this trend by combining satellite imagery, map layers, and text data, enabling LLMs to perform diverse tasks such as land use classification and environmental forecasting. Geode by Wu et al. [10] and </w:t>
+      </w:r>
+      <w:proofErr w:type="spellStart"/>
+      <w:r>
+        <w:rPr>
+          <w:lang w:val="en-AE"/>
+        </w:rPr>
+        <w:t>GTChain</w:t>
+      </w:r>
+      <w:proofErr w:type="spellEnd"/>
+      <w:r>
+        <w:rPr>
+          <w:lang w:val="en-AE"/>
+        </w:rPr>
+        <w:t xml:space="preserve"> by Zhang et al. [11] extend LLMs into autonomous agents, coordinating APIs, GIS tools, and real-time databases to solve spatial tasks.</w:t>
       </w:r>
     </w:p>
     <w:p>
@@ -551,7 +812,21 @@
         <w:rPr>
           <w:lang w:val="en-AE"/>
         </w:rPr>
-        <w:t>These systems demonstrate the potential of LLMs in spatial reasoning, data retrieval, and geospatial tool orchestration. Geode performs zero-shot geospatial Q&amp;A with explicit reasoning and live data, while GTChain trains LLMs to generate tool-use chains for complex tasks in simulated GIS environments. The autonomous GIS agent by Ning et al. [12] also showcases how LLMs can be used to dynamically retrieve data across diverse spatial datasets, enhancing spatial decision-making workflows.</w:t>
+        <w:t xml:space="preserve">These systems demonstrate the potential of LLMs in spatial reasoning, data retrieval, and geospatial tool orchestration. Geode performs zero-shot geospatial Q&amp;A with explicit reasoning and live data, while </w:t>
+      </w:r>
+      <w:proofErr w:type="spellStart"/>
+      <w:r>
+        <w:rPr>
+          <w:lang w:val="en-AE"/>
+        </w:rPr>
+        <w:t>GTChain</w:t>
+      </w:r>
+      <w:proofErr w:type="spellEnd"/>
+      <w:r>
+        <w:rPr>
+          <w:lang w:val="en-AE"/>
+        </w:rPr>
+        <w:t xml:space="preserve"> trains LLMs to generate tool-use chains for complex tasks in simulated GIS environments. The autonomous GIS agent by Ning et al. [12] also showcases how LLMs can be used to dynamically retrieve data across diverse spatial datasets, enhancing spatial decision-making workflows.</w:t>
       </w:r>
     </w:p>
     <w:p>
@@ -565,7 +840,21 @@
         <w:rPr>
           <w:lang w:val="en-AE"/>
         </w:rPr>
-        <w:t>Despite these advancements, existing solutions lack targeted support for personalized route planning or environmental criteria integration. None of the reviewed systems directly tackle bicycle routing that adapts to vegetation or pollution levels. Our proposed GeoBikeLLM addresses this gap by combining LLMs with geospatial intelligence to deliver environment-aware, health-optimized bike route planning</w:t>
+        <w:t xml:space="preserve">Despite these advancements, existing solutions lack targeted support for personalized route planning or environmental criteria integration. None of the reviewed systems directly tackle bicycle routing that adapts to vegetation or pollution levels. Our proposed </w:t>
+      </w:r>
+      <w:proofErr w:type="spellStart"/>
+      <w:r>
+        <w:rPr>
+          <w:lang w:val="en-AE"/>
+        </w:rPr>
+        <w:t>GeoBikeLLM</w:t>
+      </w:r>
+      <w:proofErr w:type="spellEnd"/>
+      <w:r>
+        <w:rPr>
+          <w:lang w:val="en-AE"/>
+        </w:rPr>
+        <w:t xml:space="preserve"> addresses this gap by combining LLMs with geospatial intelligence to deliver environment-aware, health-optimized bike route planning</w:t>
       </w:r>
       <w:r>
         <w:rPr>
@@ -583,42 +872,23 @@
     </w:p>
     <w:p>
       <w:pPr>
+        <w:pStyle w:val="Heading1"/>
+      </w:pPr>
+      <w:r>
+        <w:t>Methodology</w:t>
+      </w:r>
+    </w:p>
+    <w:p>
+      <w:pPr>
+        <w:pStyle w:val="Heading2"/>
+      </w:pPr>
+      <w:r>
+        <w:t>Datasets</w:t>
+      </w:r>
+    </w:p>
+    <w:p>
+      <w:pPr>
         <w:pStyle w:val="BodyText"/>
-      </w:pPr>
-    </w:p>
-    <w:p>
-      <w:pPr>
-        <w:pStyle w:val="Heading2"/>
-        <w:rPr>
-          <w:lang w:val="en-AE"/>
-        </w:rPr>
-      </w:pPr>
-      <w:r>
-        <w:rPr>
-          <w:lang w:val="en-AE"/>
-        </w:rPr>
-        <w:t>Section 2</w:t>
-      </w:r>
-    </w:p>
-    <w:p>
-      <w:pPr>
-        <w:pStyle w:val="Heading1"/>
-      </w:pPr>
-      <w:r>
-        <w:t>Methodology</w:t>
-      </w:r>
-    </w:p>
-    <w:p>
-      <w:pPr>
-        <w:pStyle w:val="Heading2"/>
-      </w:pPr>
-      <w:r>
-        <w:t>Datasets</w:t>
-      </w:r>
-    </w:p>
-    <w:p>
-      <w:pPr>
-        <w:pStyle w:val="BodyText"/>
         <w:rPr>
           <w:lang w:val="en-US"/>
         </w:rPr>
@@ -644,21 +914,15 @@
         <w:rPr>
           <w:i w:val="0"/>
         </w:rPr>
-        <w:t xml:space="preserve">The air quality data is sourced from the Chicago Eclipse Air Quality Dataset, which contains sensor-based measurements of particulate matter (PM2.5) across various locations in the city. Each record includes the geographic coordinates of the sensor, the timestamp of the reading, and the corresponding PM2.5 concentration. These </w:t>
-      </w:r>
-      <w:r>
-        <w:rPr>
-          <w:i w:val="0"/>
-        </w:rPr>
+        <w:t>The air quality data is sourced from the Chicago Eclipse Air Quality Dataset, which contains sensor-based measurements of particulate matter (PM2.5) across various locations in the city. Each record includes the geographic coordinates of the sensor, the timestamp of the reading, and the corresponding PM2.5 concentration. These data help evaluate local pollution levels along potential bike routes.</w:t>
+      </w:r>
+    </w:p>
+    <w:p>
+      <w:pPr>
+        <w:pStyle w:val="Heading3"/>
+      </w:pPr>
+      <w:r>
         <w:lastRenderedPageBreak/>
-        <w:t>data help evaluate local pollution levels along potential bike routes.</w:t>
-      </w:r>
-    </w:p>
-    <w:p>
-      <w:pPr>
-        <w:pStyle w:val="Heading3"/>
-      </w:pPr>
-      <w:r>
         <w:t>NDVI Dataset</w:t>
       </w:r>
       <w:r>
@@ -739,6 +1003,146 @@
         <w:t>Path Selection Module</w:t>
       </w:r>
     </w:p>
+    <w:p>
+      <w:pPr>
+        <w:pStyle w:val="BodyText"/>
+        <w:rPr>
+          <w:lang w:val="en-US"/>
+        </w:rPr>
+      </w:pPr>
+      <w:r>
+        <w:rPr>
+          <w:lang w:val="en-US"/>
+        </w:rPr>
+        <w:t xml:space="preserve">The core of the route planning logic involves constructing a weighted undirected graph from the Chicago bike lane dataset. Each edge represents a bike segment with an associated length, while nodes correspond to geospatial coordinates. To account for environmental quality, air pollution data (PM2.5) and vegetation density (NDVI) are spatially matched to each segment using nearest-neighbor querying via KD-Trees. </w:t>
+      </w:r>
+      <w:r>
+        <w:rPr>
+          <w:lang w:val="en-US"/>
+        </w:rPr>
+        <w:t>The cost of each edge is computed as shown in (1), where α and β control the influence of PM2.5 and NDVI</w:t>
+      </w:r>
+      <w:r>
+        <w:rPr>
+          <w:lang w:val="en-US"/>
+        </w:rPr>
+        <w:t>,</w:t>
+      </w:r>
+      <w:r>
+        <w:rPr>
+          <w:lang w:val="en-US"/>
+        </w:rPr>
+        <w:t xml:space="preserve"> respectively.</w:t>
+      </w:r>
+    </w:p>
+    <w:p>
+      <w:pPr>
+        <w:pStyle w:val="equation"/>
+        <w:rPr>
+          <w:rFonts w:hint="eastAsia"/>
+        </w:rPr>
+      </w:pPr>
+      <w:r>
+        <w:tab/>
+      </w:r>
+      <w:r>
+        <w:rPr>
+          <w:rFonts w:ascii="Times New Roman" w:hAnsi="Times New Roman" w:cs="Times New Roman"/>
+          <w:i/>
+        </w:rPr>
+        <w:t xml:space="preserve">Cost = </w:t>
+      </w:r>
+      <w:r>
+        <w:rPr>
+          <w:rFonts w:ascii="Times New Roman" w:hAnsi="Times New Roman" w:cs="Times New Roman"/>
+          <w:i/>
+        </w:rPr>
+        <w:t>length×</w:t>
+      </w:r>
+      <w:r>
+        <w:rPr>
+          <w:rFonts w:ascii="Times New Roman" w:hAnsi="Times New Roman" w:cs="Times New Roman"/>
+          <w:i/>
+        </w:rPr>
+        <w:t>(1+α</w:t>
+      </w:r>
+      <w:r>
+        <w:rPr>
+          <w:rFonts w:ascii="Cambria Math" w:hAnsi="Cambria Math" w:cs="Cambria Math"/>
+          <w:i/>
+        </w:rPr>
+        <w:t>⋅</w:t>
+      </w:r>
+      <w:r>
+        <w:rPr>
+          <w:rFonts w:ascii="Times New Roman" w:hAnsi="Times New Roman" w:cs="Times New Roman"/>
+          <w:i/>
+        </w:rPr>
+        <w:t>PM2.5−β</w:t>
+      </w:r>
+      <w:r>
+        <w:rPr>
+          <w:rFonts w:ascii="Cambria Math" w:hAnsi="Cambria Math" w:cs="Cambria Math"/>
+          <w:i/>
+        </w:rPr>
+        <w:t>⋅</w:t>
+      </w:r>
+      <w:r>
+        <w:rPr>
+          <w:rFonts w:ascii="Times New Roman" w:hAnsi="Times New Roman" w:cs="Times New Roman"/>
+          <w:i/>
+        </w:rPr>
+        <w:t>NDVI)</w:t>
+      </w:r>
+      <w:r>
+        <w:tab/>
+      </w:r>
+      <w:r>
+        <w:t></w:t>
+      </w:r>
+      <w:r>
+        <w:t></w:t>
+      </w:r>
+      <w:r>
+        <w:t></w:t>
+      </w:r>
+    </w:p>
+    <w:p>
+      <w:pPr>
+        <w:pStyle w:val="BodyText"/>
+        <w:rPr>
+          <w:lang w:val="en-US"/>
+        </w:rPr>
+      </w:pPr>
+      <w:r>
+        <w:rPr>
+          <w:lang w:val="en-AE"/>
+        </w:rPr>
+        <w:t>w</w:t>
+      </w:r>
+      <w:r>
+        <w:rPr>
+          <w:lang w:val="en-US"/>
+        </w:rPr>
+        <w:t>here α and β are tunable weights for penalizing poor air quality and rewarding greenery, respectively.</w:t>
+      </w:r>
+    </w:p>
+    <w:p>
+      <w:pPr>
+        <w:pStyle w:val="BodyText"/>
+        <w:rPr>
+          <w:lang w:val="en-US"/>
+        </w:rPr>
+      </w:pPr>
+      <w:r>
+        <w:rPr>
+          <w:lang w:val="en-US"/>
+        </w:rPr>
+        <w:t>To determine optimal bike paths, the system connects the user-specified origin and destination to the nearest nodes in the network via virtual edges. Then, using Yen’s algorithm, the top-k shortest paths are extracted based on the computed cost. A penalty is applied to reused edges across iterations to encourage route diversity. For each path, average PM2.5 and NDVI values are computed, and the route with the lowest pollution and highest greenery score is selected as the recommended path. This environmentally informed selection approach balances travel distance with health and ecological considerations, enabling context-aware route planning.</w:t>
+      </w:r>
+    </w:p>
+    <w:p/>
+    <w:p/>
     <w:p>
       <w:pPr>
         <w:pStyle w:val="Heading2"/>
@@ -3260,6 +3664,10 @@
       <w:numPr>
         <w:numId w:val="1"/>
       </w:numPr>
+      <w:tabs>
+        <w:tab w:val="clear" w:pos="39.30pt"/>
+        <w:tab w:val="num" w:pos="32.40pt"/>
+      </w:tabs>
       <w:ind w:start="28.80pt" w:hanging="14.40pt"/>
     </w:pPr>
   </w:style>

</xml_diff>

<commit_message>
Editing LLM integration section - Methodology
</commit_message>
<xml_diff>
--- a/GeoBikeLLM Paper.docx
+++ b/GeoBikeLLM Paper.docx
@@ -924,18 +924,261 @@
       <w:r>
         <w:lastRenderedPageBreak/>
         <w:drawing>
-          <wp:anchor distT="0" distB="0" distL="114300" distR="114300" simplePos="0" relativeHeight="251661312" behindDoc="0" locked="0" layoutInCell="1" allowOverlap="1" wp14:anchorId="5D1D0A8B" wp14:editId="38290A80">
+          <wp:anchor distT="0" distB="0" distL="114300" distR="114300" simplePos="0" relativeHeight="251661312" behindDoc="0" locked="0" layoutInCell="1" allowOverlap="1" wp14:anchorId="6F6F9499" wp14:editId="01D447D0">
             <wp:simplePos x="0" y="0"/>
             <wp:positionH relativeFrom="column">
-              <wp:posOffset>3752850</wp:posOffset>
+              <wp:posOffset>3781498</wp:posOffset>
             </wp:positionH>
             <wp:positionV relativeFrom="paragraph">
-              <wp:posOffset>786765</wp:posOffset>
+              <wp:posOffset>790398</wp:posOffset>
+            </wp:positionV>
+            <wp:extent cx="2019300" cy="1746885"/>
+            <wp:effectExtent l="0" t="0" r="0" b="5715"/>
+            <wp:wrapTopAndBottom/>
+            <wp:docPr id="435129276" name="Picture 4" descr="A yellow and white text&#10;&#10;AI-generated content may be incorrect."/>
+            <wp:cNvGraphicFramePr>
+              <a:graphicFrameLocks xmlns:a="http://purl.oclc.org/ooxml/drawingml/main" noChangeAspect="1"/>
+            </wp:cNvGraphicFramePr>
+            <a:graphic xmlns:a="http://purl.oclc.org/ooxml/drawingml/main">
+              <a:graphicData uri="http://purl.oclc.org/ooxml/drawingml/picture">
+                <pic:pic xmlns:pic="http://purl.oclc.org/ooxml/drawingml/picture">
+                  <pic:nvPicPr>
+                    <pic:cNvPr id="435129276" name="Picture 4" descr="A yellow and white text&#10;&#10;AI-generated content may be incorrect."/>
+                    <pic:cNvPicPr/>
+                  </pic:nvPicPr>
+                  <pic:blipFill>
+                    <a:blip r:embed="rId8">
+                      <a:extLst>
+                        <a:ext uri="{28A0092B-C50C-407E-A947-70E740481C1C}">
+                          <a14:useLocalDpi xmlns:a14="http://schemas.microsoft.com/office/drawing/2010/main" val="0"/>
+                        </a:ext>
+                      </a:extLst>
+                    </a:blip>
+                    <a:stretch>
+                      <a:fillRect/>
+                    </a:stretch>
+                  </pic:blipFill>
+                  <pic:spPr>
+                    <a:xfrm>
+                      <a:off x="0" y="0"/>
+                      <a:ext cx="2019300" cy="1746885"/>
+                    </a:xfrm>
+                    <a:prstGeom prst="rect">
+                      <a:avLst/>
+                    </a:prstGeom>
+                  </pic:spPr>
+                </pic:pic>
+              </a:graphicData>
+            </a:graphic>
+          </wp:anchor>
+        </w:drawing>
+      </w:r>
+      <w:r>
+        <w:t>NDVI Dataset</w:t>
+      </w:r>
+      <w:r>
+        <w:t xml:space="preserve">: </w:t>
+      </w:r>
+      <w:r>
+        <w:rPr>
+          <w:i w:val="0"/>
+        </w:rPr>
+        <w:t>The NDVI dataset provides spatial measurements of vegetation health across Chicago. Each entry corresponds to a specific location defined by geographic coordinates and includes a</w:t>
+      </w:r>
+      <w:r>
+        <w:rPr>
+          <w:i w:val="0"/>
+        </w:rPr>
+        <w:t xml:space="preserve"> ‘</w:t>
+      </w:r>
+      <w:r>
+        <w:rPr>
+          <w:i w:val="0"/>
+        </w:rPr>
+        <w:t>grid_code</w:t>
+      </w:r>
+      <w:r>
+        <w:rPr>
+          <w:i w:val="0"/>
+        </w:rPr>
+        <w:t>’</w:t>
+      </w:r>
+      <w:r>
+        <w:rPr>
+          <w:i w:val="0"/>
+        </w:rPr>
+        <w:t xml:space="preserve"> representing the NDVI value. Higher NDVI scores indicate greener areas, making this dataset essential for assessing environmental quality and greenery exposure during routing.</w:t>
+      </w:r>
+    </w:p>
+    <w:p>
+      <w:pPr>
+        <w:pStyle w:val="Heading3"/>
+        <w:spacing w:after="6pt"/>
+        <w:ind w:firstLine="14.45pt"/>
+        <w:rPr>
+          <w:i w:val="0"/>
+        </w:rPr>
+      </w:pPr>
+      <w:r>
+        <w:t>Bicycle Network Dataset</w:t>
+      </w:r>
+      <w:r>
+        <w:t xml:space="preserve">: </w:t>
+      </w:r>
+      <w:r>
+        <w:rPr>
+          <w:i w:val="0"/>
+        </w:rPr>
+        <w:t>This dataset captures the spatial structure of the bicycle infrastructure in Chicago, derived from OpenStreetMap (OSM). It includes details on individual bike path segments, such as start and end coordinates, segment lengths, and geometry data. The dataset supports the construction of a navigable network for route computation between user-defined locations.</w:t>
+      </w:r>
+    </w:p>
+    <w:p>
+      <w:pPr>
+        <w:pStyle w:val="BodyText"/>
+        <w:rPr>
+          <w:lang w:val="en-US"/>
+        </w:rPr>
+      </w:pPr>
+      <w:r>
+        <w:rPr>
+          <w:lang w:val="en-US"/>
+        </w:rPr>
+        <w:t>These datasets collectively enable the integration of air quality and environmental context into the spatial decision-making process for bicycle routing.</w:t>
+      </w:r>
+    </w:p>
+    <w:p>
+      <w:pPr>
+        <w:pStyle w:val="Heading2"/>
+      </w:pPr>
+      <w:r>
+        <w:t>Path Selection Module</w:t>
+      </w:r>
+    </w:p>
+    <w:p>
+      <w:pPr>
+        <w:pStyle w:val="BodyText"/>
+        <w:rPr>
+          <w:lang w:val="en-US"/>
+        </w:rPr>
+      </w:pPr>
+      <w:r>
+        <w:rPr>
+          <w:lang w:val="en-US"/>
+        </w:rPr>
+        <w:t xml:space="preserve">The core of the route planning logic involves constructing a weighted undirected graph from the Chicago bike lane dataset. Each edge represents a bike segment with an associated length, while nodes correspond to geospatial coordinates. To account for environmental quality, air pollution data (PM2.5) and vegetation density (NDVI) are spatially matched to each segment using nearest-neighbor querying via KD-Trees. </w:t>
+      </w:r>
+      <w:r>
+        <w:rPr>
+          <w:lang w:val="en-US"/>
+        </w:rPr>
+        <w:t>The cost of each edge is computed as shown in (1), where α and β control the influence of PM2.5 and NDVI</w:t>
+      </w:r>
+      <w:r>
+        <w:rPr>
+          <w:lang w:val="en-US"/>
+        </w:rPr>
+        <w:t>,</w:t>
+      </w:r>
+      <w:r>
+        <w:rPr>
+          <w:lang w:val="en-US"/>
+        </w:rPr>
+        <w:t xml:space="preserve"> respectively.</w:t>
+      </w:r>
+    </w:p>
+    <w:p>
+      <w:pPr>
+        <w:pStyle w:val="equation"/>
+        <w:rPr>
+          <w:rFonts w:hint="eastAsia"/>
+        </w:rPr>
+      </w:pPr>
+      <w:r>
+        <w:tab/>
+      </w:r>
+      <w:r>
+        <w:rPr>
+          <w:rFonts w:ascii="Times New Roman" w:hAnsi="Times New Roman" w:cs="Times New Roman"/>
+          <w:i/>
+        </w:rPr>
+        <w:t xml:space="preserve">Cost = </w:t>
+      </w:r>
+      <w:r>
+        <w:rPr>
+          <w:rFonts w:ascii="Times New Roman" w:hAnsi="Times New Roman" w:cs="Times New Roman"/>
+          <w:i/>
+        </w:rPr>
+        <w:t>length×</w:t>
+      </w:r>
+      <w:r>
+        <w:rPr>
+          <w:rFonts w:ascii="Times New Roman" w:hAnsi="Times New Roman" w:cs="Times New Roman"/>
+          <w:i/>
+        </w:rPr>
+        <w:t>(1+α</w:t>
+      </w:r>
+      <w:r>
+        <w:rPr>
+          <w:rFonts w:ascii="Cambria Math" w:hAnsi="Cambria Math" w:cs="Cambria Math"/>
+          <w:i/>
+        </w:rPr>
+        <w:t>⋅</w:t>
+      </w:r>
+      <w:r>
+        <w:rPr>
+          <w:rFonts w:ascii="Times New Roman" w:hAnsi="Times New Roman" w:cs="Times New Roman"/>
+          <w:i/>
+        </w:rPr>
+        <w:t>PM2.5−β</w:t>
+      </w:r>
+      <w:r>
+        <w:rPr>
+          <w:rFonts w:ascii="Cambria Math" w:hAnsi="Cambria Math" w:cs="Cambria Math"/>
+          <w:i/>
+        </w:rPr>
+        <w:t>⋅</w:t>
+      </w:r>
+      <w:r>
+        <w:rPr>
+          <w:rFonts w:ascii="Times New Roman" w:hAnsi="Times New Roman" w:cs="Times New Roman"/>
+          <w:i/>
+        </w:rPr>
+        <w:t>NDVI)</w:t>
+      </w:r>
+      <w:r>
+        <w:tab/>
+      </w:r>
+      <w:r>
+        <w:t></w:t>
+      </w:r>
+      <w:r>
+        <w:t></w:t>
+      </w:r>
+      <w:r>
+        <w:t></w:t>
+      </w:r>
+    </w:p>
+    <w:p>
+      <w:pPr>
+        <w:pStyle w:val="BodyText"/>
+        <w:rPr>
+          <w:lang w:val="en-US"/>
+        </w:rPr>
+      </w:pPr>
+      <w:r>
+        <w:drawing>
+          <wp:anchor distT="0" distB="0" distL="114300" distR="114300" simplePos="0" relativeHeight="251659264" behindDoc="0" locked="0" layoutInCell="1" allowOverlap="1" wp14:anchorId="4D139A7F" wp14:editId="1BF50330">
+            <wp:simplePos x="0" y="0"/>
+            <wp:positionH relativeFrom="column">
+              <wp:posOffset>3804719</wp:posOffset>
+            </wp:positionH>
+            <wp:positionV relativeFrom="paragraph">
+              <wp:posOffset>226326</wp:posOffset>
             </wp:positionV>
             <wp:extent cx="2132330" cy="1392555"/>
             <wp:effectExtent l="0" t="0" r="1270" b="0"/>
             <wp:wrapTopAndBottom/>
-            <wp:docPr id="203715878" name="Picture 3" descr="A screenshot of a computer code&#10;&#10;AI-generated content may be incorrect."/>
+            <wp:docPr id="502207992" name="Picture 3" descr="A screenshot of a computer code&#10;&#10;AI-generated content may be incorrect."/>
             <wp:cNvGraphicFramePr>
               <a:graphicFrameLocks xmlns:a="http://purl.oclc.org/ooxml/drawingml/main" noChangeAspect="1"/>
             </wp:cNvGraphicFramePr>
@@ -947,7 +1190,7 @@
                     <pic:cNvPicPr/>
                   </pic:nvPicPr>
                   <pic:blipFill>
-                    <a:blip r:embed="rId8">
+                    <a:blip r:embed="rId9">
                       <a:extLst>
                         <a:ext uri="{28A0092B-C50C-407E-A947-70E740481C1C}">
                           <a14:useLocalDpi xmlns:a14="http://schemas.microsoft.com/office/drawing/2010/main" val="0"/>
@@ -974,249 +1217,6 @@
         </w:drawing>
       </w:r>
       <w:r>
-        <w:t>NDVI Dataset</w:t>
-      </w:r>
-      <w:r>
-        <w:t xml:space="preserve">: </w:t>
-      </w:r>
-      <w:r>
-        <w:rPr>
-          <w:i w:val="0"/>
-        </w:rPr>
-        <w:t>The NDVI dataset provides spatial measurements of vegetation health across Chicago. Each entry corresponds to a specific location defined by geographic coordinates and includes a</w:t>
-      </w:r>
-      <w:r>
-        <w:rPr>
-          <w:i w:val="0"/>
-        </w:rPr>
-        <w:t xml:space="preserve"> ‘</w:t>
-      </w:r>
-      <w:r>
-        <w:rPr>
-          <w:i w:val="0"/>
-        </w:rPr>
-        <w:t>grid_code</w:t>
-      </w:r>
-      <w:r>
-        <w:rPr>
-          <w:i w:val="0"/>
-        </w:rPr>
-        <w:t>’</w:t>
-      </w:r>
-      <w:r>
-        <w:rPr>
-          <w:i w:val="0"/>
-        </w:rPr>
-        <w:t xml:space="preserve"> representing the NDVI value. Higher NDVI scores indicate greener areas, making this dataset essential for assessing environmental quality and greenery exposure during routing.</w:t>
-      </w:r>
-    </w:p>
-    <w:p>
-      <w:pPr>
-        <w:pStyle w:val="Heading3"/>
-        <w:spacing w:after="6pt"/>
-        <w:ind w:firstLine="14.45pt"/>
-        <w:rPr>
-          <w:i w:val="0"/>
-        </w:rPr>
-      </w:pPr>
-      <w:r>
-        <w:t>Bicycle Network Dataset</w:t>
-      </w:r>
-      <w:r>
-        <w:t xml:space="preserve">: </w:t>
-      </w:r>
-      <w:r>
-        <w:rPr>
-          <w:i w:val="0"/>
-        </w:rPr>
-        <w:t>This dataset captures the spatial structure of the bicycle infrastructure in Chicago, derived from OpenStreetMap (OSM). It includes details on individual bike path segments, such as start and end coordinates, segment lengths, and geometry data. The dataset supports the construction of a navigable network for route computation between user-defined locations.</w:t>
-      </w:r>
-    </w:p>
-    <w:p>
-      <w:pPr>
-        <w:pStyle w:val="BodyText"/>
-        <w:rPr>
-          <w:lang w:val="en-US"/>
-        </w:rPr>
-      </w:pPr>
-      <w:r>
-        <w:rPr>
-          <w:lang w:val="en-US"/>
-        </w:rPr>
-        <w:t>These datasets collectively enable the integration of air quality and environmental context into the spatial decision-making process for bicycle routing.</w:t>
-      </w:r>
-    </w:p>
-    <w:p>
-      <w:pPr>
-        <w:pStyle w:val="Heading2"/>
-      </w:pPr>
-      <w:r>
-        <w:drawing>
-          <wp:anchor distT="0" distB="0" distL="114300" distR="114300" simplePos="0" relativeHeight="251659264" behindDoc="0" locked="0" layoutInCell="1" allowOverlap="1" wp14:anchorId="4D139A7F" wp14:editId="3DE2FF32">
-            <wp:simplePos x="0" y="0"/>
-            <wp:positionH relativeFrom="column">
-              <wp:posOffset>3769360</wp:posOffset>
-            </wp:positionH>
-            <wp:positionV relativeFrom="paragraph">
-              <wp:posOffset>238125</wp:posOffset>
-            </wp:positionV>
-            <wp:extent cx="2132330" cy="1392555"/>
-            <wp:effectExtent l="0" t="0" r="1270" b="0"/>
-            <wp:wrapTopAndBottom/>
-            <wp:docPr id="502207992" name="Picture 3" descr="A screenshot of a computer code&#10;&#10;AI-generated content may be incorrect."/>
-            <wp:cNvGraphicFramePr>
-              <a:graphicFrameLocks xmlns:a="http://purl.oclc.org/ooxml/drawingml/main" noChangeAspect="1"/>
-            </wp:cNvGraphicFramePr>
-            <a:graphic xmlns:a="http://purl.oclc.org/ooxml/drawingml/main">
-              <a:graphicData uri="http://purl.oclc.org/ooxml/drawingml/picture">
-                <pic:pic xmlns:pic="http://purl.oclc.org/ooxml/drawingml/picture">
-                  <pic:nvPicPr>
-                    <pic:cNvPr id="502207992" name="Picture 3" descr="A screenshot of a computer code&#10;&#10;AI-generated content may be incorrect."/>
-                    <pic:cNvPicPr/>
-                  </pic:nvPicPr>
-                  <pic:blipFill>
-                    <a:blip r:embed="rId8">
-                      <a:extLst>
-                        <a:ext uri="{28A0092B-C50C-407E-A947-70E740481C1C}">
-                          <a14:useLocalDpi xmlns:a14="http://schemas.microsoft.com/office/drawing/2010/main" val="0"/>
-                        </a:ext>
-                      </a:extLst>
-                    </a:blip>
-                    <a:stretch>
-                      <a:fillRect/>
-                    </a:stretch>
-                  </pic:blipFill>
-                  <pic:spPr>
-                    <a:xfrm>
-                      <a:off x="0" y="0"/>
-                      <a:ext cx="2132330" cy="1392555"/>
-                    </a:xfrm>
-                    <a:prstGeom prst="rect">
-                      <a:avLst/>
-                    </a:prstGeom>
-                  </pic:spPr>
-                </pic:pic>
-              </a:graphicData>
-            </a:graphic>
-          </wp:anchor>
-        </w:drawing>
-      </w:r>
-      <w:r>
-        <w:t>Path Selection Module</w:t>
-      </w:r>
-    </w:p>
-    <w:p>
-      <w:pPr>
-        <w:pStyle w:val="BodyText"/>
-        <w:rPr>
-          <w:lang w:val="en-US"/>
-        </w:rPr>
-      </w:pPr>
-      <w:r>
-        <w:rPr>
-          <w:lang w:val="en-US"/>
-        </w:rPr>
-        <w:t xml:space="preserve">The core of the route planning logic involves constructing a weighted undirected graph from the Chicago bike lane dataset. Each edge represents a bike segment with an associated length, while nodes correspond to geospatial coordinates. To account for environmental quality, air pollution data (PM2.5) and vegetation density (NDVI) are spatially matched to each segment using nearest-neighbor querying via KD-Trees. </w:t>
-      </w:r>
-      <w:r>
-        <w:rPr>
-          <w:lang w:val="en-US"/>
-        </w:rPr>
-        <w:t>The cost of each edge is computed as shown in (1), where α and β control the influence of PM2.5 and NDVI</w:t>
-      </w:r>
-      <w:r>
-        <w:rPr>
-          <w:lang w:val="en-US"/>
-        </w:rPr>
-        <w:t>,</w:t>
-      </w:r>
-      <w:r>
-        <w:rPr>
-          <w:lang w:val="en-US"/>
-        </w:rPr>
-        <w:t xml:space="preserve"> respectively.</w:t>
-      </w:r>
-    </w:p>
-    <w:p>
-      <w:pPr>
-        <w:pStyle w:val="equation"/>
-        <w:rPr>
-          <w:rFonts w:hint="eastAsia"/>
-        </w:rPr>
-      </w:pPr>
-      <w:r>
-        <w:tab/>
-      </w:r>
-      <w:r>
-        <w:rPr>
-          <w:rFonts w:ascii="Times New Roman" w:hAnsi="Times New Roman" w:cs="Times New Roman"/>
-          <w:i/>
-        </w:rPr>
-        <w:t xml:space="preserve">Cost = </w:t>
-      </w:r>
-      <w:r>
-        <w:rPr>
-          <w:rFonts w:ascii="Times New Roman" w:hAnsi="Times New Roman" w:cs="Times New Roman"/>
-          <w:i/>
-        </w:rPr>
-        <w:t>length×</w:t>
-      </w:r>
-      <w:r>
-        <w:rPr>
-          <w:rFonts w:ascii="Times New Roman" w:hAnsi="Times New Roman" w:cs="Times New Roman"/>
-          <w:i/>
-        </w:rPr>
-        <w:t>(1+α</w:t>
-      </w:r>
-      <w:r>
-        <w:rPr>
-          <w:rFonts w:ascii="Cambria Math" w:hAnsi="Cambria Math" w:cs="Cambria Math"/>
-          <w:i/>
-        </w:rPr>
-        <w:t>⋅</w:t>
-      </w:r>
-      <w:r>
-        <w:rPr>
-          <w:rFonts w:ascii="Times New Roman" w:hAnsi="Times New Roman" w:cs="Times New Roman"/>
-          <w:i/>
-        </w:rPr>
-        <w:t>PM2.5−β</w:t>
-      </w:r>
-      <w:r>
-        <w:rPr>
-          <w:rFonts w:ascii="Cambria Math" w:hAnsi="Cambria Math" w:cs="Cambria Math"/>
-          <w:i/>
-        </w:rPr>
-        <w:t>⋅</w:t>
-      </w:r>
-      <w:r>
-        <w:rPr>
-          <w:rFonts w:ascii="Times New Roman" w:hAnsi="Times New Roman" w:cs="Times New Roman"/>
-          <w:i/>
-        </w:rPr>
-        <w:t>NDVI)</w:t>
-      </w:r>
-      <w:r>
-        <w:tab/>
-      </w:r>
-      <w:r>
-        <w:t></w:t>
-      </w:r>
-      <w:r>
-        <w:t></w:t>
-      </w:r>
-      <w:r>
-        <w:t></w:t>
-      </w:r>
-    </w:p>
-    <w:p>
-      <w:pPr>
-        <w:pStyle w:val="BodyText"/>
-        <w:rPr>
-          <w:lang w:val="en-US"/>
-        </w:rPr>
-      </w:pPr>
-      <w:r>
         <w:rPr>
           <w:lang w:val="en-AE"/>
         </w:rPr>
@@ -1415,6 +1415,7 @@
         <w:pStyle w:val="Heading2"/>
       </w:pPr>
       <w:r>
+        <w:lastRenderedPageBreak/>
         <w:t>Overall System</w:t>
       </w:r>
     </w:p>
@@ -1476,28 +1477,7 @@
         <w:rPr>
           <w:lang w:val="en-AE"/>
         </w:rPr>
-        <w:t xml:space="preserve"> quality and green areas. This best path is shown in light green on the map. It is </w:t>
-      </w:r>
-      <w:r>
-        <w:rPr>
-          <w:lang w:val="en-AE"/>
-        </w:rPr>
-        <w:lastRenderedPageBreak/>
-        <w:t xml:space="preserve">about 37.36 </w:t>
-      </w:r>
-      <w:proofErr w:type="spellStart"/>
-      <w:r>
-        <w:rPr>
-          <w:lang w:val="en-AE"/>
-        </w:rPr>
-        <w:t>kilometers</w:t>
-      </w:r>
-      <w:proofErr w:type="spellEnd"/>
-      <w:r>
-        <w:rPr>
-          <w:lang w:val="en-AE"/>
-        </w:rPr>
-        <w:t xml:space="preserve"> long, with low air pollution (PM2.5 = 6.42) and good greenery (NDVI = 0.10). The system chose this route because it is the cleanest and greenest among the options</w:t>
+        <w:t xml:space="preserve"> quality and green areas. This best path is shown in light green on the map. It is about 37.36 kilometers long, with low air pollution (PM2.5 = 6.42) and good greenery (NDVI = 0.10). The system chose this route because it is the cleanest and greenest among the options</w:t>
       </w:r>
       <w:r>
         <w:t>. It used Yen’s K-shortest paths algorithm, which finds several different route options between the two locations, and then selects the one with the lowest average air pollution and the highest green coverage based on data from PM2.5 sensors and NDVI readings.</w:t>
@@ -1512,6 +1492,9 @@
     <w:p/>
     <w:p>
       <w:r>
+        <w:rPr>
+          <w:noProof/>
+        </w:rPr>
         <w:drawing>
           <wp:inline distT="0" distB="0" distL="0" distR="0" wp14:anchorId="2BF573D8" wp14:editId="2D804983">
             <wp:extent cx="3089910" cy="463178"/>
@@ -1528,7 +1511,7 @@
                     <pic:cNvPicPr/>
                   </pic:nvPicPr>
                   <pic:blipFill>
-                    <a:blip r:embed="rId9"/>
+                    <a:blip r:embed="rId10"/>
                     <a:stretch>
                       <a:fillRect/>
                     </a:stretch>
@@ -1551,6 +1534,9 @@
     </w:p>
     <w:p>
       <w:r>
+        <w:rPr>
+          <w:noProof/>
+        </w:rPr>
         <w:drawing>
           <wp:inline distT="0" distB="0" distL="0" distR="0" wp14:anchorId="7211510B" wp14:editId="64D385E7">
             <wp:extent cx="3089910" cy="2348414"/>
@@ -1567,7 +1553,7 @@
                     <pic:cNvPicPr/>
                   </pic:nvPicPr>
                   <pic:blipFill>
-                    <a:blip r:embed="rId10"/>
+                    <a:blip r:embed="rId11"/>
                     <a:stretch>
                       <a:fillRect/>
                     </a:stretch>

</xml_diff>

<commit_message>
update llm integration section
</commit_message>
<xml_diff>
--- a/GeoBikeLLM Paper.docx
+++ b/GeoBikeLLM Paper.docx
@@ -350,39 +350,30 @@
       <w:r>
         <w:t>Keywords—</w:t>
       </w:r>
-      <w:proofErr w:type="gramStart"/>
       <w:r>
         <w:t xml:space="preserve">Geospatial </w:t>
       </w:r>
       <w:r>
         <w:t>,</w:t>
       </w:r>
-      <w:proofErr w:type="gramEnd"/>
       <w:r>
         <w:t xml:space="preserve"> </w:t>
       </w:r>
-      <w:proofErr w:type="gramStart"/>
       <w:r>
         <w:t xml:space="preserve">LLM </w:t>
       </w:r>
       <w:r>
         <w:t>,</w:t>
       </w:r>
-      <w:proofErr w:type="gramEnd"/>
       <w:r>
         <w:t xml:space="preserve"> </w:t>
       </w:r>
       <w:r>
-        <w:t xml:space="preserve">Air </w:t>
-      </w:r>
-      <w:proofErr w:type="gramStart"/>
-      <w:r>
-        <w:t xml:space="preserve">Quality </w:t>
+        <w:t xml:space="preserve">Air Quality </w:t>
       </w:r>
       <w:r>
         <w:t>,</w:t>
       </w:r>
-      <w:proofErr w:type="gramEnd"/>
       <w:r>
         <w:t xml:space="preserve"> </w:t>
       </w:r>
@@ -431,52 +422,24 @@
         <w:rPr>
           <w:lang w:val="en-US"/>
         </w:rPr>
-        <w:t xml:space="preserve">Recent advancements in </w:t>
-      </w:r>
-      <w:proofErr w:type="spellStart"/>
+        <w:t xml:space="preserve">Recent advancements in GeoAI and LLM research have enabled natural language interfaces for querying and interpreting geospatial data. Studies have explored both LLM-augmented spatial querying and multimodal systems integrating maps, satellite imagery, and text for environmental reasoning. This section reviews existing approaches and highlights the gap </w:t>
+      </w:r>
       <w:r>
         <w:rPr>
           <w:lang w:val="en-US"/>
         </w:rPr>
-        <w:t>GeoAI</w:t>
-      </w:r>
-      <w:proofErr w:type="spellEnd"/>
+        <w:t xml:space="preserve">that </w:t>
+      </w:r>
       <w:r>
         <w:rPr>
           <w:lang w:val="en-US"/>
         </w:rPr>
-        <w:t xml:space="preserve"> and LLM research have enabled natural language interfaces for querying and interpreting geospatial data. Studies have explored both LLM-augmented spatial querying and multimodal systems integrating maps, satellite imagery, and text for environmental reasoning. This section reviews existing approaches and highlights the gap </w:t>
+        <w:t>our proposed GeoBikeLLM system aims to fill.</w:t>
       </w:r>
       <w:r>
         <w:rPr>
           <w:lang w:val="en-US"/>
         </w:rPr>
-        <w:t xml:space="preserve">that </w:t>
-      </w:r>
-      <w:r>
-        <w:rPr>
-          <w:lang w:val="en-US"/>
-        </w:rPr>
-        <w:t xml:space="preserve">our proposed </w:t>
-      </w:r>
-      <w:proofErr w:type="spellStart"/>
-      <w:r>
-        <w:rPr>
-          <w:lang w:val="en-US"/>
-        </w:rPr>
-        <w:t>GeoBikeLLM</w:t>
-      </w:r>
-      <w:proofErr w:type="spellEnd"/>
-      <w:r>
-        <w:rPr>
-          <w:lang w:val="en-US"/>
-        </w:rPr>
-        <w:t xml:space="preserve"> system aims to fill.</w:t>
-      </w:r>
-      <w:r>
-        <w:rPr>
-          <w:lang w:val="en-US"/>
-        </w:rPr>
         <w:t xml:space="preserve"> </w:t>
       </w:r>
     </w:p>
@@ -499,119 +462,7 @@
         <w:rPr>
           <w:lang w:val="en-AE"/>
         </w:rPr>
-        <w:t xml:space="preserve">Recent research has focused on enhancing geospatial data accessibility through natural language interfaces powered by large language models (LLMs). Systems like </w:t>
-      </w:r>
-      <w:proofErr w:type="spellStart"/>
-      <w:r>
-        <w:rPr>
-          <w:lang w:val="en-AE"/>
-        </w:rPr>
-        <w:t>ChatGeoAI</w:t>
-      </w:r>
-      <w:proofErr w:type="spellEnd"/>
-      <w:r>
-        <w:rPr>
-          <w:lang w:val="en-AE"/>
-        </w:rPr>
-        <w:t xml:space="preserve"> by Mansourian and </w:t>
-      </w:r>
-      <w:proofErr w:type="spellStart"/>
-      <w:r>
-        <w:rPr>
-          <w:lang w:val="en-AE"/>
-        </w:rPr>
-        <w:t>Oucheikh</w:t>
-      </w:r>
-      <w:proofErr w:type="spellEnd"/>
-      <w:r>
-        <w:rPr>
-          <w:lang w:val="en-AE"/>
-        </w:rPr>
-        <w:t xml:space="preserve"> [1] and the SQL-generation framework by Jiang and Yang [2] enable users to perform GIS tasks or query spatial databases using natural language. </w:t>
-      </w:r>
-      <w:proofErr w:type="spellStart"/>
-      <w:r>
-        <w:rPr>
-          <w:lang w:val="en-AE"/>
-        </w:rPr>
-        <w:t>ChatGeoAI</w:t>
-      </w:r>
-      <w:proofErr w:type="spellEnd"/>
-      <w:r>
-        <w:rPr>
-          <w:lang w:val="en-AE"/>
-        </w:rPr>
-        <w:t xml:space="preserve"> employs LLaMA-2 to convert queries into executable </w:t>
-      </w:r>
-      <w:proofErr w:type="spellStart"/>
-      <w:r>
-        <w:rPr>
-          <w:lang w:val="en-AE"/>
-        </w:rPr>
-        <w:t>PyQGIS</w:t>
-      </w:r>
-      <w:proofErr w:type="spellEnd"/>
-      <w:r>
-        <w:rPr>
-          <w:lang w:val="en-AE"/>
-        </w:rPr>
-        <w:t xml:space="preserve"> scripts, while Jiang and Yang use ChatGPT to generate </w:t>
-      </w:r>
-      <w:proofErr w:type="spellStart"/>
-      <w:r>
-        <w:rPr>
-          <w:lang w:val="en-AE"/>
-        </w:rPr>
-        <w:t>PostGIS</w:t>
-      </w:r>
-      <w:proofErr w:type="spellEnd"/>
-      <w:r>
-        <w:rPr>
-          <w:lang w:val="en-AE"/>
-        </w:rPr>
-        <w:t>-compatible SQL. Text-to-</w:t>
-      </w:r>
-      <w:proofErr w:type="spellStart"/>
-      <w:r>
-        <w:rPr>
-          <w:lang w:val="en-AE"/>
-        </w:rPr>
-        <w:t>OverpassQL</w:t>
-      </w:r>
-      <w:proofErr w:type="spellEnd"/>
-      <w:r>
-        <w:rPr>
-          <w:lang w:val="en-AE"/>
-        </w:rPr>
-        <w:t xml:space="preserve"> by </w:t>
-      </w:r>
-      <w:proofErr w:type="spellStart"/>
-      <w:r>
-        <w:rPr>
-          <w:lang w:val="en-AE"/>
-        </w:rPr>
-        <w:t>Staniek</w:t>
-      </w:r>
-      <w:proofErr w:type="spellEnd"/>
-      <w:r>
-        <w:rPr>
-          <w:lang w:val="en-AE"/>
-        </w:rPr>
-        <w:t xml:space="preserve"> et al. [3] further advances this by translating natural language into </w:t>
-      </w:r>
-      <w:proofErr w:type="spellStart"/>
-      <w:r>
-        <w:rPr>
-          <w:lang w:val="en-AE"/>
-        </w:rPr>
-        <w:t>OverpassQL</w:t>
-      </w:r>
-      <w:proofErr w:type="spellEnd"/>
-      <w:r>
-        <w:rPr>
-          <w:lang w:val="en-AE"/>
-        </w:rPr>
-        <w:t xml:space="preserve"> queries for OpenStreetMap, democratizing access to structured geodata.</w:t>
+        <w:t>Recent research has focused on enhancing geospatial data accessibility through natural language interfaces powered by large language models (LLMs). Systems like ChatGeoAI by Mansourian and Oucheikh [1] and the SQL-generation framework by Jiang and Yang [2] enable users to perform GIS tasks or query spatial databases using natural language. ChatGeoAI employs LLaMA-2 to convert queries into executable PyQGIS scripts, while Jiang and Yang use ChatGPT to generate PostGIS-compatible SQL. Text-to-OverpassQL by Staniek et al. [3] further advances this by translating natural language into OverpassQL queries for OpenStreetMap, democratizing access to structured geodata.</w:t>
       </w:r>
     </w:p>
     <w:p>
@@ -632,49 +483,7 @@
         <w:rPr>
           <w:lang w:val="en-AE"/>
         </w:rPr>
-        <w:t xml:space="preserve">Other studies investigate how LLMs can interpret or extract geographic knowledge. </w:t>
-      </w:r>
-      <w:proofErr w:type="spellStart"/>
-      <w:r>
-        <w:rPr>
-          <w:lang w:val="en-AE"/>
-        </w:rPr>
-        <w:t>GeoQAMap</w:t>
-      </w:r>
-      <w:proofErr w:type="spellEnd"/>
-      <w:r>
-        <w:rPr>
-          <w:lang w:val="en-AE"/>
-        </w:rPr>
-        <w:t xml:space="preserve"> by Feng et al. [4] utilizes GPT-3.5 and </w:t>
-      </w:r>
-      <w:proofErr w:type="spellStart"/>
-      <w:r>
-        <w:rPr>
-          <w:lang w:val="en-AE"/>
-        </w:rPr>
-        <w:t>Wikidata</w:t>
-      </w:r>
-      <w:proofErr w:type="spellEnd"/>
-      <w:r>
-        <w:rPr>
-          <w:lang w:val="en-AE"/>
-        </w:rPr>
-        <w:t xml:space="preserve"> to answer geographic questions and visualize answers on maps. </w:t>
-      </w:r>
-      <w:proofErr w:type="spellStart"/>
-      <w:r>
-        <w:rPr>
-          <w:lang w:val="en-AE"/>
-        </w:rPr>
-        <w:t>GeoAgent</w:t>
-      </w:r>
-      <w:proofErr w:type="spellEnd"/>
-      <w:r>
-        <w:rPr>
-          <w:lang w:val="en-AE"/>
-        </w:rPr>
-        <w:t xml:space="preserve"> by Huang et al. [5] focuses on address standardization using ChatGLM-6B, showing how LLMs can resolve ambiguous and incomplete geospatial texts. Meanwhile, Bhandari et al. [6] evaluate whether large language models are geospatially knowledgeable, revealing that while some geospatial knowledge exists in pretrained models, it is often imprecise.</w:t>
+        <w:t>Other studies investigate how LLMs can interpret or extract geographic knowledge. GeoQAMap by Feng et al. [4] utilizes GPT-3.5 and Wikidata to answer geographic questions and visualize answers on maps. GeoAgent by Huang et al. [5] focuses on address standardization using ChatGLM-6B, showing how LLMs can resolve ambiguous and incomplete geospatial texts. Meanwhile, Bhandari et al. [6] evaluate whether large language models are geospatially knowledgeable, revealing that while some geospatial knowledge exists in pretrained models, it is often imprecise.</w:t>
       </w:r>
     </w:p>
     <w:p>
@@ -688,35 +497,7 @@
         <w:rPr>
           <w:lang w:val="en-AE"/>
         </w:rPr>
-        <w:t>To overcome these limitations, domain-adapted models have emerged. BB-</w:t>
-      </w:r>
-      <w:proofErr w:type="spellStart"/>
-      <w:r>
-        <w:rPr>
-          <w:lang w:val="en-AE"/>
-        </w:rPr>
-        <w:t>GeoGPT</w:t>
-      </w:r>
-      <w:proofErr w:type="spellEnd"/>
-      <w:r>
-        <w:rPr>
-          <w:lang w:val="en-AE"/>
-        </w:rPr>
-        <w:t xml:space="preserve"> by Zhang et al. [7] is a fine-tuned LLaMA-2 model trained on GIS texts and Q&amp;A pairs, outperforming general LLMs in spatial queries. Similarly, </w:t>
-      </w:r>
-      <w:proofErr w:type="spellStart"/>
-      <w:r>
-        <w:rPr>
-          <w:lang w:val="en-AE"/>
-        </w:rPr>
-        <w:t>GeoLLM</w:t>
-      </w:r>
-      <w:proofErr w:type="spellEnd"/>
-      <w:r>
-        <w:rPr>
-          <w:lang w:val="en-AE"/>
-        </w:rPr>
-        <w:t xml:space="preserve"> by Shah et al. [8] boosts geospatial prediction accuracy by embedding map-based contextual data into prompts. These efforts establish the foundation for natural language interaction with spatial systems but stop short of performing complex geospatial planning or optimization.</w:t>
+        <w:t>To overcome these limitations, domain-adapted models have emerged. BB-GeoGPT by Zhang et al. [7] is a fine-tuned LLaMA-2 model trained on GIS texts and Q&amp;A pairs, outperforming general LLMs in spatial queries. Similarly, GeoLLM by Shah et al. [8] boosts geospatial prediction accuracy by embedding map-based contextual data into prompts. These efforts establish the foundation for natural language interaction with spatial systems but stop short of performing complex geospatial planning or optimization.</w:t>
       </w:r>
     </w:p>
     <w:p>
@@ -749,49 +530,7 @@
         <w:rPr>
           <w:lang w:val="en-AE"/>
         </w:rPr>
-        <w:t xml:space="preserve">Advancements in </w:t>
-      </w:r>
-      <w:proofErr w:type="spellStart"/>
-      <w:r>
-        <w:rPr>
-          <w:lang w:val="en-AE"/>
-        </w:rPr>
-        <w:t>GeoAI</w:t>
-      </w:r>
-      <w:proofErr w:type="spellEnd"/>
-      <w:r>
-        <w:rPr>
-          <w:lang w:val="en-AE"/>
-        </w:rPr>
-        <w:t xml:space="preserve"> have expanded to multimodal systems integrating LLMs with visual and structured geospatial data. </w:t>
-      </w:r>
-      <w:proofErr w:type="spellStart"/>
-      <w:r>
-        <w:rPr>
-          <w:lang w:val="en-AE"/>
-        </w:rPr>
-        <w:t>OmniGeo</w:t>
-      </w:r>
-      <w:proofErr w:type="spellEnd"/>
-      <w:r>
-        <w:rPr>
-          <w:lang w:val="en-AE"/>
-        </w:rPr>
-        <w:t xml:space="preserve"> by Yuan et al. [9] exemplifies this trend by combining satellite imagery, map layers, and text data, enabling LLMs to perform diverse tasks such as land use classification and environmental forecasting. Geode by Wu et al. [10] and </w:t>
-      </w:r>
-      <w:proofErr w:type="spellStart"/>
-      <w:r>
-        <w:rPr>
-          <w:lang w:val="en-AE"/>
-        </w:rPr>
-        <w:t>GTChain</w:t>
-      </w:r>
-      <w:proofErr w:type="spellEnd"/>
-      <w:r>
-        <w:rPr>
-          <w:lang w:val="en-AE"/>
-        </w:rPr>
-        <w:t xml:space="preserve"> by Zhang et al. [11] extend LLMs into autonomous agents, coordinating APIs, GIS tools, and real-time databases to solve spatial tasks.</w:t>
+        <w:t>Advancements in GeoAI have expanded to multimodal systems integrating LLMs with visual and structured geospatial data. OmniGeo by Yuan et al. [9] exemplifies this trend by combining satellite imagery, map layers, and text data, enabling LLMs to perform diverse tasks such as land use classification and environmental forecasting. Geode by Wu et al. [10] and GTChain by Zhang et al. [11] extend LLMs into autonomous agents, coordinating APIs, GIS tools, and real-time databases to solve spatial tasks.</w:t>
       </w:r>
     </w:p>
     <w:p>
@@ -812,21 +551,7 @@
         <w:rPr>
           <w:lang w:val="en-AE"/>
         </w:rPr>
-        <w:t xml:space="preserve">These systems demonstrate the potential of LLMs in spatial reasoning, data retrieval, and geospatial tool orchestration. Geode performs zero-shot geospatial Q&amp;A with explicit reasoning and live data, while </w:t>
-      </w:r>
-      <w:proofErr w:type="spellStart"/>
-      <w:r>
-        <w:rPr>
-          <w:lang w:val="en-AE"/>
-        </w:rPr>
-        <w:t>GTChain</w:t>
-      </w:r>
-      <w:proofErr w:type="spellEnd"/>
-      <w:r>
-        <w:rPr>
-          <w:lang w:val="en-AE"/>
-        </w:rPr>
-        <w:t xml:space="preserve"> trains LLMs to generate tool-use chains for complex tasks in simulated GIS environments. The autonomous GIS agent by Ning et al. [12] also showcases how LLMs can be used to dynamically retrieve data across diverse spatial datasets, enhancing spatial decision-making workflows.</w:t>
+        <w:t>These systems demonstrate the potential of LLMs in spatial reasoning, data retrieval, and geospatial tool orchestration. Geode performs zero-shot geospatial Q&amp;A with explicit reasoning and live data, while GTChain trains LLMs to generate tool-use chains for complex tasks in simulated GIS environments. The autonomous GIS agent by Ning et al. [12] also showcases how LLMs can be used to dynamically retrieve data across diverse spatial datasets, enhancing spatial decision-making workflows.</w:t>
       </w:r>
     </w:p>
     <w:p>
@@ -840,21 +565,7 @@
         <w:rPr>
           <w:lang w:val="en-AE"/>
         </w:rPr>
-        <w:t xml:space="preserve">Despite these advancements, existing solutions lack targeted support for personalized route planning or environmental criteria integration. None of the reviewed systems directly tackle bicycle routing that adapts to vegetation or pollution levels. Our proposed </w:t>
-      </w:r>
-      <w:proofErr w:type="spellStart"/>
-      <w:r>
-        <w:rPr>
-          <w:lang w:val="en-AE"/>
-        </w:rPr>
-        <w:t>GeoBikeLLM</w:t>
-      </w:r>
-      <w:proofErr w:type="spellEnd"/>
-      <w:r>
-        <w:rPr>
-          <w:lang w:val="en-AE"/>
-        </w:rPr>
-        <w:t xml:space="preserve"> addresses this gap by combining LLMs with geospatial intelligence to deliver environment-aware, health-optimized bike route planning</w:t>
+        <w:t>Despite these advancements, existing solutions lack targeted support for personalized route planning or environmental criteria integration. None of the reviewed systems directly tackle bicycle routing that adapts to vegetation or pollution levels. Our proposed GeoBikeLLM addresses this gap by combining LLMs with geospatial intelligence to deliver environment-aware, health-optimized bike route planning</w:t>
       </w:r>
       <w:r>
         <w:rPr>
@@ -1265,21 +976,7 @@
         <w:rPr>
           <w:lang w:val="en-US"/>
         </w:rPr>
-        <w:t xml:space="preserve">In the proposed routing system, two LLMs are integrated using the </w:t>
-      </w:r>
-      <w:proofErr w:type="spellStart"/>
-      <w:r>
-        <w:rPr>
-          <w:lang w:val="en-US"/>
-        </w:rPr>
-        <w:t>Groq</w:t>
-      </w:r>
-      <w:proofErr w:type="spellEnd"/>
-      <w:r>
-        <w:rPr>
-          <w:lang w:val="en-US"/>
-        </w:rPr>
-        <w:t xml:space="preserve"> API to enhance the </w:t>
+        <w:t xml:space="preserve">In the proposed routing system, two LLMs are integrated using the Groq API to enhance the </w:t>
       </w:r>
       <w:r>
         <w:rPr>
@@ -1409,7 +1106,19 @@
         <w:rPr>
           <w:i w:val="0"/>
         </w:rPr>
-        <w:t xml:space="preserve">This </w:t>
+        <w:t>This</w:t>
+      </w:r>
+      <w:r>
+        <w:rPr>
+          <w:i w:val="0"/>
+        </w:rPr>
+        <w:t xml:space="preserve"> part</w:t>
+      </w:r>
+      <w:r>
+        <w:rPr>
+          <w:i w:val="0"/>
+        </w:rPr>
+        <w:t xml:space="preserve"> </w:t>
       </w:r>
     </w:p>
     <w:p>
@@ -1502,21 +1211,7 @@
         <w:rPr>
           <w:lang w:val="en-AE"/>
         </w:rPr>
-        <w:t xml:space="preserve">The </w:t>
-      </w:r>
-      <w:proofErr w:type="spellStart"/>
-      <w:r>
-        <w:rPr>
-          <w:lang w:val="en-AE"/>
-        </w:rPr>
-        <w:t>GeoBikeLLM</w:t>
-      </w:r>
-      <w:proofErr w:type="spellEnd"/>
-      <w:r>
-        <w:rPr>
-          <w:lang w:val="en-AE"/>
-        </w:rPr>
-        <w:t xml:space="preserve"> system enables natural language-based bike route planning within Chicago, Illinois, by integrating environmental and spatial data to recommend optimized cycling paths. Users interact with the system by entering a prompt such as </w:t>
+        <w:t xml:space="preserve">The GeoBikeLLM system enables natural language-based bike route planning within Chicago, Illinois, by integrating environmental and spatial data to recommend optimized cycling paths. Users interact with the system by entering a prompt such as </w:t>
       </w:r>
       <w:r>
         <w:rPr>
@@ -1538,21 +1233,12 @@
         </w:rPr>
         <w:t xml:space="preserve"> </w:t>
       </w:r>
-      <w:proofErr w:type="spellStart"/>
       <w:r>
         <w:rPr>
           <w:color w:val="FF0000"/>
           <w:lang w:val="en-AE"/>
         </w:rPr>
-        <w:t>num</w:t>
-      </w:r>
-      <w:proofErr w:type="spellEnd"/>
-      <w:r>
-        <w:rPr>
-          <w:color w:val="FF0000"/>
-          <w:lang w:val="en-AE"/>
-        </w:rPr>
-        <w:t xml:space="preserve"> (caption: System prompt provided to the LLM for extracting origin and destination.), </w:t>
+        <w:t xml:space="preserve">num (caption: System prompt provided to the LLM for extracting origin and destination.), </w:t>
       </w:r>
       <w:r>
         <w:rPr>
@@ -1663,21 +1349,7 @@
         <w:rPr>
           <w:lang w:val="en-AE"/>
         </w:rPr>
-        <w:t xml:space="preserve">. These sliders eliminate the need to express routing preferences within the prompt itself. The air quality slider (α) penalizes routes with higher PM2.5 levels, while the greenness slider (β) </w:t>
-      </w:r>
-      <w:proofErr w:type="spellStart"/>
-      <w:r>
-        <w:rPr>
-          <w:lang w:val="en-AE"/>
-        </w:rPr>
-        <w:t>favors</w:t>
-      </w:r>
-      <w:proofErr w:type="spellEnd"/>
-      <w:r>
-        <w:rPr>
-          <w:lang w:val="en-AE"/>
-        </w:rPr>
-        <w:t xml:space="preserve"> paths with higher Normalized Difference Vegetation Index (NDVI) values.</w:t>
+        <w:t>. These sliders eliminate the need to express routing preferences within the prompt itself. The air quality slider (α) penalizes routes with higher PM2.5 levels, while the greenness slider (β) favors paths with higher Normalized Difference Vegetation Index (NDVI) values.</w:t>
       </w:r>
     </w:p>
     <w:p>

</xml_diff>

<commit_message>
Update "Dataset Visualization and Exploration"
</commit_message>
<xml_diff>
--- a/GeoBikeLLM Paper.docx
+++ b/GeoBikeLLM Paper.docx
@@ -350,30 +350,39 @@
       <w:r>
         <w:t>Keywords—</w:t>
       </w:r>
+      <w:proofErr w:type="gramStart"/>
       <w:r>
         <w:t xml:space="preserve">Geospatial </w:t>
       </w:r>
       <w:r>
         <w:t>,</w:t>
       </w:r>
+      <w:proofErr w:type="gramEnd"/>
       <w:r>
         <w:t xml:space="preserve"> </w:t>
       </w:r>
+      <w:proofErr w:type="gramStart"/>
       <w:r>
         <w:t xml:space="preserve">LLM </w:t>
       </w:r>
       <w:r>
         <w:t>,</w:t>
       </w:r>
+      <w:proofErr w:type="gramEnd"/>
       <w:r>
         <w:t xml:space="preserve"> </w:t>
       </w:r>
       <w:r>
-        <w:t xml:space="preserve">Air Quality </w:t>
+        <w:t xml:space="preserve">Air </w:t>
+      </w:r>
+      <w:proofErr w:type="gramStart"/>
+      <w:r>
+        <w:t xml:space="preserve">Quality </w:t>
       </w:r>
       <w:r>
         <w:t>,</w:t>
       </w:r>
+      <w:proofErr w:type="gramEnd"/>
       <w:r>
         <w:t xml:space="preserve"> </w:t>
       </w:r>
@@ -422,24 +431,52 @@
         <w:rPr>
           <w:lang w:val="en-US"/>
         </w:rPr>
-        <w:t xml:space="preserve">Recent advancements in GeoAI and LLM research have enabled natural language interfaces for querying and interpreting geospatial data. Studies have explored both LLM-augmented spatial querying and multimodal systems integrating maps, satellite imagery, and text for environmental reasoning. This section reviews existing approaches and highlights the gap </w:t>
-      </w:r>
+        <w:t xml:space="preserve">Recent advancements in </w:t>
+      </w:r>
+      <w:proofErr w:type="spellStart"/>
       <w:r>
         <w:rPr>
           <w:lang w:val="en-US"/>
         </w:rPr>
+        <w:t>GeoAI</w:t>
+      </w:r>
+      <w:proofErr w:type="spellEnd"/>
+      <w:r>
+        <w:rPr>
+          <w:lang w:val="en-US"/>
+        </w:rPr>
+        <w:t xml:space="preserve"> and LLM research have enabled natural language interfaces for querying and interpreting geospatial data. Studies have explored both LLM-augmented spatial querying and multimodal systems integrating maps, satellite imagery, and text for environmental reasoning. This section reviews existing approaches and highlights the gap </w:t>
+      </w:r>
+      <w:r>
+        <w:rPr>
+          <w:lang w:val="en-US"/>
+        </w:rPr>
         <w:t xml:space="preserve">that </w:t>
       </w:r>
       <w:r>
         <w:rPr>
           <w:lang w:val="en-US"/>
         </w:rPr>
-        <w:t>our proposed GeoBikeLLM system aims to fill.</w:t>
-      </w:r>
+        <w:t xml:space="preserve">our proposed </w:t>
+      </w:r>
+      <w:proofErr w:type="spellStart"/>
       <w:r>
         <w:rPr>
           <w:lang w:val="en-US"/>
         </w:rPr>
+        <w:t>GeoBikeLLM</w:t>
+      </w:r>
+      <w:proofErr w:type="spellEnd"/>
+      <w:r>
+        <w:rPr>
+          <w:lang w:val="en-US"/>
+        </w:rPr>
+        <w:t xml:space="preserve"> system aims to fill.</w:t>
+      </w:r>
+      <w:r>
+        <w:rPr>
+          <w:lang w:val="en-US"/>
+        </w:rPr>
         <w:t xml:space="preserve"> </w:t>
       </w:r>
     </w:p>
@@ -462,7 +499,119 @@
         <w:rPr>
           <w:lang w:val="en-AE"/>
         </w:rPr>
-        <w:t>Recent research has focused on enhancing geospatial data accessibility through natural language interfaces powered by large language models (LLMs). Systems like ChatGeoAI by Mansourian and Oucheikh [1] and the SQL-generation framework by Jiang and Yang [2] enable users to perform GIS tasks or query spatial databases using natural language. ChatGeoAI employs LLaMA-2 to convert queries into executable PyQGIS scripts, while Jiang and Yang use ChatGPT to generate PostGIS-compatible SQL. Text-to-OverpassQL by Staniek et al. [3] further advances this by translating natural language into OverpassQL queries for OpenStreetMap, democratizing access to structured geodata.</w:t>
+        <w:t xml:space="preserve">Recent research has focused on enhancing geospatial data accessibility through natural language interfaces powered by large language models (LLMs). Systems like </w:t>
+      </w:r>
+      <w:proofErr w:type="spellStart"/>
+      <w:r>
+        <w:rPr>
+          <w:lang w:val="en-AE"/>
+        </w:rPr>
+        <w:t>ChatGeoAI</w:t>
+      </w:r>
+      <w:proofErr w:type="spellEnd"/>
+      <w:r>
+        <w:rPr>
+          <w:lang w:val="en-AE"/>
+        </w:rPr>
+        <w:t xml:space="preserve"> by Mansourian and </w:t>
+      </w:r>
+      <w:proofErr w:type="spellStart"/>
+      <w:r>
+        <w:rPr>
+          <w:lang w:val="en-AE"/>
+        </w:rPr>
+        <w:t>Oucheikh</w:t>
+      </w:r>
+      <w:proofErr w:type="spellEnd"/>
+      <w:r>
+        <w:rPr>
+          <w:lang w:val="en-AE"/>
+        </w:rPr>
+        <w:t xml:space="preserve"> [1] and the SQL-generation framework by Jiang and Yang [2] enable users to perform GIS tasks or query spatial databases using natural language. </w:t>
+      </w:r>
+      <w:proofErr w:type="spellStart"/>
+      <w:r>
+        <w:rPr>
+          <w:lang w:val="en-AE"/>
+        </w:rPr>
+        <w:t>ChatGeoAI</w:t>
+      </w:r>
+      <w:proofErr w:type="spellEnd"/>
+      <w:r>
+        <w:rPr>
+          <w:lang w:val="en-AE"/>
+        </w:rPr>
+        <w:t xml:space="preserve"> employs LLaMA-2 to convert queries into executable </w:t>
+      </w:r>
+      <w:proofErr w:type="spellStart"/>
+      <w:r>
+        <w:rPr>
+          <w:lang w:val="en-AE"/>
+        </w:rPr>
+        <w:t>PyQGIS</w:t>
+      </w:r>
+      <w:proofErr w:type="spellEnd"/>
+      <w:r>
+        <w:rPr>
+          <w:lang w:val="en-AE"/>
+        </w:rPr>
+        <w:t xml:space="preserve"> scripts, while Jiang and Yang use ChatGPT to generate </w:t>
+      </w:r>
+      <w:proofErr w:type="spellStart"/>
+      <w:r>
+        <w:rPr>
+          <w:lang w:val="en-AE"/>
+        </w:rPr>
+        <w:t>PostGIS</w:t>
+      </w:r>
+      <w:proofErr w:type="spellEnd"/>
+      <w:r>
+        <w:rPr>
+          <w:lang w:val="en-AE"/>
+        </w:rPr>
+        <w:t>-compatible SQL. Text-to-</w:t>
+      </w:r>
+      <w:proofErr w:type="spellStart"/>
+      <w:r>
+        <w:rPr>
+          <w:lang w:val="en-AE"/>
+        </w:rPr>
+        <w:t>OverpassQL</w:t>
+      </w:r>
+      <w:proofErr w:type="spellEnd"/>
+      <w:r>
+        <w:rPr>
+          <w:lang w:val="en-AE"/>
+        </w:rPr>
+        <w:t xml:space="preserve"> by </w:t>
+      </w:r>
+      <w:proofErr w:type="spellStart"/>
+      <w:r>
+        <w:rPr>
+          <w:lang w:val="en-AE"/>
+        </w:rPr>
+        <w:t>Staniek</w:t>
+      </w:r>
+      <w:proofErr w:type="spellEnd"/>
+      <w:r>
+        <w:rPr>
+          <w:lang w:val="en-AE"/>
+        </w:rPr>
+        <w:t xml:space="preserve"> et al. [3] further advances this by translating natural language into </w:t>
+      </w:r>
+      <w:proofErr w:type="spellStart"/>
+      <w:r>
+        <w:rPr>
+          <w:lang w:val="en-AE"/>
+        </w:rPr>
+        <w:t>OverpassQL</w:t>
+      </w:r>
+      <w:proofErr w:type="spellEnd"/>
+      <w:r>
+        <w:rPr>
+          <w:lang w:val="en-AE"/>
+        </w:rPr>
+        <w:t xml:space="preserve"> queries for OpenStreetMap, democratizing access to structured geodata.</w:t>
       </w:r>
     </w:p>
     <w:p>
@@ -483,7 +632,49 @@
         <w:rPr>
           <w:lang w:val="en-AE"/>
         </w:rPr>
-        <w:t>Other studies investigate how LLMs can interpret or extract geographic knowledge. GeoQAMap by Feng et al. [4] utilizes GPT-3.5 and Wikidata to answer geographic questions and visualize answers on maps. GeoAgent by Huang et al. [5] focuses on address standardization using ChatGLM-6B, showing how LLMs can resolve ambiguous and incomplete geospatial texts. Meanwhile, Bhandari et al. [6] evaluate whether large language models are geospatially knowledgeable, revealing that while some geospatial knowledge exists in pretrained models, it is often imprecise.</w:t>
+        <w:t xml:space="preserve">Other studies investigate how LLMs can interpret or extract geographic knowledge. </w:t>
+      </w:r>
+      <w:proofErr w:type="spellStart"/>
+      <w:r>
+        <w:rPr>
+          <w:lang w:val="en-AE"/>
+        </w:rPr>
+        <w:t>GeoQAMap</w:t>
+      </w:r>
+      <w:proofErr w:type="spellEnd"/>
+      <w:r>
+        <w:rPr>
+          <w:lang w:val="en-AE"/>
+        </w:rPr>
+        <w:t xml:space="preserve"> by Feng et al. [4] utilizes GPT-3.5 and </w:t>
+      </w:r>
+      <w:proofErr w:type="spellStart"/>
+      <w:r>
+        <w:rPr>
+          <w:lang w:val="en-AE"/>
+        </w:rPr>
+        <w:t>Wikidata</w:t>
+      </w:r>
+      <w:proofErr w:type="spellEnd"/>
+      <w:r>
+        <w:rPr>
+          <w:lang w:val="en-AE"/>
+        </w:rPr>
+        <w:t xml:space="preserve"> to answer geographic questions and visualize answers on maps. </w:t>
+      </w:r>
+      <w:proofErr w:type="spellStart"/>
+      <w:r>
+        <w:rPr>
+          <w:lang w:val="en-AE"/>
+        </w:rPr>
+        <w:t>GeoAgent</w:t>
+      </w:r>
+      <w:proofErr w:type="spellEnd"/>
+      <w:r>
+        <w:rPr>
+          <w:lang w:val="en-AE"/>
+        </w:rPr>
+        <w:t xml:space="preserve"> by Huang et al. [5] focuses on address standardization using ChatGLM-6B, showing how LLMs can resolve ambiguous and incomplete geospatial texts. Meanwhile, Bhandari et al. [6] evaluate whether large language models are geospatially knowledgeable, revealing that while some geospatial knowledge exists in pretrained models, it is often imprecise.</w:t>
       </w:r>
     </w:p>
     <w:p>
@@ -497,7 +688,35 @@
         <w:rPr>
           <w:lang w:val="en-AE"/>
         </w:rPr>
-        <w:t>To overcome these limitations, domain-adapted models have emerged. BB-GeoGPT by Zhang et al. [7] is a fine-tuned LLaMA-2 model trained on GIS texts and Q&amp;A pairs, outperforming general LLMs in spatial queries. Similarly, GeoLLM by Shah et al. [8] boosts geospatial prediction accuracy by embedding map-based contextual data into prompts. These efforts establish the foundation for natural language interaction with spatial systems but stop short of performing complex geospatial planning or optimization.</w:t>
+        <w:t>To overcome these limitations, domain-adapted models have emerged. BB-</w:t>
+      </w:r>
+      <w:proofErr w:type="spellStart"/>
+      <w:r>
+        <w:rPr>
+          <w:lang w:val="en-AE"/>
+        </w:rPr>
+        <w:t>GeoGPT</w:t>
+      </w:r>
+      <w:proofErr w:type="spellEnd"/>
+      <w:r>
+        <w:rPr>
+          <w:lang w:val="en-AE"/>
+        </w:rPr>
+        <w:t xml:space="preserve"> by Zhang et al. [7] is a fine-tuned LLaMA-2 model trained on GIS texts and Q&amp;A pairs, outperforming general LLMs in spatial queries. Similarly, </w:t>
+      </w:r>
+      <w:proofErr w:type="spellStart"/>
+      <w:r>
+        <w:rPr>
+          <w:lang w:val="en-AE"/>
+        </w:rPr>
+        <w:t>GeoLLM</w:t>
+      </w:r>
+      <w:proofErr w:type="spellEnd"/>
+      <w:r>
+        <w:rPr>
+          <w:lang w:val="en-AE"/>
+        </w:rPr>
+        <w:t xml:space="preserve"> by Shah et al. [8] boosts geospatial prediction accuracy by embedding map-based contextual data into prompts. These efforts establish the foundation for natural language interaction with spatial systems but stop short of performing complex geospatial planning or optimization.</w:t>
       </w:r>
     </w:p>
     <w:p>
@@ -530,7 +749,49 @@
         <w:rPr>
           <w:lang w:val="en-AE"/>
         </w:rPr>
-        <w:t>Advancements in GeoAI have expanded to multimodal systems integrating LLMs with visual and structured geospatial data. OmniGeo by Yuan et al. [9] exemplifies this trend by combining satellite imagery, map layers, and text data, enabling LLMs to perform diverse tasks such as land use classification and environmental forecasting. Geode by Wu et al. [10] and GTChain by Zhang et al. [11] extend LLMs into autonomous agents, coordinating APIs, GIS tools, and real-time databases to solve spatial tasks.</w:t>
+        <w:t xml:space="preserve">Advancements in </w:t>
+      </w:r>
+      <w:proofErr w:type="spellStart"/>
+      <w:r>
+        <w:rPr>
+          <w:lang w:val="en-AE"/>
+        </w:rPr>
+        <w:t>GeoAI</w:t>
+      </w:r>
+      <w:proofErr w:type="spellEnd"/>
+      <w:r>
+        <w:rPr>
+          <w:lang w:val="en-AE"/>
+        </w:rPr>
+        <w:t xml:space="preserve"> have expanded to multimodal systems integrating LLMs with visual and structured geospatial data. </w:t>
+      </w:r>
+      <w:proofErr w:type="spellStart"/>
+      <w:r>
+        <w:rPr>
+          <w:lang w:val="en-AE"/>
+        </w:rPr>
+        <w:t>OmniGeo</w:t>
+      </w:r>
+      <w:proofErr w:type="spellEnd"/>
+      <w:r>
+        <w:rPr>
+          <w:lang w:val="en-AE"/>
+        </w:rPr>
+        <w:t xml:space="preserve"> by Yuan et al. [9] exemplifies this trend by combining satellite imagery, map layers, and text data, enabling LLMs to perform diverse tasks such as land use classification and environmental forecasting. Geode by Wu et al. [10] and </w:t>
+      </w:r>
+      <w:proofErr w:type="spellStart"/>
+      <w:r>
+        <w:rPr>
+          <w:lang w:val="en-AE"/>
+        </w:rPr>
+        <w:t>GTChain</w:t>
+      </w:r>
+      <w:proofErr w:type="spellEnd"/>
+      <w:r>
+        <w:rPr>
+          <w:lang w:val="en-AE"/>
+        </w:rPr>
+        <w:t xml:space="preserve"> by Zhang et al. [11] extend LLMs into autonomous agents, coordinating APIs, GIS tools, and real-time databases to solve spatial tasks.</w:t>
       </w:r>
     </w:p>
     <w:p>
@@ -551,7 +812,21 @@
         <w:rPr>
           <w:lang w:val="en-AE"/>
         </w:rPr>
-        <w:t>These systems demonstrate the potential of LLMs in spatial reasoning, data retrieval, and geospatial tool orchestration. Geode performs zero-shot geospatial Q&amp;A with explicit reasoning and live data, while GTChain trains LLMs to generate tool-use chains for complex tasks in simulated GIS environments. The autonomous GIS agent by Ning et al. [12] also showcases how LLMs can be used to dynamically retrieve data across diverse spatial datasets, enhancing spatial decision-making workflows.</w:t>
+        <w:t xml:space="preserve">These systems demonstrate the potential of LLMs in spatial reasoning, data retrieval, and geospatial tool orchestration. Geode performs zero-shot geospatial Q&amp;A with explicit reasoning and live data, while </w:t>
+      </w:r>
+      <w:proofErr w:type="spellStart"/>
+      <w:r>
+        <w:rPr>
+          <w:lang w:val="en-AE"/>
+        </w:rPr>
+        <w:t>GTChain</w:t>
+      </w:r>
+      <w:proofErr w:type="spellEnd"/>
+      <w:r>
+        <w:rPr>
+          <w:lang w:val="en-AE"/>
+        </w:rPr>
+        <w:t xml:space="preserve"> trains LLMs to generate tool-use chains for complex tasks in simulated GIS environments. The autonomous GIS agent by Ning et al. [12] also showcases how LLMs can be used to dynamically retrieve data across diverse spatial datasets, enhancing spatial decision-making workflows.</w:t>
       </w:r>
     </w:p>
     <w:p>
@@ -565,7 +840,21 @@
         <w:rPr>
           <w:lang w:val="en-AE"/>
         </w:rPr>
-        <w:t>Despite these advancements, existing solutions lack targeted support for personalized route planning or environmental criteria integration. None of the reviewed systems directly tackle bicycle routing that adapts to vegetation or pollution levels. Our proposed GeoBikeLLM addresses this gap by combining LLMs with geospatial intelligence to deliver environment-aware, health-optimized bike route planning</w:t>
+        <w:t xml:space="preserve">Despite these advancements, existing solutions lack targeted support for personalized route planning or environmental criteria integration. None of the reviewed systems directly tackle bicycle routing that adapts to vegetation or pollution levels. Our proposed </w:t>
+      </w:r>
+      <w:proofErr w:type="spellStart"/>
+      <w:r>
+        <w:rPr>
+          <w:lang w:val="en-AE"/>
+        </w:rPr>
+        <w:t>GeoBikeLLM</w:t>
+      </w:r>
+      <w:proofErr w:type="spellEnd"/>
+      <w:r>
+        <w:rPr>
+          <w:lang w:val="en-AE"/>
+        </w:rPr>
+        <w:t xml:space="preserve"> addresses this gap by combining LLMs with geospatial intelligence to deliver environment-aware, health-optimized bike route planning</w:t>
       </w:r>
       <w:r>
         <w:rPr>
@@ -760,139 +1049,66 @@
     <w:p>
       <w:pPr>
         <w:pStyle w:val="Heading2"/>
-      </w:pPr>
-      <w:r>
-        <w:t>Path Selection Module</w:t>
-      </w:r>
-    </w:p>
-    <w:p>
-      <w:pPr>
-        <w:pStyle w:val="BodyText"/>
-        <w:rPr>
-          <w:lang w:val="en-US"/>
-        </w:rPr>
-      </w:pPr>
-      <w:r>
-        <w:rPr>
-          <w:lang w:val="en-US"/>
-        </w:rPr>
-        <w:t xml:space="preserve">The core of the route planning logic involves constructing a weighted undirected graph from the Chicago bike lane dataset. Each edge represents a bike segment with an associated length, while nodes correspond to geospatial coordinates. To account for environmental quality, air pollution data (PM2.5) and vegetation density (NDVI) are spatially matched to each segment using nearest-neighbor querying via KD-Trees. </w:t>
-      </w:r>
-      <w:r>
-        <w:rPr>
-          <w:lang w:val="en-US"/>
-        </w:rPr>
-        <w:t>The cost of each edge is computed as shown in (1), where α and β control the influence of PM2.5 and NDVI</w:t>
-      </w:r>
-      <w:r>
-        <w:rPr>
-          <w:lang w:val="en-US"/>
-        </w:rPr>
-        <w:t>,</w:t>
-      </w:r>
-      <w:r>
-        <w:rPr>
-          <w:lang w:val="en-US"/>
-        </w:rPr>
-        <w:t xml:space="preserve"> respectively.</w:t>
-      </w:r>
-    </w:p>
-    <w:p>
-      <w:pPr>
-        <w:pStyle w:val="equation"/>
-        <w:rPr>
-          <w:rFonts w:hint="eastAsia"/>
-        </w:rPr>
-      </w:pPr>
-      <w:r>
-        <w:tab/>
-      </w:r>
-      <w:r>
-        <w:rPr>
-          <w:rFonts w:ascii="Times New Roman" w:hAnsi="Times New Roman" w:cs="Times New Roman"/>
-          <w:i/>
-        </w:rPr>
-        <w:t xml:space="preserve">Cost = </w:t>
-      </w:r>
-      <w:r>
-        <w:rPr>
-          <w:rFonts w:ascii="Times New Roman" w:hAnsi="Times New Roman" w:cs="Times New Roman"/>
-          <w:i/>
-        </w:rPr>
-        <w:t>length×</w:t>
-      </w:r>
-      <w:r>
-        <w:rPr>
-          <w:rFonts w:ascii="Times New Roman" w:hAnsi="Times New Roman" w:cs="Times New Roman"/>
-          <w:i/>
-        </w:rPr>
-        <w:t>(1+α</w:t>
-      </w:r>
-      <w:r>
-        <w:rPr>
-          <w:rFonts w:ascii="Cambria Math" w:hAnsi="Cambria Math" w:cs="Cambria Math"/>
-          <w:i/>
-        </w:rPr>
-        <w:t>⋅</w:t>
-      </w:r>
-      <w:r>
-        <w:rPr>
-          <w:rFonts w:ascii="Times New Roman" w:hAnsi="Times New Roman" w:cs="Times New Roman"/>
-          <w:i/>
-        </w:rPr>
-        <w:t>PM2.5−β</w:t>
-      </w:r>
-      <w:r>
-        <w:rPr>
-          <w:rFonts w:ascii="Cambria Math" w:hAnsi="Cambria Math" w:cs="Cambria Math"/>
-          <w:i/>
-        </w:rPr>
-        <w:t>⋅</w:t>
-      </w:r>
-      <w:r>
-        <w:rPr>
-          <w:rFonts w:ascii="Times New Roman" w:hAnsi="Times New Roman" w:cs="Times New Roman"/>
-          <w:i/>
-        </w:rPr>
-        <w:t>NDVI)</w:t>
-      </w:r>
-      <w:r>
-        <w:tab/>
-      </w:r>
-      <w:r>
-        <w:t></w:t>
-      </w:r>
-      <w:r>
-        <w:t></w:t>
-      </w:r>
-      <w:r>
-        <w:t></w:t>
-      </w:r>
-    </w:p>
-    <w:p>
-      <w:pPr>
-        <w:pStyle w:val="BodyText"/>
-        <w:rPr>
-          <w:lang w:val="en-US"/>
-        </w:rPr>
-      </w:pPr>
-      <w:r>
-        <w:rPr>
-          <w:noProof/>
-        </w:rPr>
+        <w:rPr>
+          <w:rtl/>
+        </w:rPr>
+      </w:pPr>
+      <w:r>
+        <w:t>Dataset Visualization and Exploration</w:t>
+      </w:r>
+    </w:p>
+    <w:p>
+      <w:pPr>
+        <w:ind w:firstLine="14.40pt"/>
+        <w:jc w:val="start"/>
+      </w:pPr>
+      <w:r>
+        <w:t>To better understand the spatial distribution of air pollution and vegetation in Chicago, we performed exploratory visualizations using Folium and Python libraries. PM2.5 sensor data was plotted to identify high-pollution zones, while NDVI values were visualized to detect greener regions.</w:t>
+      </w:r>
+    </w:p>
+    <w:p>
+      <w:pPr>
+        <w:pStyle w:val="Heading3"/>
+        <w:rPr>
+          <w:rtl/>
+          <w:lang w:bidi="ar-AE"/>
+        </w:rPr>
+      </w:pPr>
+      <w:r>
+        <w:rPr>
+          <w:lang w:bidi="ar-AE"/>
+        </w:rPr>
+        <w:t>Air Quality</w:t>
+      </w:r>
+      <w:r>
+        <w:rPr>
+          <w:lang w:bidi="ar-AE"/>
+        </w:rPr>
+        <w:t xml:space="preserve"> Visualization</w:t>
+      </w:r>
+    </w:p>
+    <w:p>
+      <w:pPr>
+        <w:ind w:firstLine="14.40pt"/>
+        <w:jc w:val="both"/>
+        <w:rPr>
+          <w:lang w:bidi="ar-AE"/>
+        </w:rPr>
+      </w:pPr>
+      <w:r>
         <w:drawing>
-          <wp:anchor distT="0" distB="0" distL="114300" distR="114300" simplePos="0" relativeHeight="251659264" behindDoc="0" locked="0" layoutInCell="1" allowOverlap="1" wp14:anchorId="4D139A7F" wp14:editId="1BF50330">
+          <wp:anchor distT="0" distB="0" distL="114300" distR="114300" simplePos="0" relativeHeight="251665408" behindDoc="0" locked="0" layoutInCell="1" allowOverlap="1" wp14:anchorId="5336D22A" wp14:editId="79296D38">
             <wp:simplePos x="0" y="0"/>
             <wp:positionH relativeFrom="column">
-              <wp:posOffset>3804719</wp:posOffset>
+              <wp:posOffset>3851452</wp:posOffset>
             </wp:positionH>
             <wp:positionV relativeFrom="paragraph">
-              <wp:posOffset>226326</wp:posOffset>
+              <wp:posOffset>370800</wp:posOffset>
             </wp:positionV>
-            <wp:extent cx="2132330" cy="1392555"/>
-            <wp:effectExtent l="0" t="0" r="1270" b="0"/>
+            <wp:extent cx="1707515" cy="1477010"/>
+            <wp:effectExtent l="0" t="0" r="6985" b="8890"/>
             <wp:wrapTopAndBottom/>
-            <wp:docPr id="502207992" name="Picture 3" descr="A screenshot of a computer code&#10;&#10;AI-generated content may be incorrect."/>
+            <wp:docPr id="2104092927" name="Picture 4" descr="A yellow and white text&#10;&#10;AI-generated content may be incorrect."/>
             <wp:cNvGraphicFramePr>
               <a:graphicFrameLocks xmlns:a="http://purl.oclc.org/ooxml/drawingml/main" noChangeAspect="1"/>
             </wp:cNvGraphicFramePr>
@@ -900,11 +1116,11 @@
               <a:graphicData uri="http://purl.oclc.org/ooxml/drawingml/picture">
                 <pic:pic xmlns:pic="http://purl.oclc.org/ooxml/drawingml/picture">
                   <pic:nvPicPr>
-                    <pic:cNvPr id="502207992" name="Picture 3" descr="A screenshot of a computer code&#10;&#10;AI-generated content may be incorrect."/>
+                    <pic:cNvPr id="435129276" name="Picture 4" descr="A yellow and white text&#10;&#10;AI-generated content may be incorrect."/>
                     <pic:cNvPicPr/>
                   </pic:nvPicPr>
                   <pic:blipFill>
-                    <a:blip r:embed="rId9">
+                    <a:blip r:embed="rId8">
                       <a:extLst>
                         <a:ext uri="{28A0092B-C50C-407E-A947-70E740481C1C}">
                           <a14:useLocalDpi xmlns:a14="http://schemas.microsoft.com/office/drawing/2010/main" val="0"/>
@@ -918,7 +1134,144 @@
                   <pic:spPr>
                     <a:xfrm>
                       <a:off x="0" y="0"/>
-                      <a:ext cx="2132330" cy="1392555"/>
+                      <a:ext cx="1707515" cy="1477010"/>
+                    </a:xfrm>
+                    <a:prstGeom prst="rect">
+                      <a:avLst/>
+                    </a:prstGeom>
+                  </pic:spPr>
+                </pic:pic>
+              </a:graphicData>
+            </a:graphic>
+            <wp14:sizeRelH relativeFrom="margin">
+              <wp14:pctWidth>0%</wp14:pctWidth>
+            </wp14:sizeRelH>
+            <wp14:sizeRelV relativeFrom="margin">
+              <wp14:pctHeight>0%</wp14:pctHeight>
+            </wp14:sizeRelV>
+          </wp:anchor>
+        </w:drawing>
+      </w:r>
+      <w:r>
+        <w:rPr>
+          <w:lang w:bidi="ar-AE"/>
+        </w:rPr>
+        <w:t xml:space="preserve">To visually explore the air quality dataset, a heatmap was generated using the PM2.5 readings across various geographic locations in Chicago. The map shown in </w:t>
+      </w:r>
+      <w:r>
+        <w:rPr>
+          <w:highlight w:val="red"/>
+          <w:lang w:bidi="ar-AE"/>
+        </w:rPr>
+        <w:t xml:space="preserve">Figure </w:t>
+      </w:r>
+      <w:r>
+        <w:rPr>
+          <w:lang w:bidi="ar-AE"/>
+        </w:rPr>
+        <w:t>1</w:t>
+      </w:r>
+      <w:r>
+        <w:rPr>
+          <w:lang w:bidi="ar-AE"/>
+        </w:rPr>
+        <w:t xml:space="preserve"> represents the normalized PM2.5 values, with areas of darker intensity indicating higher pollution concentrations.</w:t>
+      </w:r>
+      <w:r>
+        <w:rPr>
+          <w:lang w:bidi="ar-AE"/>
+        </w:rPr>
+        <w:t xml:space="preserve"> </w:t>
+      </w:r>
+    </w:p>
+    <w:p>
+      <w:pPr>
+        <w:ind w:firstLine="14.40pt"/>
+        <w:jc w:val="both"/>
+        <w:rPr>
+          <w:lang w:val="en-AE" w:bidi="ar-AE"/>
+        </w:rPr>
+      </w:pPr>
+      <w:r>
+        <w:rPr>
+          <w:lang w:val="en-AE" w:bidi="ar-AE"/>
+        </w:rPr>
+        <w:t xml:space="preserve">The heatmap was created by aggregating data from 19 CSV files hosted on GitHub, each containing latitude, longitude, and PM2.5 values for different parts of the city. After cleaning and normalizing the data using Min-Max scaling, each point was plotted using Folium’s </w:t>
+      </w:r>
+      <w:proofErr w:type="spellStart"/>
+      <w:r>
+        <w:rPr>
+          <w:lang w:val="en-AE" w:bidi="ar-AE"/>
+        </w:rPr>
+        <w:t>HeatMap</w:t>
+      </w:r>
+      <w:proofErr w:type="spellEnd"/>
+      <w:r>
+        <w:rPr>
+          <w:lang w:val="en-AE" w:bidi="ar-AE"/>
+        </w:rPr>
+        <w:t xml:space="preserve"> plugin. The visualization reveals several hotspots of elevated pollution, particularly along dense urban corridors and industrial zones.</w:t>
+      </w:r>
+    </w:p>
+    <w:p>
+      <w:pPr>
+        <w:ind w:firstLine="14.40pt"/>
+        <w:jc w:val="both"/>
+        <w:rPr>
+          <w:lang w:val="en-AE" w:bidi="ar-AE"/>
+        </w:rPr>
+      </w:pPr>
+      <w:r>
+        <w:rPr>
+          <w:lang w:bidi="ar-AE"/>
+        </w:rPr>
+        <w:drawing>
+          <wp:anchor distT="0" distB="0" distL="114300" distR="114300" simplePos="0" relativeHeight="251666432" behindDoc="1" locked="0" layoutInCell="1" allowOverlap="1" wp14:anchorId="3BEE019E" wp14:editId="7DA4F43B">
+            <wp:simplePos x="0" y="0"/>
+            <wp:positionH relativeFrom="column">
+              <wp:align>right</wp:align>
+            </wp:positionH>
+            <wp:positionV relativeFrom="paragraph">
+              <wp:posOffset>575798</wp:posOffset>
+            </wp:positionV>
+            <wp:extent cx="3089910" cy="2256790"/>
+            <wp:effectExtent l="0" t="0" r="0" b="0"/>
+            <wp:wrapTight wrapText="bothSides">
+              <wp:wrapPolygon edited="0">
+                <wp:start x="0" y="0"/>
+                <wp:lineTo x="0" y="21333"/>
+                <wp:lineTo x="21440" y="21333"/>
+                <wp:lineTo x="21440" y="0"/>
+                <wp:lineTo x="0" y="0"/>
+              </wp:wrapPolygon>
+            </wp:wrapTight>
+            <wp:docPr id="1432589203" name="Picture 1"/>
+            <wp:cNvGraphicFramePr>
+              <a:graphicFrameLocks xmlns:a="http://purl.oclc.org/ooxml/drawingml/main" noChangeAspect="1"/>
+            </wp:cNvGraphicFramePr>
+            <a:graphic xmlns:a="http://purl.oclc.org/ooxml/drawingml/main">
+              <a:graphicData uri="http://purl.oclc.org/ooxml/drawingml/picture">
+                <pic:pic xmlns:pic="http://purl.oclc.org/ooxml/drawingml/picture">
+                  <pic:nvPicPr>
+                    <pic:cNvPr id="1432589203" name=""/>
+                    <pic:cNvPicPr/>
+                  </pic:nvPicPr>
+                  <pic:blipFill>
+                    <a:blip r:embed="rId9" cstate="print">
+                      <a:extLst>
+                        <a:ext uri="{28A0092B-C50C-407E-A947-70E740481C1C}">
+                          <a14:useLocalDpi xmlns:a14="http://schemas.microsoft.com/office/drawing/2010/main" val="0"/>
+                        </a:ext>
+                      </a:extLst>
+                    </a:blip>
+                    <a:stretch>
+                      <a:fillRect/>
+                    </a:stretch>
+                  </pic:blipFill>
+                  <pic:spPr>
+                    <a:xfrm>
+                      <a:off x="0" y="0"/>
+                      <a:ext cx="3089910" cy="2256790"/>
                     </a:xfrm>
                     <a:prstGeom prst="rect">
                       <a:avLst/>
@@ -932,6 +1285,140 @@
       </w:r>
       <w:r>
         <w:rPr>
+          <w:lang w:val="en-AE" w:bidi="ar-AE"/>
+        </w:rPr>
+        <w:t>This spatial representation helps identify areas that may require further attention or intervention for environmental and public health planning.</w:t>
+      </w:r>
+    </w:p>
+    <w:p>
+      <w:pPr>
+        <w:pStyle w:val="BodyText"/>
+        <w:rPr>
+          <w:lang w:val="en-US"/>
+        </w:rPr>
+      </w:pPr>
+    </w:p>
+    <w:p>
+      <w:pPr>
+        <w:pStyle w:val="Heading2"/>
+      </w:pPr>
+      <w:r>
+        <w:t>Path Selection Module</w:t>
+      </w:r>
+    </w:p>
+    <w:p>
+      <w:pPr>
+        <w:pStyle w:val="BodyText"/>
+        <w:rPr>
+          <w:lang w:val="en-US"/>
+        </w:rPr>
+      </w:pPr>
+      <w:r>
+        <w:rPr>
+          <w:lang w:val="en-US"/>
+        </w:rPr>
+        <w:t xml:space="preserve">The core of the route planning logic involves constructing a weighted undirected graph from the Chicago bike lane dataset. Each edge represents a bike segment with an associated length, while nodes correspond to geospatial coordinates. To account for environmental quality, air pollution data (PM2.5) and vegetation density (NDVI) are spatially matched to each segment using nearest-neighbor querying via KD-Trees. </w:t>
+      </w:r>
+      <w:r>
+        <w:rPr>
+          <w:lang w:val="en-US"/>
+        </w:rPr>
+        <w:t>The cost of each edge is computed as shown in (1), where α and β control the influence of PM2.5 and NDVI</w:t>
+      </w:r>
+      <w:r>
+        <w:rPr>
+          <w:lang w:val="en-US"/>
+        </w:rPr>
+        <w:t>,</w:t>
+      </w:r>
+      <w:r>
+        <w:rPr>
+          <w:lang w:val="en-US"/>
+        </w:rPr>
+        <w:t xml:space="preserve"> respectively.</w:t>
+      </w:r>
+    </w:p>
+    <w:p>
+      <w:pPr>
+        <w:pStyle w:val="equation"/>
+        <w:rPr>
+          <w:rFonts w:hint="eastAsia"/>
+        </w:rPr>
+      </w:pPr>
+      <w:r>
+        <w:tab/>
+      </w:r>
+      <w:r>
+        <w:rPr>
+          <w:rFonts w:ascii="Times New Roman" w:hAnsi="Times New Roman" w:cs="Times New Roman"/>
+          <w:i/>
+        </w:rPr>
+        <w:t xml:space="preserve">Cost = </w:t>
+      </w:r>
+      <w:r>
+        <w:rPr>
+          <w:rFonts w:ascii="Times New Roman" w:hAnsi="Times New Roman" w:cs="Times New Roman"/>
+          <w:i/>
+        </w:rPr>
+        <w:t>length×</w:t>
+      </w:r>
+      <w:r>
+        <w:rPr>
+          <w:rFonts w:ascii="Times New Roman" w:hAnsi="Times New Roman" w:cs="Times New Roman"/>
+          <w:i/>
+        </w:rPr>
+        <w:t>(1+α</w:t>
+      </w:r>
+      <w:r>
+        <w:rPr>
+          <w:rFonts w:ascii="Cambria Math" w:hAnsi="Cambria Math" w:cs="Cambria Math"/>
+          <w:i/>
+        </w:rPr>
+        <w:t>⋅</w:t>
+      </w:r>
+      <w:r>
+        <w:rPr>
+          <w:rFonts w:ascii="Times New Roman" w:hAnsi="Times New Roman" w:cs="Times New Roman"/>
+          <w:i/>
+        </w:rPr>
+        <w:t>PM2.5−β</w:t>
+      </w:r>
+      <w:r>
+        <w:rPr>
+          <w:rFonts w:ascii="Cambria Math" w:hAnsi="Cambria Math" w:cs="Cambria Math"/>
+          <w:i/>
+        </w:rPr>
+        <w:t>⋅</w:t>
+      </w:r>
+      <w:r>
+        <w:rPr>
+          <w:rFonts w:ascii="Times New Roman" w:hAnsi="Times New Roman" w:cs="Times New Roman"/>
+          <w:i/>
+        </w:rPr>
+        <w:t>NDVI)</w:t>
+      </w:r>
+      <w:r>
+        <w:tab/>
+      </w:r>
+      <w:r>
+        <w:t></w:t>
+      </w:r>
+      <w:r>
+        <w:t></w:t>
+      </w:r>
+      <w:r>
+        <w:t></w:t>
+      </w:r>
+    </w:p>
+    <w:p>
+      <w:pPr>
+        <w:pStyle w:val="BodyText"/>
+        <w:rPr>
+          <w:lang w:val="en-US"/>
+        </w:rPr>
+      </w:pPr>
+      <w:r>
+        <w:rPr>
           <w:lang w:val="en-AE"/>
         </w:rPr>
         <w:t>w</w:t>
@@ -976,12 +1463,26 @@
         <w:rPr>
           <w:lang w:val="en-US"/>
         </w:rPr>
-        <w:t xml:space="preserve">In the proposed routing system, two LLMs are integrated using the Groq API to enhance the </w:t>
-      </w:r>
+        <w:t xml:space="preserve">In the proposed routing system, two LLMs are integrated using the </w:t>
+      </w:r>
+      <w:proofErr w:type="spellStart"/>
       <w:r>
         <w:rPr>
           <w:lang w:val="en-US"/>
         </w:rPr>
+        <w:t>Groq</w:t>
+      </w:r>
+      <w:proofErr w:type="spellEnd"/>
+      <w:r>
+        <w:rPr>
+          <w:lang w:val="en-US"/>
+        </w:rPr>
+        <w:t xml:space="preserve"> API to enhance the </w:t>
+      </w:r>
+      <w:r>
+        <w:rPr>
+          <w:lang w:val="en-US"/>
+        </w:rPr>
         <w:t>NLP</w:t>
       </w:r>
       <w:r>
@@ -1020,13 +1521,7 @@
         <w:rPr>
           <w:i w:val="0"/>
         </w:rPr>
-        <w:t xml:space="preserve">As shown in </w:t>
-      </w:r>
-      <w:r>
-        <w:rPr>
-          <w:i w:val="0"/>
-        </w:rPr>
-        <w:t>Figure </w:t>
+        <w:t>As shown in Figure </w:t>
       </w:r>
       <w:r>
         <w:rPr>
@@ -1211,7 +1706,21 @@
         <w:rPr>
           <w:lang w:val="en-AE"/>
         </w:rPr>
-        <w:t xml:space="preserve">The GeoBikeLLM system enables natural language-based bike route planning within Chicago, Illinois, by integrating environmental and spatial data to recommend optimized cycling paths. Users interact with the system by entering a prompt such as </w:t>
+        <w:t xml:space="preserve">The </w:t>
+      </w:r>
+      <w:proofErr w:type="spellStart"/>
+      <w:r>
+        <w:rPr>
+          <w:lang w:val="en-AE"/>
+        </w:rPr>
+        <w:t>GeoBikeLLM</w:t>
+      </w:r>
+      <w:proofErr w:type="spellEnd"/>
+      <w:r>
+        <w:rPr>
+          <w:lang w:val="en-AE"/>
+        </w:rPr>
+        <w:t xml:space="preserve"> system enables natural language-based bike route planning within Chicago, Illinois, by integrating environmental and spatial data to recommend optimized cycling paths. Users interact with the system by entering a prompt such as </w:t>
       </w:r>
       <w:r>
         <w:rPr>
@@ -1233,12 +1742,21 @@
         </w:rPr>
         <w:t xml:space="preserve"> </w:t>
       </w:r>
+      <w:proofErr w:type="spellStart"/>
       <w:r>
         <w:rPr>
           <w:color w:val="FF0000"/>
           <w:lang w:val="en-AE"/>
         </w:rPr>
-        <w:t xml:space="preserve">num (caption: System prompt provided to the LLM for extracting origin and destination.), </w:t>
+        <w:t>num</w:t>
+      </w:r>
+      <w:proofErr w:type="spellEnd"/>
+      <w:r>
+        <w:rPr>
+          <w:color w:val="FF0000"/>
+          <w:lang w:val="en-AE"/>
+        </w:rPr>
+        <w:t xml:space="preserve"> (caption: System prompt provided to the LLM for extracting origin and destination.), </w:t>
       </w:r>
       <w:r>
         <w:rPr>
@@ -1349,7 +1867,21 @@
         <w:rPr>
           <w:lang w:val="en-AE"/>
         </w:rPr>
-        <w:t>. These sliders eliminate the need to express routing preferences within the prompt itself. The air quality slider (α) penalizes routes with higher PM2.5 levels, while the greenness slider (β) favors paths with higher Normalized Difference Vegetation Index (NDVI) values.</w:t>
+        <w:t xml:space="preserve">. These sliders eliminate the need to express routing preferences within the prompt itself. The air quality slider (α) penalizes routes with higher PM2.5 levels, while the greenness slider (β) </w:t>
+      </w:r>
+      <w:proofErr w:type="spellStart"/>
+      <w:r>
+        <w:rPr>
+          <w:lang w:val="en-AE"/>
+        </w:rPr>
+        <w:t>favors</w:t>
+      </w:r>
+      <w:proofErr w:type="spellEnd"/>
+      <w:r>
+        <w:rPr>
+          <w:lang w:val="en-AE"/>
+        </w:rPr>
+        <w:t xml:space="preserve"> paths with higher Normalized Difference Vegetation Index (NDVI) values.</w:t>
       </w:r>
     </w:p>
     <w:p>
@@ -1772,7 +2304,6 @@
         <w:rPr>
           <w:lang w:val="fr-FR"/>
         </w:rPr>
-        <w:lastRenderedPageBreak/>
         <w:t xml:space="preserve">Zhang, Z., et al. (2024a). </w:t>
       </w:r>
       <w:r>

</xml_diff>

<commit_message>
Update "Dataset Visualization and Exploration" Section
</commit_message>
<xml_diff>
--- a/GeoBikeLLM Paper.docx
+++ b/GeoBikeLLM Paper.docx
@@ -1163,13 +1163,7 @@
           <w:highlight w:val="red"/>
           <w:lang w:bidi="ar-AE"/>
         </w:rPr>
-        <w:t xml:space="preserve">Figure </w:t>
-      </w:r>
-      <w:r>
-        <w:rPr>
-          <w:lang w:bidi="ar-AE"/>
-        </w:rPr>
-        <w:t>1</w:t>
+        <w:t>Figure 1</w:t>
       </w:r>
       <w:r>
         <w:rPr>

</xml_diff>

<commit_message>
Doing "Dataset Visualization and Exploration" Section
</commit_message>
<xml_diff>
--- a/GeoBikeLLM Paper.docx
+++ b/GeoBikeLLM Paper.docx
@@ -350,30 +350,39 @@
       <w:r>
         <w:t>Keywords—</w:t>
       </w:r>
+      <w:proofErr w:type="gramStart"/>
       <w:r>
         <w:t xml:space="preserve">Geospatial </w:t>
       </w:r>
       <w:r>
         <w:t>,</w:t>
       </w:r>
+      <w:proofErr w:type="gramEnd"/>
       <w:r>
         <w:t xml:space="preserve"> </w:t>
       </w:r>
+      <w:proofErr w:type="gramStart"/>
       <w:r>
         <w:t xml:space="preserve">LLM </w:t>
       </w:r>
       <w:r>
         <w:t>,</w:t>
       </w:r>
+      <w:proofErr w:type="gramEnd"/>
       <w:r>
         <w:t xml:space="preserve"> </w:t>
       </w:r>
       <w:r>
-        <w:t xml:space="preserve">Air Quality </w:t>
+        <w:t xml:space="preserve">Air </w:t>
+      </w:r>
+      <w:proofErr w:type="gramStart"/>
+      <w:r>
+        <w:t xml:space="preserve">Quality </w:t>
       </w:r>
       <w:r>
         <w:t>,</w:t>
       </w:r>
+      <w:proofErr w:type="gramEnd"/>
       <w:r>
         <w:t xml:space="preserve"> </w:t>
       </w:r>
@@ -422,24 +431,52 @@
         <w:rPr>
           <w:lang w:val="en-US"/>
         </w:rPr>
-        <w:t xml:space="preserve">Recent advancements in GeoAI and LLM research have enabled natural language interfaces for querying and interpreting geospatial data. Studies have explored both LLM-augmented spatial querying and multimodal systems integrating maps, satellite imagery, and text for environmental reasoning. This section reviews existing approaches and highlights the gap </w:t>
-      </w:r>
+        <w:t xml:space="preserve">Recent advancements in </w:t>
+      </w:r>
+      <w:proofErr w:type="spellStart"/>
       <w:r>
         <w:rPr>
           <w:lang w:val="en-US"/>
         </w:rPr>
+        <w:t>GeoAI</w:t>
+      </w:r>
+      <w:proofErr w:type="spellEnd"/>
+      <w:r>
+        <w:rPr>
+          <w:lang w:val="en-US"/>
+        </w:rPr>
+        <w:t xml:space="preserve"> and LLM research have enabled natural language interfaces for querying and interpreting geospatial data. Studies have explored both LLM-augmented spatial querying and multimodal systems integrating maps, satellite imagery, and text for environmental reasoning. This section reviews existing approaches and highlights the gap </w:t>
+      </w:r>
+      <w:r>
+        <w:rPr>
+          <w:lang w:val="en-US"/>
+        </w:rPr>
         <w:t xml:space="preserve">that </w:t>
       </w:r>
       <w:r>
         <w:rPr>
           <w:lang w:val="en-US"/>
         </w:rPr>
-        <w:t>our proposed GeoBikeLLM system aims to fill.</w:t>
-      </w:r>
+        <w:t xml:space="preserve">our proposed </w:t>
+      </w:r>
+      <w:proofErr w:type="spellStart"/>
       <w:r>
         <w:rPr>
           <w:lang w:val="en-US"/>
         </w:rPr>
+        <w:t>GeoBikeLLM</w:t>
+      </w:r>
+      <w:proofErr w:type="spellEnd"/>
+      <w:r>
+        <w:rPr>
+          <w:lang w:val="en-US"/>
+        </w:rPr>
+        <w:t xml:space="preserve"> system aims to fill.</w:t>
+      </w:r>
+      <w:r>
+        <w:rPr>
+          <w:lang w:val="en-US"/>
+        </w:rPr>
         <w:t xml:space="preserve"> </w:t>
       </w:r>
     </w:p>
@@ -462,7 +499,119 @@
         <w:rPr>
           <w:lang w:val="en-AE"/>
         </w:rPr>
-        <w:t>Recent research has focused on enhancing geospatial data accessibility through natural language interfaces powered by large language models (LLMs). Systems like ChatGeoAI by Mansourian and Oucheikh [1] and the SQL-generation framework by Jiang and Yang [2] enable users to perform GIS tasks or query spatial databases using natural language. ChatGeoAI employs LLaMA-2 to convert queries into executable PyQGIS scripts, while Jiang and Yang use ChatGPT to generate PostGIS-compatible SQL. Text-to-OverpassQL by Staniek et al. [3] further advances this by translating natural language into OverpassQL queries for OpenStreetMap, democratizing access to structured geodata.</w:t>
+        <w:t xml:space="preserve">Recent research has focused on enhancing geospatial data accessibility through natural language interfaces powered by large language models (LLMs). Systems like </w:t>
+      </w:r>
+      <w:proofErr w:type="spellStart"/>
+      <w:r>
+        <w:rPr>
+          <w:lang w:val="en-AE"/>
+        </w:rPr>
+        <w:t>ChatGeoAI</w:t>
+      </w:r>
+      <w:proofErr w:type="spellEnd"/>
+      <w:r>
+        <w:rPr>
+          <w:lang w:val="en-AE"/>
+        </w:rPr>
+        <w:t xml:space="preserve"> by Mansourian and </w:t>
+      </w:r>
+      <w:proofErr w:type="spellStart"/>
+      <w:r>
+        <w:rPr>
+          <w:lang w:val="en-AE"/>
+        </w:rPr>
+        <w:t>Oucheikh</w:t>
+      </w:r>
+      <w:proofErr w:type="spellEnd"/>
+      <w:r>
+        <w:rPr>
+          <w:lang w:val="en-AE"/>
+        </w:rPr>
+        <w:t xml:space="preserve"> [1] and the SQL-generation framework by Jiang and Yang [2] enable users to perform GIS tasks or query spatial databases using natural language. </w:t>
+      </w:r>
+      <w:proofErr w:type="spellStart"/>
+      <w:r>
+        <w:rPr>
+          <w:lang w:val="en-AE"/>
+        </w:rPr>
+        <w:t>ChatGeoAI</w:t>
+      </w:r>
+      <w:proofErr w:type="spellEnd"/>
+      <w:r>
+        <w:rPr>
+          <w:lang w:val="en-AE"/>
+        </w:rPr>
+        <w:t xml:space="preserve"> employs LLaMA-2 to convert queries into executable </w:t>
+      </w:r>
+      <w:proofErr w:type="spellStart"/>
+      <w:r>
+        <w:rPr>
+          <w:lang w:val="en-AE"/>
+        </w:rPr>
+        <w:t>PyQGIS</w:t>
+      </w:r>
+      <w:proofErr w:type="spellEnd"/>
+      <w:r>
+        <w:rPr>
+          <w:lang w:val="en-AE"/>
+        </w:rPr>
+        <w:t xml:space="preserve"> scripts, while Jiang and Yang use ChatGPT to generate </w:t>
+      </w:r>
+      <w:proofErr w:type="spellStart"/>
+      <w:r>
+        <w:rPr>
+          <w:lang w:val="en-AE"/>
+        </w:rPr>
+        <w:t>PostGIS</w:t>
+      </w:r>
+      <w:proofErr w:type="spellEnd"/>
+      <w:r>
+        <w:rPr>
+          <w:lang w:val="en-AE"/>
+        </w:rPr>
+        <w:t>-compatible SQL. Text-to-</w:t>
+      </w:r>
+      <w:proofErr w:type="spellStart"/>
+      <w:r>
+        <w:rPr>
+          <w:lang w:val="en-AE"/>
+        </w:rPr>
+        <w:t>OverpassQL</w:t>
+      </w:r>
+      <w:proofErr w:type="spellEnd"/>
+      <w:r>
+        <w:rPr>
+          <w:lang w:val="en-AE"/>
+        </w:rPr>
+        <w:t xml:space="preserve"> by </w:t>
+      </w:r>
+      <w:proofErr w:type="spellStart"/>
+      <w:r>
+        <w:rPr>
+          <w:lang w:val="en-AE"/>
+        </w:rPr>
+        <w:t>Staniek</w:t>
+      </w:r>
+      <w:proofErr w:type="spellEnd"/>
+      <w:r>
+        <w:rPr>
+          <w:lang w:val="en-AE"/>
+        </w:rPr>
+        <w:t xml:space="preserve"> et al. [3] further advances this by translating natural language into </w:t>
+      </w:r>
+      <w:proofErr w:type="spellStart"/>
+      <w:r>
+        <w:rPr>
+          <w:lang w:val="en-AE"/>
+        </w:rPr>
+        <w:t>OverpassQL</w:t>
+      </w:r>
+      <w:proofErr w:type="spellEnd"/>
+      <w:r>
+        <w:rPr>
+          <w:lang w:val="en-AE"/>
+        </w:rPr>
+        <w:t xml:space="preserve"> queries for OpenStreetMap, democratizing access to structured geodata.</w:t>
       </w:r>
     </w:p>
     <w:p>
@@ -483,7 +632,49 @@
         <w:rPr>
           <w:lang w:val="en-AE"/>
         </w:rPr>
-        <w:t>Other studies investigate how LLMs can interpret or extract geographic knowledge. GeoQAMap by Feng et al. [4] utilizes GPT-3.5 and Wikidata to answer geographic questions and visualize answers on maps. GeoAgent by Huang et al. [5] focuses on address standardization using ChatGLM-6B, showing how LLMs can resolve ambiguous and incomplete geospatial texts. Meanwhile, Bhandari et al. [6] evaluate whether large language models are geospatially knowledgeable, revealing that while some geospatial knowledge exists in pretrained models, it is often imprecise.</w:t>
+        <w:t xml:space="preserve">Other studies investigate how LLMs can interpret or extract geographic knowledge. </w:t>
+      </w:r>
+      <w:proofErr w:type="spellStart"/>
+      <w:r>
+        <w:rPr>
+          <w:lang w:val="en-AE"/>
+        </w:rPr>
+        <w:t>GeoQAMap</w:t>
+      </w:r>
+      <w:proofErr w:type="spellEnd"/>
+      <w:r>
+        <w:rPr>
+          <w:lang w:val="en-AE"/>
+        </w:rPr>
+        <w:t xml:space="preserve"> by Feng et al. [4] utilizes GPT-3.5 and </w:t>
+      </w:r>
+      <w:proofErr w:type="spellStart"/>
+      <w:r>
+        <w:rPr>
+          <w:lang w:val="en-AE"/>
+        </w:rPr>
+        <w:t>Wikidata</w:t>
+      </w:r>
+      <w:proofErr w:type="spellEnd"/>
+      <w:r>
+        <w:rPr>
+          <w:lang w:val="en-AE"/>
+        </w:rPr>
+        <w:t xml:space="preserve"> to answer geographic questions and visualize answers on maps. </w:t>
+      </w:r>
+      <w:proofErr w:type="spellStart"/>
+      <w:r>
+        <w:rPr>
+          <w:lang w:val="en-AE"/>
+        </w:rPr>
+        <w:t>GeoAgent</w:t>
+      </w:r>
+      <w:proofErr w:type="spellEnd"/>
+      <w:r>
+        <w:rPr>
+          <w:lang w:val="en-AE"/>
+        </w:rPr>
+        <w:t xml:space="preserve"> by Huang et al. [5] focuses on address standardization using ChatGLM-6B, showing how LLMs can resolve ambiguous and incomplete geospatial texts. Meanwhile, Bhandari et al. [6] evaluate whether large language models are geospatially knowledgeable, revealing that while some geospatial knowledge exists in pretrained models, it is often imprecise.</w:t>
       </w:r>
     </w:p>
     <w:p>
@@ -497,7 +688,35 @@
         <w:rPr>
           <w:lang w:val="en-AE"/>
         </w:rPr>
-        <w:t>To overcome these limitations, domain-adapted models have emerged. BB-GeoGPT by Zhang et al. [7] is a fine-tuned LLaMA-2 model trained on GIS texts and Q&amp;A pairs, outperforming general LLMs in spatial queries. Similarly, GeoLLM by Shah et al. [8] boosts geospatial prediction accuracy by embedding map-based contextual data into prompts. These efforts establish the foundation for natural language interaction with spatial systems but stop short of performing complex geospatial planning or optimization.</w:t>
+        <w:t>To overcome these limitations, domain-adapted models have emerged. BB-</w:t>
+      </w:r>
+      <w:proofErr w:type="spellStart"/>
+      <w:r>
+        <w:rPr>
+          <w:lang w:val="en-AE"/>
+        </w:rPr>
+        <w:t>GeoGPT</w:t>
+      </w:r>
+      <w:proofErr w:type="spellEnd"/>
+      <w:r>
+        <w:rPr>
+          <w:lang w:val="en-AE"/>
+        </w:rPr>
+        <w:t xml:space="preserve"> by Zhang et al. [7] is a fine-tuned LLaMA-2 model trained on GIS texts and Q&amp;A pairs, outperforming general LLMs in spatial queries. Similarly, </w:t>
+      </w:r>
+      <w:proofErr w:type="spellStart"/>
+      <w:r>
+        <w:rPr>
+          <w:lang w:val="en-AE"/>
+        </w:rPr>
+        <w:t>GeoLLM</w:t>
+      </w:r>
+      <w:proofErr w:type="spellEnd"/>
+      <w:r>
+        <w:rPr>
+          <w:lang w:val="en-AE"/>
+        </w:rPr>
+        <w:t xml:space="preserve"> by Shah et al. [8] boosts geospatial prediction accuracy by embedding map-based contextual data into prompts. These efforts establish the foundation for natural language interaction with spatial systems but stop short of performing complex geospatial planning or optimization.</w:t>
       </w:r>
     </w:p>
     <w:p>
@@ -530,7 +749,49 @@
         <w:rPr>
           <w:lang w:val="en-AE"/>
         </w:rPr>
-        <w:t>Advancements in GeoAI have expanded to multimodal systems integrating LLMs with visual and structured geospatial data. OmniGeo by Yuan et al. [9] exemplifies this trend by combining satellite imagery, map layers, and text data, enabling LLMs to perform diverse tasks such as land use classification and environmental forecasting. Geode by Wu et al. [10] and GTChain by Zhang et al. [11] extend LLMs into autonomous agents, coordinating APIs, GIS tools, and real-time databases to solve spatial tasks.</w:t>
+        <w:t xml:space="preserve">Advancements in </w:t>
+      </w:r>
+      <w:proofErr w:type="spellStart"/>
+      <w:r>
+        <w:rPr>
+          <w:lang w:val="en-AE"/>
+        </w:rPr>
+        <w:t>GeoAI</w:t>
+      </w:r>
+      <w:proofErr w:type="spellEnd"/>
+      <w:r>
+        <w:rPr>
+          <w:lang w:val="en-AE"/>
+        </w:rPr>
+        <w:t xml:space="preserve"> have expanded to multimodal systems integrating LLMs with visual and structured geospatial data. </w:t>
+      </w:r>
+      <w:proofErr w:type="spellStart"/>
+      <w:r>
+        <w:rPr>
+          <w:lang w:val="en-AE"/>
+        </w:rPr>
+        <w:t>OmniGeo</w:t>
+      </w:r>
+      <w:proofErr w:type="spellEnd"/>
+      <w:r>
+        <w:rPr>
+          <w:lang w:val="en-AE"/>
+        </w:rPr>
+        <w:t xml:space="preserve"> by Yuan et al. [9] exemplifies this trend by combining satellite imagery, map layers, and text data, enabling LLMs to perform diverse tasks such as land use classification and environmental forecasting. Geode by Wu et al. [10] and </w:t>
+      </w:r>
+      <w:proofErr w:type="spellStart"/>
+      <w:r>
+        <w:rPr>
+          <w:lang w:val="en-AE"/>
+        </w:rPr>
+        <w:t>GTChain</w:t>
+      </w:r>
+      <w:proofErr w:type="spellEnd"/>
+      <w:r>
+        <w:rPr>
+          <w:lang w:val="en-AE"/>
+        </w:rPr>
+        <w:t xml:space="preserve"> by Zhang et al. [11] extend LLMs into autonomous agents, coordinating APIs, GIS tools, and real-time databases to solve spatial tasks.</w:t>
       </w:r>
     </w:p>
     <w:p>
@@ -551,7 +812,21 @@
         <w:rPr>
           <w:lang w:val="en-AE"/>
         </w:rPr>
-        <w:t>These systems demonstrate the potential of LLMs in spatial reasoning, data retrieval, and geospatial tool orchestration. Geode performs zero-shot geospatial Q&amp;A with explicit reasoning and live data, while GTChain trains LLMs to generate tool-use chains for complex tasks in simulated GIS environments. The autonomous GIS agent by Ning et al. [12] also showcases how LLMs can be used to dynamically retrieve data across diverse spatial datasets, enhancing spatial decision-making workflows.</w:t>
+        <w:t xml:space="preserve">These systems demonstrate the potential of LLMs in spatial reasoning, data retrieval, and geospatial tool orchestration. Geode performs zero-shot geospatial Q&amp;A with explicit reasoning and live data, while </w:t>
+      </w:r>
+      <w:proofErr w:type="spellStart"/>
+      <w:r>
+        <w:rPr>
+          <w:lang w:val="en-AE"/>
+        </w:rPr>
+        <w:t>GTChain</w:t>
+      </w:r>
+      <w:proofErr w:type="spellEnd"/>
+      <w:r>
+        <w:rPr>
+          <w:lang w:val="en-AE"/>
+        </w:rPr>
+        <w:t xml:space="preserve"> trains LLMs to generate tool-use chains for complex tasks in simulated GIS environments. The autonomous GIS agent by Ning et al. [12] also showcases how LLMs can be used to dynamically retrieve data across diverse spatial datasets, enhancing spatial decision-making workflows.</w:t>
       </w:r>
     </w:p>
     <w:p>
@@ -565,7 +840,21 @@
         <w:rPr>
           <w:lang w:val="en-AE"/>
         </w:rPr>
-        <w:t>Despite these advancements, existing solutions lack targeted support for personalized route planning or environmental criteria integration. None of the reviewed systems directly tackle bicycle routing that adapts to vegetation or pollution levels. Our proposed GeoBikeLLM addresses this gap by combining LLMs with geospatial intelligence to deliver environment-aware, health-optimized bike route planning</w:t>
+        <w:t xml:space="preserve">Despite these advancements, existing solutions lack targeted support for personalized route planning or environmental criteria integration. None of the reviewed systems directly tackle bicycle routing that adapts to vegetation or pollution levels. Our proposed </w:t>
+      </w:r>
+      <w:proofErr w:type="spellStart"/>
+      <w:r>
+        <w:rPr>
+          <w:lang w:val="en-AE"/>
+        </w:rPr>
+        <w:t>GeoBikeLLM</w:t>
+      </w:r>
+      <w:proofErr w:type="spellEnd"/>
+      <w:r>
+        <w:rPr>
+          <w:lang w:val="en-AE"/>
+        </w:rPr>
+        <w:t xml:space="preserve"> addresses this gap by combining LLMs with geospatial intelligence to deliver environment-aware, health-optimized bike route planning</w:t>
       </w:r>
       <w:r>
         <w:rPr>
@@ -634,17 +923,445 @@
       </w:pPr>
       <w:r>
         <w:lastRenderedPageBreak/>
+        <w:t>NDVI Dataset</w:t>
+      </w:r>
+      <w:r>
+        <w:t xml:space="preserve">: </w:t>
+      </w:r>
+      <w:r>
+        <w:rPr>
+          <w:i w:val="0"/>
+        </w:rPr>
+        <w:t>The NDVI dataset provides spatial measurements of vegetation health across Chicago. Each entry corresponds to a specific location defined by geographic coordinates and includes a</w:t>
+      </w:r>
+      <w:r>
+        <w:rPr>
+          <w:i w:val="0"/>
+        </w:rPr>
+        <w:t xml:space="preserve"> ‘</w:t>
+      </w:r>
+      <w:r>
+        <w:rPr>
+          <w:i w:val="0"/>
+        </w:rPr>
+        <w:t>grid_code</w:t>
+      </w:r>
+      <w:r>
+        <w:rPr>
+          <w:i w:val="0"/>
+        </w:rPr>
+        <w:t>’</w:t>
+      </w:r>
+      <w:r>
+        <w:rPr>
+          <w:i w:val="0"/>
+        </w:rPr>
+        <w:t xml:space="preserve"> representing the NDVI value. Higher NDVI scores indicate greener areas, making this dataset essential for assessing environmental quality and greenery exposure during routing.</w:t>
+      </w:r>
+    </w:p>
+    <w:p>
+      <w:pPr>
+        <w:pStyle w:val="Heading3"/>
+        <w:spacing w:after="6pt"/>
+        <w:ind w:firstLine="14.45pt"/>
+        <w:rPr>
+          <w:i w:val="0"/>
+        </w:rPr>
+      </w:pPr>
+      <w:r>
+        <w:t>Bicycle Network Dataset</w:t>
+      </w:r>
+      <w:r>
+        <w:t xml:space="preserve">: </w:t>
+      </w:r>
+      <w:r>
+        <w:rPr>
+          <w:i w:val="0"/>
+        </w:rPr>
+        <w:t>This dataset captures the spatial structure of the bicycle infrastructure in Chicago, derived from OpenStreetMap (OSM). It includes details on individual bike path segments, such as start and end coordinates, segment lengths, and geometry data. The dataset supports the construction of a navigable network for route computation between user-defined locations.</w:t>
+      </w:r>
+    </w:p>
+    <w:p>
+      <w:pPr>
+        <w:pStyle w:val="BodyText"/>
+        <w:rPr>
+          <w:lang w:val="en-US"/>
+        </w:rPr>
+      </w:pPr>
+      <w:r>
+        <w:rPr>
+          <w:lang w:val="en-US"/>
+        </w:rPr>
+        <w:t>These datasets collectively enable the integration of air quality and environmental context into the spatial decision-making process for bicycle routing.</w:t>
+      </w:r>
+    </w:p>
+    <w:p>
+      <w:pPr>
+        <w:pStyle w:val="Heading2"/>
+        <w:rPr>
+          <w:rtl/>
+        </w:rPr>
+      </w:pPr>
+      <w:r>
+        <w:t>Dataset Visualization and Exploration</w:t>
+      </w:r>
+    </w:p>
+    <w:p>
+      <w:pPr>
+        <w:ind w:firstLine="14.40pt"/>
+        <w:jc w:val="start"/>
+      </w:pPr>
+      <w:r>
+        <w:t>To better understand the spatial distribution of air pollution and vegetation in Chicago, we performed exploratory visualizations using Folium and Python libraries. PM2.5 sensor data was plotted to identify high-pollution zones, while NDVI values were visualized to detect greener regions.</w:t>
+      </w:r>
+    </w:p>
+    <w:p>
+      <w:pPr>
+        <w:pStyle w:val="Heading3"/>
+        <w:rPr>
+          <w:rtl/>
+          <w:lang w:bidi="ar-AE"/>
+        </w:rPr>
+      </w:pPr>
+      <w:r>
+        <w:rPr>
+          <w:lang w:bidi="ar-AE"/>
+        </w:rPr>
+        <w:t>Air Quality</w:t>
+      </w:r>
+      <w:r>
+        <w:rPr>
+          <w:lang w:bidi="ar-AE"/>
+        </w:rPr>
+        <w:t xml:space="preserve"> Visualization</w:t>
+      </w:r>
+    </w:p>
+    <w:p>
+      <w:pPr>
+        <w:ind w:firstLine="14.40pt"/>
+        <w:jc w:val="both"/>
+        <w:rPr>
+          <w:lang w:val="en-AE" w:bidi="ar-AE"/>
+        </w:rPr>
+      </w:pPr>
+      <w:r>
+        <w:rPr>
+          <w:lang w:bidi="ar-AE"/>
+        </w:rPr>
+        <w:t xml:space="preserve">To visually explore the air quality dataset, a heatmap was generated using the PM2.5 readings across various geographic locations in Chicago. The map shown in </w:t>
+      </w:r>
+      <w:r>
+        <w:rPr>
+          <w:highlight w:val="red"/>
+          <w:lang w:bidi="ar-AE"/>
+        </w:rPr>
+        <w:t xml:space="preserve">Figure </w:t>
+      </w:r>
+      <w:r>
+        <w:rPr>
+          <w:lang w:bidi="ar-AE"/>
+        </w:rPr>
+        <w:t>1</w:t>
+      </w:r>
+      <w:r>
+        <w:rPr>
+          <w:lang w:bidi="ar-AE"/>
+        </w:rPr>
+        <w:t xml:space="preserve"> represents the normalized PM2.5 values, with areas of darker intensity indicating higher pollution concentrations.</w:t>
+      </w:r>
+      <w:r>
+        <w:rPr>
+          <w:lang w:bidi="ar-AE"/>
+        </w:rPr>
+        <w:t xml:space="preserve"> </w:t>
+      </w:r>
+      <w:r>
+        <w:rPr>
+          <w:lang w:val="en-AE" w:bidi="ar-AE"/>
+        </w:rPr>
+        <w:t xml:space="preserve">The heatmap was created by aggregating data from 19 CSV files hosted on GitHub, each containing latitude, longitude, and PM2.5 values for different parts of the city. After cleaning and normalizing the data using Min-Max scaling, each point was plotted using Folium’s </w:t>
+      </w:r>
+      <w:proofErr w:type="spellStart"/>
+      <w:r>
+        <w:rPr>
+          <w:lang w:val="en-AE" w:bidi="ar-AE"/>
+        </w:rPr>
+        <w:t>HeatMap</w:t>
+      </w:r>
+      <w:proofErr w:type="spellEnd"/>
+      <w:r>
+        <w:rPr>
+          <w:lang w:val="en-AE" w:bidi="ar-AE"/>
+        </w:rPr>
+        <w:t xml:space="preserve"> plugin. The visualization reveals several hotspots of elevated pollution, particularly along dense urban corridors and industrial zones.</w:t>
+      </w:r>
+    </w:p>
+    <w:p>
+      <w:pPr>
+        <w:ind w:firstLine="14.40pt"/>
+        <w:jc w:val="both"/>
+        <w:rPr>
+          <w:lang w:val="en-AE" w:bidi="ar-AE"/>
+        </w:rPr>
+      </w:pPr>
+      <w:r>
+        <w:rPr>
+          <w:lang w:val="en-AE" w:bidi="ar-AE"/>
+        </w:rPr>
+        <w:t>This spatial representation helps identify areas that may require further attention or intervention for environmental and public health planning.</w:t>
+      </w:r>
+    </w:p>
+    <w:p>
+      <w:pPr>
+        <w:pStyle w:val="BodyText"/>
+        <w:rPr>
+          <w:lang w:val="en-US"/>
+        </w:rPr>
+      </w:pPr>
+      <w:r>
+        <w:rPr>
+          <w:lang w:bidi="ar-AE"/>
+        </w:rPr>
         <w:drawing>
-          <wp:anchor distT="0" distB="0" distL="114300" distR="114300" simplePos="0" relativeHeight="251661312" behindDoc="0" locked="0" layoutInCell="1" allowOverlap="1" wp14:anchorId="6F6F9499" wp14:editId="01D447D0">
+          <wp:anchor distT="0" distB="0" distL="114300" distR="114300" simplePos="0" relativeHeight="251666432" behindDoc="1" locked="0" layoutInCell="1" allowOverlap="1" wp14:anchorId="62281B83" wp14:editId="37EA9C73">
             <wp:simplePos x="0" y="0"/>
             <wp:positionH relativeFrom="column">
-              <wp:posOffset>3781498</wp:posOffset>
+              <wp:align>right</wp:align>
             </wp:positionH>
             <wp:positionV relativeFrom="paragraph">
-              <wp:posOffset>790398</wp:posOffset>
+              <wp:posOffset>219368</wp:posOffset>
             </wp:positionV>
-            <wp:extent cx="2019300" cy="1746885"/>
-            <wp:effectExtent l="0" t="0" r="0" b="5715"/>
+            <wp:extent cx="3089910" cy="2256790"/>
+            <wp:effectExtent l="0" t="0" r="0" b="0"/>
+            <wp:wrapTight wrapText="bothSides">
+              <wp:wrapPolygon edited="0">
+                <wp:start x="0" y="0"/>
+                <wp:lineTo x="0" y="21333"/>
+                <wp:lineTo x="21440" y="21333"/>
+                <wp:lineTo x="21440" y="0"/>
+                <wp:lineTo x="0" y="0"/>
+              </wp:wrapPolygon>
+            </wp:wrapTight>
+            <wp:docPr id="1432589203" name="Picture 1" descr="A map of a city&#10;&#10;AI-generated content may be incorrect."/>
+            <wp:cNvGraphicFramePr>
+              <a:graphicFrameLocks xmlns:a="http://purl.oclc.org/ooxml/drawingml/main" noChangeAspect="1"/>
+            </wp:cNvGraphicFramePr>
+            <a:graphic xmlns:a="http://purl.oclc.org/ooxml/drawingml/main">
+              <a:graphicData uri="http://purl.oclc.org/ooxml/drawingml/picture">
+                <pic:pic xmlns:pic="http://purl.oclc.org/ooxml/drawingml/picture">
+                  <pic:nvPicPr>
+                    <pic:cNvPr id="1432589203" name="Picture 1" descr="A map of a city&#10;&#10;AI-generated content may be incorrect."/>
+                    <pic:cNvPicPr/>
+                  </pic:nvPicPr>
+                  <pic:blipFill>
+                    <a:blip r:embed="rId8" cstate="print">
+                      <a:extLst>
+                        <a:ext uri="{28A0092B-C50C-407E-A947-70E740481C1C}">
+                          <a14:useLocalDpi xmlns:a14="http://schemas.microsoft.com/office/drawing/2010/main" val="0"/>
+                        </a:ext>
+                      </a:extLst>
+                    </a:blip>
+                    <a:stretch>
+                      <a:fillRect/>
+                    </a:stretch>
+                  </pic:blipFill>
+                  <pic:spPr>
+                    <a:xfrm>
+                      <a:off x="0" y="0"/>
+                      <a:ext cx="3089910" cy="2256790"/>
+                    </a:xfrm>
+                    <a:prstGeom prst="rect">
+                      <a:avLst/>
+                    </a:prstGeom>
+                  </pic:spPr>
+                </pic:pic>
+              </a:graphicData>
+            </a:graphic>
+          </wp:anchor>
+        </w:drawing>
+      </w:r>
+    </w:p>
+    <w:p>
+      <w:pPr>
+        <w:pStyle w:val="BodyText"/>
+        <w:rPr>
+          <w:lang w:val="en-US"/>
+        </w:rPr>
+      </w:pPr>
+    </w:p>
+    <w:p>
+      <w:pPr>
+        <w:pStyle w:val="Heading2"/>
+      </w:pPr>
+      <w:r>
+        <w:t>Path Selection Module</w:t>
+      </w:r>
+    </w:p>
+    <w:p>
+      <w:pPr>
+        <w:pStyle w:val="BodyText"/>
+        <w:rPr>
+          <w:lang w:val="en-US"/>
+        </w:rPr>
+      </w:pPr>
+      <w:r>
+        <w:rPr>
+          <w:lang w:val="en-US"/>
+        </w:rPr>
+        <w:t xml:space="preserve">The core of the route planning logic involves constructing a weighted undirected graph from the Chicago bike lane dataset. Each edge represents a bike segment with an associated length, while nodes correspond to geospatial coordinates. To account for environmental quality, air pollution data (PM2.5) and vegetation density (NDVI) are spatially matched to each segment using nearest-neighbor querying via KD-Trees. </w:t>
+      </w:r>
+      <w:r>
+        <w:rPr>
+          <w:lang w:val="en-US"/>
+        </w:rPr>
+        <w:t>The cost of each edge is computed as shown in (1), where α and β control the influence of PM2.5 and NDVI</w:t>
+      </w:r>
+      <w:r>
+        <w:rPr>
+          <w:lang w:val="en-US"/>
+        </w:rPr>
+        <w:t>,</w:t>
+      </w:r>
+      <w:r>
+        <w:rPr>
+          <w:lang w:val="en-US"/>
+        </w:rPr>
+        <w:t xml:space="preserve"> respectively.</w:t>
+      </w:r>
+    </w:p>
+    <w:p>
+      <w:pPr>
+        <w:pStyle w:val="equation"/>
+        <w:rPr>
+          <w:rFonts w:hint="eastAsia"/>
+        </w:rPr>
+      </w:pPr>
+      <w:r>
+        <w:tab/>
+      </w:r>
+      <w:r>
+        <w:rPr>
+          <w:rFonts w:ascii="Times New Roman" w:hAnsi="Times New Roman" w:cs="Times New Roman"/>
+          <w:i/>
+        </w:rPr>
+        <w:t xml:space="preserve">Cost = </w:t>
+      </w:r>
+      <w:r>
+        <w:rPr>
+          <w:rFonts w:ascii="Times New Roman" w:hAnsi="Times New Roman" w:cs="Times New Roman"/>
+          <w:i/>
+        </w:rPr>
+        <w:t>length×</w:t>
+      </w:r>
+      <w:r>
+        <w:rPr>
+          <w:rFonts w:ascii="Times New Roman" w:hAnsi="Times New Roman" w:cs="Times New Roman"/>
+          <w:i/>
+        </w:rPr>
+        <w:t>(1+α</w:t>
+      </w:r>
+      <w:r>
+        <w:rPr>
+          <w:rFonts w:ascii="Cambria Math" w:hAnsi="Cambria Math" w:cs="Cambria Math"/>
+          <w:i/>
+        </w:rPr>
+        <w:t>⋅</w:t>
+      </w:r>
+      <w:r>
+        <w:rPr>
+          <w:rFonts w:ascii="Times New Roman" w:hAnsi="Times New Roman" w:cs="Times New Roman"/>
+          <w:i/>
+        </w:rPr>
+        <w:t>PM2.5−β</w:t>
+      </w:r>
+      <w:r>
+        <w:rPr>
+          <w:rFonts w:ascii="Cambria Math" w:hAnsi="Cambria Math" w:cs="Cambria Math"/>
+          <w:i/>
+        </w:rPr>
+        <w:t>⋅</w:t>
+      </w:r>
+      <w:r>
+        <w:rPr>
+          <w:rFonts w:ascii="Times New Roman" w:hAnsi="Times New Roman" w:cs="Times New Roman"/>
+          <w:i/>
+        </w:rPr>
+        <w:t>NDVI)</w:t>
+      </w:r>
+      <w:r>
+        <w:tab/>
+      </w:r>
+      <w:r>
+        <w:t></w:t>
+      </w:r>
+      <w:r>
+        <w:t></w:t>
+      </w:r>
+      <w:r>
+        <w:t></w:t>
+      </w:r>
+    </w:p>
+    <w:p>
+      <w:pPr>
+        <w:pStyle w:val="BodyText"/>
+        <w:rPr>
+          <w:lang w:val="en-US"/>
+        </w:rPr>
+      </w:pPr>
+      <w:r>
+        <w:rPr>
+          <w:lang w:val="en-AE"/>
+        </w:rPr>
+        <w:t>w</w:t>
+      </w:r>
+      <w:r>
+        <w:rPr>
+          <w:lang w:val="en-US"/>
+        </w:rPr>
+        <w:t>here α and β are tunable weights for penalizing poor air quality and rewarding greenery, respectively.</w:t>
+      </w:r>
+    </w:p>
+    <w:p>
+      <w:pPr>
+        <w:pStyle w:val="BodyText"/>
+        <w:rPr>
+          <w:lang w:val="en-US"/>
+        </w:rPr>
+      </w:pPr>
+      <w:r>
+        <w:rPr>
+          <w:lang w:val="en-US"/>
+        </w:rPr>
+        <w:t>To determine optimal bike paths, the system connects the user-specified origin and destination to the nearest nodes in the network via virtual edges. Then, using Yen’s algorithm, the top-k shortest paths are extracted based on the computed cost. A penalty is applied to reused edges across iterations to encourage route diversity. For each path, average PM2.5 and NDVI values are computed, and the route with the lowest pollution and highest greenery score is selected as the recommended path. This environmentally informed selection approach balances travel distance with health and ecological considerations, enabling context-aware route planning.</w:t>
+      </w:r>
+    </w:p>
+    <w:p>
+      <w:pPr>
+        <w:pStyle w:val="Heading2"/>
+      </w:pPr>
+      <w:r>
+        <w:t>LLM Integration</w:t>
+      </w:r>
+    </w:p>
+    <w:p>
+      <w:pPr>
+        <w:pStyle w:val="BodyText"/>
+        <w:rPr>
+          <w:lang w:val="en-US"/>
+        </w:rPr>
+      </w:pPr>
+      <w:r>
+        <w:drawing>
+          <wp:anchor distT="0" distB="0" distL="114300" distR="114300" simplePos="0" relativeHeight="251661312" behindDoc="0" locked="0" layoutInCell="1" allowOverlap="1" wp14:anchorId="6F6F9499" wp14:editId="5C014616">
+            <wp:simplePos x="0" y="0"/>
+            <wp:positionH relativeFrom="column">
+              <wp:posOffset>1854738</wp:posOffset>
+            </wp:positionH>
+            <wp:positionV relativeFrom="paragraph">
+              <wp:posOffset>473564</wp:posOffset>
+            </wp:positionV>
+            <wp:extent cx="1510665" cy="1306830"/>
+            <wp:effectExtent l="0" t="0" r="0" b="7620"/>
             <wp:wrapTopAndBottom/>
             <wp:docPr id="435129276" name="Picture 4" descr="A yellow and white text&#10;&#10;AI-generated content may be incorrect."/>
             <wp:cNvGraphicFramePr>
@@ -658,7 +1375,7 @@
                     <pic:cNvPicPr/>
                   </pic:nvPicPr>
                   <pic:blipFill>
-                    <a:blip r:embed="rId8">
+                    <a:blip r:embed="rId9" cstate="print">
                       <a:extLst>
                         <a:ext uri="{28A0092B-C50C-407E-A947-70E740481C1C}">
                           <a14:useLocalDpi xmlns:a14="http://schemas.microsoft.com/office/drawing/2010/main" val="0"/>
@@ -672,7 +1389,7 @@
                   <pic:spPr>
                     <a:xfrm>
                       <a:off x="0" y="0"/>
-                      <a:ext cx="2019300" cy="1746885"/>
+                      <a:ext cx="1510665" cy="1306830"/>
                     </a:xfrm>
                     <a:prstGeom prst="rect">
                       <a:avLst/>
@@ -681,218 +1398,29 @@
                 </pic:pic>
               </a:graphicData>
             </a:graphic>
+            <wp14:sizeRelH relativeFrom="margin">
+              <wp14:pctWidth>0%</wp14:pctWidth>
+            </wp14:sizeRelH>
+            <wp14:sizeRelV relativeFrom="margin">
+              <wp14:pctHeight>0%</wp14:pctHeight>
+            </wp14:sizeRelV>
           </wp:anchor>
         </w:drawing>
       </w:r>
       <w:r>
-        <w:t>NDVI Dataset</w:t>
-      </w:r>
-      <w:r>
-        <w:t xml:space="preserve">: </w:t>
-      </w:r>
-      <w:r>
-        <w:rPr>
-          <w:i w:val="0"/>
-        </w:rPr>
-        <w:t>The NDVI dataset provides spatial measurements of vegetation health across Chicago. Each entry corresponds to a specific location defined by geographic coordinates and includes a</w:t>
-      </w:r>
-      <w:r>
-        <w:rPr>
-          <w:i w:val="0"/>
-        </w:rPr>
-        <w:t xml:space="preserve"> ‘</w:t>
-      </w:r>
-      <w:r>
-        <w:rPr>
-          <w:i w:val="0"/>
-        </w:rPr>
-        <w:t>grid_code</w:t>
-      </w:r>
-      <w:r>
-        <w:rPr>
-          <w:i w:val="0"/>
-        </w:rPr>
-        <w:t>’</w:t>
-      </w:r>
-      <w:r>
-        <w:rPr>
-          <w:i w:val="0"/>
-        </w:rPr>
-        <w:t xml:space="preserve"> representing the NDVI value. Higher NDVI scores indicate greener areas, making this dataset essential for assessing environmental quality and greenery exposure during routing.</w:t>
-      </w:r>
-    </w:p>
-    <w:p>
-      <w:pPr>
-        <w:pStyle w:val="Heading3"/>
-        <w:spacing w:after="6pt"/>
-        <w:ind w:firstLine="14.45pt"/>
-        <w:rPr>
-          <w:i w:val="0"/>
-        </w:rPr>
-      </w:pPr>
-      <w:r>
-        <w:t>Bicycle Network Dataset</w:t>
-      </w:r>
-      <w:r>
-        <w:t xml:space="preserve">: </w:t>
-      </w:r>
-      <w:r>
-        <w:rPr>
-          <w:i w:val="0"/>
-        </w:rPr>
-        <w:t>This dataset captures the spatial structure of the bicycle infrastructure in Chicago, derived from OpenStreetMap (OSM). It includes details on individual bike path segments, such as start and end coordinates, segment lengths, and geometry data. The dataset supports the construction of a navigable network for route computation between user-defined locations.</w:t>
-      </w:r>
-    </w:p>
-    <w:p>
-      <w:pPr>
-        <w:pStyle w:val="BodyText"/>
-        <w:rPr>
-          <w:lang w:val="en-US"/>
-        </w:rPr>
-      </w:pPr>
-      <w:r>
-        <w:rPr>
-          <w:lang w:val="en-US"/>
-        </w:rPr>
-        <w:t>These datasets collectively enable the integration of air quality and environmental context into the spatial decision-making process for bicycle routing.</w:t>
-      </w:r>
-    </w:p>
-    <w:p>
-      <w:pPr>
-        <w:pStyle w:val="Heading2"/>
-      </w:pPr>
-      <w:r>
-        <w:t>Path Selection Module</w:t>
-      </w:r>
-    </w:p>
-    <w:p>
-      <w:pPr>
-        <w:pStyle w:val="BodyText"/>
-        <w:rPr>
-          <w:lang w:val="en-US"/>
-        </w:rPr>
-      </w:pPr>
-      <w:r>
-        <w:rPr>
-          <w:lang w:val="en-US"/>
-        </w:rPr>
-        <w:t xml:space="preserve">The core of the route planning logic involves constructing a weighted undirected graph from the Chicago bike lane dataset. Each edge represents a bike segment with an associated length, while nodes correspond to geospatial coordinates. To account for environmental quality, air pollution data (PM2.5) and vegetation density (NDVI) are spatially matched to each segment using nearest-neighbor querying via KD-Trees. </w:t>
-      </w:r>
-      <w:r>
-        <w:rPr>
-          <w:lang w:val="en-US"/>
-        </w:rPr>
-        <w:t>The cost of each edge is computed as shown in (1), where α and β control the influence of PM2.5 and NDVI</w:t>
-      </w:r>
-      <w:r>
-        <w:rPr>
-          <w:lang w:val="en-US"/>
-        </w:rPr>
-        <w:t>,</w:t>
-      </w:r>
-      <w:r>
-        <w:rPr>
-          <w:lang w:val="en-US"/>
-        </w:rPr>
-        <w:t xml:space="preserve"> respectively.</w:t>
-      </w:r>
-    </w:p>
-    <w:p>
-      <w:pPr>
-        <w:pStyle w:val="equation"/>
-        <w:rPr>
-          <w:rFonts w:hint="eastAsia"/>
-        </w:rPr>
-      </w:pPr>
-      <w:r>
-        <w:tab/>
-      </w:r>
-      <w:r>
-        <w:rPr>
-          <w:rFonts w:ascii="Times New Roman" w:hAnsi="Times New Roman" w:cs="Times New Roman"/>
-          <w:i/>
-        </w:rPr>
-        <w:t xml:space="preserve">Cost = </w:t>
-      </w:r>
-      <w:r>
-        <w:rPr>
-          <w:rFonts w:ascii="Times New Roman" w:hAnsi="Times New Roman" w:cs="Times New Roman"/>
-          <w:i/>
-        </w:rPr>
-        <w:t>length×</w:t>
-      </w:r>
-      <w:r>
-        <w:rPr>
-          <w:rFonts w:ascii="Times New Roman" w:hAnsi="Times New Roman" w:cs="Times New Roman"/>
-          <w:i/>
-        </w:rPr>
-        <w:t>(1+α</w:t>
-      </w:r>
-      <w:r>
-        <w:rPr>
-          <w:rFonts w:ascii="Cambria Math" w:hAnsi="Cambria Math" w:cs="Cambria Math"/>
-          <w:i/>
-        </w:rPr>
-        <w:t>⋅</w:t>
-      </w:r>
-      <w:r>
-        <w:rPr>
-          <w:rFonts w:ascii="Times New Roman" w:hAnsi="Times New Roman" w:cs="Times New Roman"/>
-          <w:i/>
-        </w:rPr>
-        <w:t>PM2.5−β</w:t>
-      </w:r>
-      <w:r>
-        <w:rPr>
-          <w:rFonts w:ascii="Cambria Math" w:hAnsi="Cambria Math" w:cs="Cambria Math"/>
-          <w:i/>
-        </w:rPr>
-        <w:t>⋅</w:t>
-      </w:r>
-      <w:r>
-        <w:rPr>
-          <w:rFonts w:ascii="Times New Roman" w:hAnsi="Times New Roman" w:cs="Times New Roman"/>
-          <w:i/>
-        </w:rPr>
-        <w:t>NDVI)</w:t>
-      </w:r>
-      <w:r>
-        <w:tab/>
-      </w:r>
-      <w:r>
-        <w:t></w:t>
-      </w:r>
-      <w:r>
-        <w:t></w:t>
-      </w:r>
-      <w:r>
-        <w:t></w:t>
-      </w:r>
-    </w:p>
-    <w:p>
-      <w:pPr>
-        <w:pStyle w:val="BodyText"/>
-        <w:rPr>
-          <w:lang w:val="en-US"/>
-        </w:rPr>
-      </w:pPr>
-      <w:r>
-        <w:rPr>
-          <w:noProof/>
-        </w:rPr>
         <w:drawing>
-          <wp:anchor distT="0" distB="0" distL="114300" distR="114300" simplePos="0" relativeHeight="251659264" behindDoc="0" locked="0" layoutInCell="1" allowOverlap="1" wp14:anchorId="4D139A7F" wp14:editId="1BF50330">
+          <wp:anchor distT="0" distB="0" distL="114300" distR="114300" simplePos="0" relativeHeight="251665408" behindDoc="0" locked="0" layoutInCell="1" allowOverlap="1" wp14:anchorId="6D6ACF9A" wp14:editId="7E90EE1A">
             <wp:simplePos x="0" y="0"/>
             <wp:positionH relativeFrom="column">
-              <wp:posOffset>3804719</wp:posOffset>
+              <wp:posOffset>-635</wp:posOffset>
             </wp:positionH>
             <wp:positionV relativeFrom="paragraph">
-              <wp:posOffset>226326</wp:posOffset>
+              <wp:posOffset>409624</wp:posOffset>
             </wp:positionV>
-            <wp:extent cx="2132330" cy="1392555"/>
-            <wp:effectExtent l="0" t="0" r="1270" b="0"/>
+            <wp:extent cx="1707515" cy="1477010"/>
+            <wp:effectExtent l="0" t="0" r="6985" b="8890"/>
             <wp:wrapTopAndBottom/>
-            <wp:docPr id="502207992" name="Picture 3" descr="A screenshot of a computer code&#10;&#10;AI-generated content may be incorrect."/>
+            <wp:docPr id="522282981" name="Picture 4" descr="A yellow and white text&#10;&#10;AI-generated content may be incorrect."/>
             <wp:cNvGraphicFramePr>
               <a:graphicFrameLocks xmlns:a="http://purl.oclc.org/ooxml/drawingml/main" noChangeAspect="1"/>
             </wp:cNvGraphicFramePr>
@@ -900,7 +1428,7 @@
               <a:graphicData uri="http://purl.oclc.org/ooxml/drawingml/picture">
                 <pic:pic xmlns:pic="http://purl.oclc.org/ooxml/drawingml/picture">
                   <pic:nvPicPr>
-                    <pic:cNvPr id="502207992" name="Picture 3" descr="A screenshot of a computer code&#10;&#10;AI-generated content may be incorrect."/>
+                    <pic:cNvPr id="435129276" name="Picture 4" descr="A yellow and white text&#10;&#10;AI-generated content may be incorrect."/>
                     <pic:cNvPicPr/>
                   </pic:nvPicPr>
                   <pic:blipFill>
@@ -918,7 +1446,7 @@
                   <pic:spPr>
                     <a:xfrm>
                       <a:off x="0" y="0"/>
-                      <a:ext cx="2132330" cy="1392555"/>
+                      <a:ext cx="1707515" cy="1477010"/>
                     </a:xfrm>
                     <a:prstGeom prst="rect">
                       <a:avLst/>
@@ -927,67 +1455,45 @@
                 </pic:pic>
               </a:graphicData>
             </a:graphic>
+            <wp14:sizeRelH relativeFrom="margin">
+              <wp14:pctWidth>0%</wp14:pctWidth>
+            </wp14:sizeRelH>
+            <wp14:sizeRelV relativeFrom="margin">
+              <wp14:pctHeight>0%</wp14:pctHeight>
+            </wp14:sizeRelV>
           </wp:anchor>
         </w:drawing>
       </w:r>
       <w:r>
         <w:rPr>
-          <w:lang w:val="en-AE"/>
-        </w:rPr>
-        <w:t>w</w:t>
-      </w:r>
-      <w:r>
-        <w:rPr>
           <w:lang w:val="en-US"/>
         </w:rPr>
-        <w:t>here α and β are tunable weights for penalizing poor air quality and rewarding greenery, respectively.</w:t>
-      </w:r>
-    </w:p>
-    <w:p>
-      <w:pPr>
-        <w:pStyle w:val="BodyText"/>
+        <w:t xml:space="preserve">In the proposed routing system, two LLMs are integrated using the </w:t>
+      </w:r>
+      <w:proofErr w:type="spellStart"/>
+      <w:r>
         <w:rPr>
           <w:lang w:val="en-US"/>
         </w:rPr>
-      </w:pPr>
+        <w:t>Groq</w:t>
+      </w:r>
+      <w:proofErr w:type="spellEnd"/>
       <w:r>
         <w:rPr>
           <w:lang w:val="en-US"/>
         </w:rPr>
-        <w:t>To determine optimal bike paths, the system connects the user-specified origin and destination to the nearest nodes in the network via virtual edges. Then, using Yen’s algorithm, the top-k shortest paths are extracted based on the computed cost. A penalty is applied to reused edges across iterations to encourage route diversity. For each path, average PM2.5 and NDVI values are computed, and the route with the lowest pollution and highest greenery score is selected as the recommended path. This environmentally informed selection approach balances travel distance with health and ecological considerations, enabling context-aware route planning.</w:t>
-      </w:r>
-    </w:p>
-    <w:p>
-      <w:pPr>
-        <w:pStyle w:val="Heading2"/>
-      </w:pPr>
-      <w:r>
-        <w:t>LLM Integration</w:t>
-      </w:r>
-    </w:p>
-    <w:p>
-      <w:pPr>
-        <w:pStyle w:val="BodyText"/>
+        <w:t xml:space="preserve"> API to enhance the </w:t>
+      </w:r>
+      <w:r>
         <w:rPr>
           <w:lang w:val="en-US"/>
         </w:rPr>
-      </w:pPr>
+        <w:t>NLP</w:t>
+      </w:r>
       <w:r>
         <w:rPr>
           <w:lang w:val="en-US"/>
         </w:rPr>
-        <w:t xml:space="preserve">In the proposed routing system, two LLMs are integrated using the Groq API to enhance the </w:t>
-      </w:r>
-      <w:r>
-        <w:rPr>
-          <w:lang w:val="en-US"/>
-        </w:rPr>
-        <w:t>NLP</w:t>
-      </w:r>
-      <w:r>
-        <w:rPr>
-          <w:lang w:val="en-US"/>
-        </w:rPr>
         <w:t xml:space="preserve"> and explanation capabilities of the application.</w:t>
       </w:r>
     </w:p>
@@ -1020,13 +1526,7 @@
         <w:rPr>
           <w:i w:val="0"/>
         </w:rPr>
-        <w:t xml:space="preserve">As shown in </w:t>
-      </w:r>
-      <w:r>
-        <w:rPr>
-          <w:i w:val="0"/>
-        </w:rPr>
-        <w:t>Figure </w:t>
+        <w:t>As shown in Figure </w:t>
       </w:r>
       <w:r>
         <w:rPr>
@@ -1211,7 +1711,21 @@
         <w:rPr>
           <w:lang w:val="en-AE"/>
         </w:rPr>
-        <w:t xml:space="preserve">The GeoBikeLLM system enables natural language-based bike route planning within Chicago, Illinois, by integrating environmental and spatial data to recommend optimized cycling paths. Users interact with the system by entering a prompt such as </w:t>
+        <w:t xml:space="preserve">The </w:t>
+      </w:r>
+      <w:proofErr w:type="spellStart"/>
+      <w:r>
+        <w:rPr>
+          <w:lang w:val="en-AE"/>
+        </w:rPr>
+        <w:t>GeoBikeLLM</w:t>
+      </w:r>
+      <w:proofErr w:type="spellEnd"/>
+      <w:r>
+        <w:rPr>
+          <w:lang w:val="en-AE"/>
+        </w:rPr>
+        <w:t xml:space="preserve"> system enables natural language-based bike route planning within Chicago, Illinois, by integrating environmental and spatial data to recommend optimized cycling paths. Users interact with the system by entering a prompt such as </w:t>
       </w:r>
       <w:r>
         <w:rPr>
@@ -1233,12 +1747,21 @@
         </w:rPr>
         <w:t xml:space="preserve"> </w:t>
       </w:r>
+      <w:proofErr w:type="spellStart"/>
       <w:r>
         <w:rPr>
           <w:color w:val="FF0000"/>
           <w:lang w:val="en-AE"/>
         </w:rPr>
-        <w:t xml:space="preserve">num (caption: System prompt provided to the LLM for extracting origin and destination.), </w:t>
+        <w:t>num</w:t>
+      </w:r>
+      <w:proofErr w:type="spellEnd"/>
+      <w:r>
+        <w:rPr>
+          <w:color w:val="FF0000"/>
+          <w:lang w:val="en-AE"/>
+        </w:rPr>
+        <w:t xml:space="preserve"> (caption: System prompt provided to the LLM for extracting origin and destination.), </w:t>
       </w:r>
       <w:r>
         <w:rPr>
@@ -1349,7 +1872,21 @@
         <w:rPr>
           <w:lang w:val="en-AE"/>
         </w:rPr>
-        <w:t>. These sliders eliminate the need to express routing preferences within the prompt itself. The air quality slider (α) penalizes routes with higher PM2.5 levels, while the greenness slider (β) favors paths with higher Normalized Difference Vegetation Index (NDVI) values.</w:t>
+        <w:t xml:space="preserve">. These sliders eliminate the need to express routing preferences within the prompt itself. The air quality slider (α) penalizes routes with higher PM2.5 levels, while the greenness slider (β) </w:t>
+      </w:r>
+      <w:proofErr w:type="spellStart"/>
+      <w:r>
+        <w:rPr>
+          <w:lang w:val="en-AE"/>
+        </w:rPr>
+        <w:t>favors</w:t>
+      </w:r>
+      <w:proofErr w:type="spellEnd"/>
+      <w:r>
+        <w:rPr>
+          <w:lang w:val="en-AE"/>
+        </w:rPr>
+        <w:t xml:space="preserve"> paths with higher Normalized Difference Vegetation Index (NDVI) values.</w:t>
       </w:r>
     </w:p>
     <w:p>
@@ -1772,7 +2309,6 @@
         <w:rPr>
           <w:lang w:val="fr-FR"/>
         </w:rPr>
-        <w:lastRenderedPageBreak/>
         <w:t xml:space="preserve">Zhang, Z., et al. (2024a). </w:t>
       </w:r>
       <w:r>

</xml_diff>

<commit_message>
Editing LLM evaluation subsection
</commit_message>
<xml_diff>
--- a/GeoBikeLLM Paper.docx
+++ b/GeoBikeLLM Paper.docx
@@ -350,30 +350,39 @@
       <w:r>
         <w:t>Keywords—</w:t>
       </w:r>
+      <w:proofErr w:type="gramStart"/>
       <w:r>
         <w:t xml:space="preserve">Geospatial </w:t>
       </w:r>
       <w:r>
         <w:t>,</w:t>
       </w:r>
+      <w:proofErr w:type="gramEnd"/>
       <w:r>
         <w:t xml:space="preserve"> </w:t>
       </w:r>
+      <w:proofErr w:type="gramStart"/>
       <w:r>
         <w:t xml:space="preserve">LLM </w:t>
       </w:r>
       <w:r>
         <w:t>,</w:t>
       </w:r>
+      <w:proofErr w:type="gramEnd"/>
       <w:r>
         <w:t xml:space="preserve"> </w:t>
       </w:r>
       <w:r>
-        <w:t xml:space="preserve">Air Quality </w:t>
+        <w:t xml:space="preserve">Air </w:t>
+      </w:r>
+      <w:proofErr w:type="gramStart"/>
+      <w:r>
+        <w:t xml:space="preserve">Quality </w:t>
       </w:r>
       <w:r>
         <w:t>,</w:t>
       </w:r>
+      <w:proofErr w:type="gramEnd"/>
       <w:r>
         <w:t xml:space="preserve"> </w:t>
       </w:r>
@@ -422,52 +431,24 @@
         <w:rPr>
           <w:lang w:val="en-US"/>
         </w:rPr>
-        <w:t xml:space="preserve">Recent advancements in </w:t>
-      </w:r>
-      <w:proofErr w:type="spellStart"/>
+        <w:t xml:space="preserve">Recent advancements in GeoAI and LLM research have enabled natural language interfaces for querying and interpreting geospatial data. Studies have explored both LLM-augmented spatial querying and multimodal systems integrating maps, satellite imagery, and text for environmental reasoning. This section reviews existing approaches and highlights the gap </w:t>
+      </w:r>
       <w:r>
         <w:rPr>
           <w:lang w:val="en-US"/>
         </w:rPr>
-        <w:t>GeoAI</w:t>
-      </w:r>
-      <w:proofErr w:type="spellEnd"/>
+        <w:t xml:space="preserve">that </w:t>
+      </w:r>
       <w:r>
         <w:rPr>
           <w:lang w:val="en-US"/>
         </w:rPr>
-        <w:t xml:space="preserve"> and LLM research have enabled natural language interfaces for querying and interpreting geospatial data. Studies have explored both LLM-augmented spatial querying and multimodal systems integrating maps, satellite imagery, and text for environmental reasoning. This section reviews existing approaches and highlights the gap </w:t>
+        <w:t>our proposed GeoBikeLLM system aims to fill.</w:t>
       </w:r>
       <w:r>
         <w:rPr>
           <w:lang w:val="en-US"/>
         </w:rPr>
-        <w:t xml:space="preserve">that </w:t>
-      </w:r>
-      <w:r>
-        <w:rPr>
-          <w:lang w:val="en-US"/>
-        </w:rPr>
-        <w:t xml:space="preserve">our proposed </w:t>
-      </w:r>
-      <w:proofErr w:type="spellStart"/>
-      <w:r>
-        <w:rPr>
-          <w:lang w:val="en-US"/>
-        </w:rPr>
-        <w:t>GeoBikeLLM</w:t>
-      </w:r>
-      <w:proofErr w:type="spellEnd"/>
-      <w:r>
-        <w:rPr>
-          <w:lang w:val="en-US"/>
-        </w:rPr>
-        <w:t xml:space="preserve"> system aims to fill.</w:t>
-      </w:r>
-      <w:r>
-        <w:rPr>
-          <w:lang w:val="en-US"/>
-        </w:rPr>
         <w:t xml:space="preserve"> </w:t>
       </w:r>
     </w:p>
@@ -490,119 +471,7 @@
         <w:rPr>
           <w:lang w:val="en-AE"/>
         </w:rPr>
-        <w:t xml:space="preserve">Recent research has focused on enhancing geospatial data accessibility through natural language interfaces powered by large language models (LLMs). Systems like </w:t>
-      </w:r>
-      <w:proofErr w:type="spellStart"/>
-      <w:r>
-        <w:rPr>
-          <w:lang w:val="en-AE"/>
-        </w:rPr>
-        <w:t>ChatGeoAI</w:t>
-      </w:r>
-      <w:proofErr w:type="spellEnd"/>
-      <w:r>
-        <w:rPr>
-          <w:lang w:val="en-AE"/>
-        </w:rPr>
-        <w:t xml:space="preserve"> by Mansourian and </w:t>
-      </w:r>
-      <w:proofErr w:type="spellStart"/>
-      <w:r>
-        <w:rPr>
-          <w:lang w:val="en-AE"/>
-        </w:rPr>
-        <w:t>Oucheikh</w:t>
-      </w:r>
-      <w:proofErr w:type="spellEnd"/>
-      <w:r>
-        <w:rPr>
-          <w:lang w:val="en-AE"/>
-        </w:rPr>
-        <w:t xml:space="preserve"> [1] and the SQL-generation framework by Jiang and Yang [2] enable users to perform GIS tasks or query spatial databases using natural language. </w:t>
-      </w:r>
-      <w:proofErr w:type="spellStart"/>
-      <w:r>
-        <w:rPr>
-          <w:lang w:val="en-AE"/>
-        </w:rPr>
-        <w:t>ChatGeoAI</w:t>
-      </w:r>
-      <w:proofErr w:type="spellEnd"/>
-      <w:r>
-        <w:rPr>
-          <w:lang w:val="en-AE"/>
-        </w:rPr>
-        <w:t xml:space="preserve"> employs LLaMA-2 to convert queries into executable </w:t>
-      </w:r>
-      <w:proofErr w:type="spellStart"/>
-      <w:r>
-        <w:rPr>
-          <w:lang w:val="en-AE"/>
-        </w:rPr>
-        <w:t>PyQGIS</w:t>
-      </w:r>
-      <w:proofErr w:type="spellEnd"/>
-      <w:r>
-        <w:rPr>
-          <w:lang w:val="en-AE"/>
-        </w:rPr>
-        <w:t xml:space="preserve"> scripts, while Jiang and Yang use ChatGPT to generate </w:t>
-      </w:r>
-      <w:proofErr w:type="spellStart"/>
-      <w:r>
-        <w:rPr>
-          <w:lang w:val="en-AE"/>
-        </w:rPr>
-        <w:t>PostGIS</w:t>
-      </w:r>
-      <w:proofErr w:type="spellEnd"/>
-      <w:r>
-        <w:rPr>
-          <w:lang w:val="en-AE"/>
-        </w:rPr>
-        <w:t>-compatible SQL. Text-to-</w:t>
-      </w:r>
-      <w:proofErr w:type="spellStart"/>
-      <w:r>
-        <w:rPr>
-          <w:lang w:val="en-AE"/>
-        </w:rPr>
-        <w:t>OverpassQL</w:t>
-      </w:r>
-      <w:proofErr w:type="spellEnd"/>
-      <w:r>
-        <w:rPr>
-          <w:lang w:val="en-AE"/>
-        </w:rPr>
-        <w:t xml:space="preserve"> by </w:t>
-      </w:r>
-      <w:proofErr w:type="spellStart"/>
-      <w:r>
-        <w:rPr>
-          <w:lang w:val="en-AE"/>
-        </w:rPr>
-        <w:t>Staniek</w:t>
-      </w:r>
-      <w:proofErr w:type="spellEnd"/>
-      <w:r>
-        <w:rPr>
-          <w:lang w:val="en-AE"/>
-        </w:rPr>
-        <w:t xml:space="preserve"> et al. [3] further advances this by translating natural language into </w:t>
-      </w:r>
-      <w:proofErr w:type="spellStart"/>
-      <w:r>
-        <w:rPr>
-          <w:lang w:val="en-AE"/>
-        </w:rPr>
-        <w:t>OverpassQL</w:t>
-      </w:r>
-      <w:proofErr w:type="spellEnd"/>
-      <w:r>
-        <w:rPr>
-          <w:lang w:val="en-AE"/>
-        </w:rPr>
-        <w:t xml:space="preserve"> queries for OpenStreetMap, democratizing access to structured geodata.</w:t>
+        <w:t>Recent research has focused on enhancing geospatial data accessibility through natural language interfaces powered by large language models (LLMs). Systems like ChatGeoAI by Mansourian and Oucheikh [1] and the SQL-generation framework by Jiang and Yang [2] enable users to perform GIS tasks or query spatial databases using natural language. ChatGeoAI employs LLaMA-2 to convert queries into executable PyQGIS scripts, while Jiang and Yang use ChatGPT to generate PostGIS-compatible SQL. Text-to-OverpassQL by Staniek et al. [3] further advances this by translating natural language into OverpassQL queries for OpenStreetMap, democratizing access to structured geodata.</w:t>
       </w:r>
     </w:p>
     <w:p>
@@ -623,49 +492,7 @@
         <w:rPr>
           <w:lang w:val="en-AE"/>
         </w:rPr>
-        <w:t xml:space="preserve">Other studies investigate how LLMs can interpret or extract geographic knowledge. </w:t>
-      </w:r>
-      <w:proofErr w:type="spellStart"/>
-      <w:r>
-        <w:rPr>
-          <w:lang w:val="en-AE"/>
-        </w:rPr>
-        <w:t>GeoQAMap</w:t>
-      </w:r>
-      <w:proofErr w:type="spellEnd"/>
-      <w:r>
-        <w:rPr>
-          <w:lang w:val="en-AE"/>
-        </w:rPr>
-        <w:t xml:space="preserve"> by Feng et al. [4] utilizes GPT-3.5 and </w:t>
-      </w:r>
-      <w:proofErr w:type="spellStart"/>
-      <w:r>
-        <w:rPr>
-          <w:lang w:val="en-AE"/>
-        </w:rPr>
-        <w:t>Wikidata</w:t>
-      </w:r>
-      <w:proofErr w:type="spellEnd"/>
-      <w:r>
-        <w:rPr>
-          <w:lang w:val="en-AE"/>
-        </w:rPr>
-        <w:t xml:space="preserve"> to answer geographic questions and visualize answers on maps. </w:t>
-      </w:r>
-      <w:proofErr w:type="spellStart"/>
-      <w:r>
-        <w:rPr>
-          <w:lang w:val="en-AE"/>
-        </w:rPr>
-        <w:t>GeoAgent</w:t>
-      </w:r>
-      <w:proofErr w:type="spellEnd"/>
-      <w:r>
-        <w:rPr>
-          <w:lang w:val="en-AE"/>
-        </w:rPr>
-        <w:t xml:space="preserve"> by Huang et al. [5] focuses on address standardization using ChatGLM-6B, showing how LLMs can resolve ambiguous and incomplete geospatial texts. Meanwhile, Bhandari et al. [6] evaluate whether large language models are geospatially knowledgeable, revealing that while some geospatial knowledge exists in pretrained models, it is often imprecise.</w:t>
+        <w:t>Other studies investigate how LLMs can interpret or extract geographic knowledge. GeoQAMap by Feng et al. [4] utilizes GPT-3.5 and Wikidata to answer geographic questions and visualize answers on maps. GeoAgent by Huang et al. [5] focuses on address standardization using ChatGLM-6B, showing how LLMs can resolve ambiguous and incomplete geospatial texts. Meanwhile, Bhandari et al. [6] evaluate whether large language models are geospatially knowledgeable, revealing that while some geospatial knowledge exists in pretrained models, it is often imprecise.</w:t>
       </w:r>
     </w:p>
     <w:p>
@@ -679,35 +506,7 @@
         <w:rPr>
           <w:lang w:val="en-AE"/>
         </w:rPr>
-        <w:t>To overcome these limitations, domain-adapted models have emerged. BB-</w:t>
-      </w:r>
-      <w:proofErr w:type="spellStart"/>
-      <w:r>
-        <w:rPr>
-          <w:lang w:val="en-AE"/>
-        </w:rPr>
-        <w:t>GeoGPT</w:t>
-      </w:r>
-      <w:proofErr w:type="spellEnd"/>
-      <w:r>
-        <w:rPr>
-          <w:lang w:val="en-AE"/>
-        </w:rPr>
-        <w:t xml:space="preserve"> by Zhang et al. [7] is a fine-tuned LLaMA-2 model trained on GIS texts and Q&amp;A pairs, outperforming general LLMs in spatial queries. Similarly, </w:t>
-      </w:r>
-      <w:proofErr w:type="spellStart"/>
-      <w:r>
-        <w:rPr>
-          <w:lang w:val="en-AE"/>
-        </w:rPr>
-        <w:t>GeoLLM</w:t>
-      </w:r>
-      <w:proofErr w:type="spellEnd"/>
-      <w:r>
-        <w:rPr>
-          <w:lang w:val="en-AE"/>
-        </w:rPr>
-        <w:t xml:space="preserve"> by Shah et al. [8] boosts geospatial prediction accuracy by embedding map-based contextual data into prompts. These efforts establish the foundation for natural language interaction with spatial systems but stop short of performing complex geospatial planning or optimization.</w:t>
+        <w:t>To overcome these limitations, domain-adapted models have emerged. BB-GeoGPT by Zhang et al. [7] is a fine-tuned LLaMA-2 model trained on GIS texts and Q&amp;A pairs, outperforming general LLMs in spatial queries. Similarly, GeoLLM by Shah et al. [8] boosts geospatial prediction accuracy by embedding map-based contextual data into prompts. These efforts establish the foundation for natural language interaction with spatial systems but stop short of performing complex geospatial planning or optimization.</w:t>
       </w:r>
     </w:p>
     <w:p>
@@ -740,49 +539,7 @@
         <w:rPr>
           <w:lang w:val="en-AE"/>
         </w:rPr>
-        <w:t xml:space="preserve">Advancements in </w:t>
-      </w:r>
-      <w:proofErr w:type="spellStart"/>
-      <w:r>
-        <w:rPr>
-          <w:lang w:val="en-AE"/>
-        </w:rPr>
-        <w:t>GeoAI</w:t>
-      </w:r>
-      <w:proofErr w:type="spellEnd"/>
-      <w:r>
-        <w:rPr>
-          <w:lang w:val="en-AE"/>
-        </w:rPr>
-        <w:t xml:space="preserve"> have expanded to multimodal systems integrating LLMs with visual and structured geospatial data. </w:t>
-      </w:r>
-      <w:proofErr w:type="spellStart"/>
-      <w:r>
-        <w:rPr>
-          <w:lang w:val="en-AE"/>
-        </w:rPr>
-        <w:t>OmniGeo</w:t>
-      </w:r>
-      <w:proofErr w:type="spellEnd"/>
-      <w:r>
-        <w:rPr>
-          <w:lang w:val="en-AE"/>
-        </w:rPr>
-        <w:t xml:space="preserve"> by Yuan et al. [9] exemplifies this trend by combining satellite imagery, map layers, and text data, enabling LLMs to perform diverse tasks such as land use classification and environmental forecasting. Geode by Wu et al. [10] and </w:t>
-      </w:r>
-      <w:proofErr w:type="spellStart"/>
-      <w:r>
-        <w:rPr>
-          <w:lang w:val="en-AE"/>
-        </w:rPr>
-        <w:t>GTChain</w:t>
-      </w:r>
-      <w:proofErr w:type="spellEnd"/>
-      <w:r>
-        <w:rPr>
-          <w:lang w:val="en-AE"/>
-        </w:rPr>
-        <w:t xml:space="preserve"> by Zhang et al. [11] extend LLMs into autonomous agents, coordinating APIs, GIS tools, and real-time databases to solve spatial tasks.</w:t>
+        <w:t>Advancements in GeoAI have expanded to multimodal systems integrating LLMs with visual and structured geospatial data. OmniGeo by Yuan et al. [9] exemplifies this trend by combining satellite imagery, map layers, and text data, enabling LLMs to perform diverse tasks such as land use classification and environmental forecasting. Geode by Wu et al. [10] and GTChain by Zhang et al. [11] extend LLMs into autonomous agents, coordinating APIs, GIS tools, and real-time databases to solve spatial tasks.</w:t>
       </w:r>
     </w:p>
     <w:p>
@@ -803,21 +560,7 @@
         <w:rPr>
           <w:lang w:val="en-AE"/>
         </w:rPr>
-        <w:t xml:space="preserve">These systems demonstrate the potential of LLMs in spatial reasoning, data retrieval, and geospatial tool orchestration. Geode performs zero-shot geospatial Q&amp;A with explicit reasoning and live data, while </w:t>
-      </w:r>
-      <w:proofErr w:type="spellStart"/>
-      <w:r>
-        <w:rPr>
-          <w:lang w:val="en-AE"/>
-        </w:rPr>
-        <w:t>GTChain</w:t>
-      </w:r>
-      <w:proofErr w:type="spellEnd"/>
-      <w:r>
-        <w:rPr>
-          <w:lang w:val="en-AE"/>
-        </w:rPr>
-        <w:t xml:space="preserve"> trains LLMs to generate tool-use chains for complex tasks in simulated GIS environments. The autonomous GIS agent by Ning et al. [12] also showcases how LLMs can be used to dynamically retrieve data across diverse spatial datasets, enhancing spatial decision-making workflows.</w:t>
+        <w:t>These systems demonstrate the potential of LLMs in spatial reasoning, data retrieval, and geospatial tool orchestration. Geode performs zero-shot geospatial Q&amp;A with explicit reasoning and live data, while GTChain trains LLMs to generate tool-use chains for complex tasks in simulated GIS environments. The autonomous GIS agent by Ning et al. [12] also showcases how LLMs can be used to dynamically retrieve data across diverse spatial datasets, enhancing spatial decision-making workflows.</w:t>
       </w:r>
     </w:p>
     <w:p>
@@ -831,21 +574,7 @@
         <w:rPr>
           <w:lang w:val="en-AE"/>
         </w:rPr>
-        <w:t xml:space="preserve">Despite these advancements, existing solutions lack targeted support for personalized route planning or environmental criteria integration. None of the reviewed systems directly tackle bicycle routing that adapts to vegetation or pollution levels. Our proposed </w:t>
-      </w:r>
-      <w:proofErr w:type="spellStart"/>
-      <w:r>
-        <w:rPr>
-          <w:lang w:val="en-AE"/>
-        </w:rPr>
-        <w:t>GeoBikeLLM</w:t>
-      </w:r>
-      <w:proofErr w:type="spellEnd"/>
-      <w:r>
-        <w:rPr>
-          <w:lang w:val="en-AE"/>
-        </w:rPr>
-        <w:t xml:space="preserve"> addresses this gap by combining LLMs with geospatial intelligence to deliver environment-aware, health-optimized bike route planning</w:t>
+        <w:t>Despite these advancements, existing solutions lack targeted support for personalized route planning or environmental criteria integration. None of the reviewed systems directly tackle bicycle routing that adapts to vegetation or pollution levels. Our proposed GeoBikeLLM addresses this gap by combining LLMs with geospatial intelligence to deliver environment-aware, health-optimized bike route planning</w:t>
       </w:r>
       <w:r>
         <w:rPr>
@@ -1070,21 +799,7 @@
         <w:rPr>
           <w:lang w:val="en-AE" w:bidi="ar-AE"/>
         </w:rPr>
-        <w:t xml:space="preserve">The heatmap was created by aggregating data from 19 CSV files hosted on GitHub, each containing latitude, longitude, and PM2.5 values for different parts of the city. After cleaning and normalizing the data using Min-Max scaling, each point was plotted using Folium’s </w:t>
-      </w:r>
-      <w:proofErr w:type="spellStart"/>
-      <w:r>
-        <w:rPr>
-          <w:lang w:val="en-AE" w:bidi="ar-AE"/>
-        </w:rPr>
-        <w:t>HeatMap</w:t>
-      </w:r>
-      <w:proofErr w:type="spellEnd"/>
-      <w:r>
-        <w:rPr>
-          <w:lang w:val="en-AE" w:bidi="ar-AE"/>
-        </w:rPr>
-        <w:t xml:space="preserve"> plugin. The visualization reveals several hotspots of elevated pollution, particularly along dense urban corridors and industrial zones.</w:t>
+        <w:t>The heatmap was created by aggregating data from 19 CSV files hosted on GitHub, each containing latitude, longitude, and PM2.5 values for different parts of the city. After cleaning and normalizing the data using Min-Max scaling, each point was plotted using Folium’s HeatMap plugin. The visualization reveals several hotspots of elevated pollution, particularly along dense urban corridors and industrial zones.</w:t>
       </w:r>
     </w:p>
     <w:p>
@@ -1347,7 +1062,7 @@
           <w:noProof/>
         </w:rPr>
         <w:drawing>
-          <wp:anchor distT="0" distB="0" distL="114300" distR="114300" simplePos="0" relativeHeight="251661312" behindDoc="0" locked="0" layoutInCell="1" allowOverlap="1" wp14:anchorId="6F6F9499" wp14:editId="4E62D9B5">
+          <wp:anchor distT="0" distB="0" distL="114300" distR="114300" simplePos="0" relativeHeight="251661312" behindDoc="0" locked="0" layoutInCell="1" allowOverlap="1" wp14:anchorId="6F6F9499" wp14:editId="3B7DF0BC">
             <wp:simplePos x="0" y="0"/>
             <wp:positionH relativeFrom="column">
               <wp:posOffset>1854738</wp:posOffset>
@@ -1466,21 +1181,7 @@
         <w:rPr>
           <w:lang w:val="en-US"/>
         </w:rPr>
-        <w:t xml:space="preserve">In the proposed routing system, two LLMs are integrated using the </w:t>
-      </w:r>
-      <w:proofErr w:type="spellStart"/>
-      <w:r>
-        <w:rPr>
-          <w:lang w:val="en-US"/>
-        </w:rPr>
-        <w:t>Groq</w:t>
-      </w:r>
-      <w:proofErr w:type="spellEnd"/>
-      <w:r>
-        <w:rPr>
-          <w:lang w:val="en-US"/>
-        </w:rPr>
-        <w:t xml:space="preserve"> API to enhance the </w:t>
+        <w:t xml:space="preserve">In the proposed routing system, two LLMs are integrated using the Groq API to enhance the </w:t>
       </w:r>
       <w:r>
         <w:rPr>
@@ -1710,21 +1411,7 @@
         <w:rPr>
           <w:lang w:val="en-AE"/>
         </w:rPr>
-        <w:t xml:space="preserve">The </w:t>
-      </w:r>
-      <w:proofErr w:type="spellStart"/>
-      <w:r>
-        <w:rPr>
-          <w:lang w:val="en-AE"/>
-        </w:rPr>
-        <w:t>GeoBikeLLM</w:t>
-      </w:r>
-      <w:proofErr w:type="spellEnd"/>
-      <w:r>
-        <w:rPr>
-          <w:lang w:val="en-AE"/>
-        </w:rPr>
-        <w:t xml:space="preserve"> system enables natural language-based bike route planning within Chicago, Illinois, by integrating environmental and spatial data to recommend optimized cycling paths. Users interact with the system by entering a prompt such as </w:t>
+        <w:t xml:space="preserve">The GeoBikeLLM system enables natural language-based bike route planning within Chicago, Illinois, by integrating environmental and spatial data to recommend optimized cycling paths. Users interact with the system by entering a prompt such as </w:t>
       </w:r>
       <w:r>
         <w:rPr>
@@ -1746,21 +1433,12 @@
         </w:rPr>
         <w:t xml:space="preserve"> </w:t>
       </w:r>
-      <w:proofErr w:type="spellStart"/>
       <w:r>
         <w:rPr>
           <w:color w:val="FF0000"/>
           <w:lang w:val="en-AE"/>
         </w:rPr>
-        <w:t>num</w:t>
-      </w:r>
-      <w:proofErr w:type="spellEnd"/>
-      <w:r>
-        <w:rPr>
-          <w:color w:val="FF0000"/>
-          <w:lang w:val="en-AE"/>
-        </w:rPr>
-        <w:t xml:space="preserve"> (caption: System prompt provided to the LLM for extracting origin and destination.), </w:t>
+        <w:t xml:space="preserve">num (caption: System prompt provided to the LLM for extracting origin and destination.), </w:t>
       </w:r>
       <w:r>
         <w:rPr>
@@ -1871,21 +1549,7 @@
         <w:rPr>
           <w:lang w:val="en-AE"/>
         </w:rPr>
-        <w:t xml:space="preserve">. These sliders eliminate the need to express routing preferences within the prompt itself. The air quality slider (α) penalizes routes with higher PM2.5 levels, while the greenness slider (β) </w:t>
-      </w:r>
-      <w:proofErr w:type="spellStart"/>
-      <w:r>
-        <w:rPr>
-          <w:lang w:val="en-AE"/>
-        </w:rPr>
-        <w:t>favors</w:t>
-      </w:r>
-      <w:proofErr w:type="spellEnd"/>
-      <w:r>
-        <w:rPr>
-          <w:lang w:val="en-AE"/>
-        </w:rPr>
-        <w:t xml:space="preserve"> paths with higher Normalized Difference Vegetation Index (NDVI) values.</w:t>
+        <w:t>. These sliders eliminate the need to express routing preferences within the prompt itself. The air quality slider (α) penalizes routes with higher PM2.5 levels, while the greenness slider (β) favors paths with higher Normalized Difference Vegetation Index (NDVI) values.</w:t>
       </w:r>
     </w:p>
     <w:p>
@@ -2076,6 +1740,9 @@
     <w:p>
       <w:pPr>
         <w:pStyle w:val="Heading3"/>
+        <w:rPr>
+          <w:i w:val="0"/>
+        </w:rPr>
       </w:pPr>
       <w:r>
         <w:t>Query Interpretation using LLaMA 3.1 8B Instant</w:t>
@@ -2164,6 +1831,53 @@
           <w:i w:val="0"/>
         </w:rPr>
         <w:t>These results demonstrate the model’s robustness in understanding noisy and informal user inputs. However, minor inconsistencies were observed in cases involving ambiguous phrasing or rare place names, which supports the decision to shift preference input to sliders in the final system design.</w:t>
+      </w:r>
+    </w:p>
+    <w:p>
+      <w:pPr>
+        <w:pStyle w:val="Heading3"/>
+      </w:pPr>
+      <w:r>
+        <w:t xml:space="preserve">LLaMA 3.3 70B Versatile for Explanation Generation: </w:t>
+      </w:r>
+      <w:r>
+        <w:t xml:space="preserve"> </w:t>
+      </w:r>
+      <w:r>
+        <w:rPr>
+          <w:i w:val="0"/>
+        </w:rPr>
+        <w:t>During testing, the model consistently produced clear and contextually relevant justifications, successfully incorporating factors such as air quality and vegetation coverage into its responses.</w:t>
+      </w:r>
+      <w:r>
+        <w:rPr>
+          <w:i w:val="0"/>
+        </w:rPr>
+        <w:t xml:space="preserve"> A</w:t>
+      </w:r>
+      <w:r>
+        <w:rPr>
+          <w:i w:val="0"/>
+        </w:rPr>
+        <w:t xml:space="preserve">cross various prompt inputs and slider configurations, the generated explanations accurately reflected the impact of the air quality penalty (α) and greenness reward (β) on the chosen route. For example, when </w:t>
+      </w:r>
+      <w:r>
+        <w:rPr>
+          <w:i w:val="0"/>
+        </w:rPr>
+        <w:t>higher greenness weights were applied, the model emphasized scenic, vegetation-rich paths. In contrast, when air quality was prioritized, the output referenced routes with cleaner air.</w:t>
+      </w:r>
+      <w:r>
+        <w:rPr>
+          <w:i w:val="0"/>
+        </w:rPr>
+        <w:t xml:space="preserve"> </w:t>
+      </w:r>
+      <w:r>
+        <w:rPr>
+          <w:i w:val="0"/>
+        </w:rPr>
+        <w:t>The responses remained coherent, grammatically sound, and aligned with the environmental context provided. This consistency demonstrates the model’s effectiveness in delivering human-readable, informative feedback, reinforcing trust in the system’s recommendations.</w:t>
       </w:r>
     </w:p>
     <w:p>

</xml_diff>